<commit_message>
Remove archive analysis and stylistic dashes from D1 report
</commit_message>
<xml_diff>
--- a/doc/J-renduD1-modifiable.docx
+++ b/doc/J-renduD1-modifiable.docx
@@ -7,23 +7,15 @@
         <w:pStyle w:val="FirstParagraph"/>
       </w:pPr>
       <w:r>
-        <w:t xml:space="preserve">Groupe 13 — Conception orientée objet — SI4 — 2026–2027</w:t>
-      </w:r>
-    </w:p>
-    <w:p>
-      <w:pPr>
-        <w:pStyle w:val="BodyText"/>
-      </w:pPr>
-      <w:r>
-        <w:t xml:space="preserve">Analyse de l’archive develop fournie le 11 octobre 2026. Identifiant indiqué dans le commentaire ZIP : 8dfc5190fccc50e5b58f17bb0700c56eddc0fd09. Cet identifiant ne remplace pas la vérification du tag Git BACKEND sur main.</w:t>
-      </w:r>
-    </w:p>
-    <w:p>
-      <w:pPr>
-        <w:pStyle w:val="BodyText"/>
-      </w:pPr>
-      <w:r>
-        <w:t xml:space="preserve">Membre (nom et prénom — D0) | Rôle principal | Exigence stratégique |</w:t>
+        <w:t xml:space="preserve">Groupe 13 : Conception orientée objet : SI4 : 2026/2027</w:t>
+      </w:r>
+    </w:p>
+    <w:p>
+      <w:pPr>
+        <w:pStyle w:val="BodyText"/>
+      </w:pPr>
+      <w:r>
+        <w:t xml:space="preserve">Membre (nom et prénom : D0) | Rôle principal | Exigence stratégique |</w:t>
       </w:r>
     </w:p>
     <w:p>
@@ -39,39 +31,39 @@
         <w:pStyle w:val="BodyText"/>
       </w:pPr>
       <w:r>
-        <w:t xml:space="preserve">ADJEGAN Justice | Quality Assurance (QA) | A3* — Supervision |</w:t>
-      </w:r>
-    </w:p>
-    <w:p>
-      <w:pPr>
-        <w:pStyle w:val="BodyText"/>
-      </w:pPr>
-      <w:r>
-        <w:t xml:space="preserve">ATI-ATCHA Wahid | Software Architect | R6* — Offres / fidélité |</w:t>
-      </w:r>
-    </w:p>
-    <w:p>
-      <w:pPr>
-        <w:pStyle w:val="BodyText"/>
-      </w:pPr>
-      <w:r>
-        <w:t xml:space="preserve">LOUBARIS Adam | External Integration Manager | R5* — Capacités |</w:t>
-      </w:r>
-    </w:p>
-    <w:p>
-      <w:pPr>
-        <w:pStyle w:val="BodyText"/>
-      </w:pPr>
-      <w:r>
-        <w:t xml:space="preserve">MOROU Essognina Fadilou | Product Owner (PO) | D5* — Incidents |</w:t>
-      </w:r>
-    </w:p>
-    <w:p>
-      <w:pPr>
-        <w:pStyle w:val="BodyText"/>
-      </w:pPr>
-      <w:r>
-        <w:t xml:space="preserve">TSOULI Younes | Ops | AI3* — Recommandations |</w:t>
+        <w:t xml:space="preserve">ADJEGAN Justice | Quality Assurance (QA) | A3* : Supervision |</w:t>
+      </w:r>
+    </w:p>
+    <w:p>
+      <w:pPr>
+        <w:pStyle w:val="BodyText"/>
+      </w:pPr>
+      <w:r>
+        <w:t xml:space="preserve">ATI-ATCHA Wahid | Software Architect | R6* : Offres / fidélité |</w:t>
+      </w:r>
+    </w:p>
+    <w:p>
+      <w:pPr>
+        <w:pStyle w:val="BodyText"/>
+      </w:pPr>
+      <w:r>
+        <w:t xml:space="preserve">LOUBARIS Adam | External Integration Manager | R5* : Capacités |</w:t>
+      </w:r>
+    </w:p>
+    <w:p>
+      <w:pPr>
+        <w:pStyle w:val="BodyText"/>
+      </w:pPr>
+      <w:r>
+        <w:t xml:space="preserve">MOROU Essognina Fadilou | Product Owner (PO) | D5* : Incidents |</w:t>
+      </w:r>
+    </w:p>
+    <w:p>
+      <w:pPr>
+        <w:pStyle w:val="BodyText"/>
+      </w:pPr>
+      <w:r>
+        <w:t xml:space="preserve">TSOULI Younes | Ops | AI3* : Recommandations |</w:t>
       </w:r>
     </w:p>
     <w:p>
@@ -80,13 +72,6 @@
       </w:pPr>
       <w:r>
         <w:t xml:space="preserve">Version technique documentée, à compléter avant dépôt. Les identités et exigences référentes sont reprises du D0 fourni (PS7-Sheet (2).pdf). Les rôles et les 100 points par membre sont confirmés par l’équipe. Les classements de maîtrise, le bilan de collaboration et les preuves SonarQube restent à renseigner. Aucun résultat personnel ou indicateur SonarQube n’est inventé.</w:t>
-      </w:r>
-    </w:p>
-    <w:p>
-      <w:r>
-        <w:pict>
-          <v:rect style="width:0;height:1.5pt" o:hralign="center" o:hrstd="t" o:hr="t"/>
-        </w:pict>
       </w:r>
     </w:p>
     <w:bookmarkStart w:id="21" w:name="table-des-matières"/>
@@ -150,7 +135,7 @@
         </w:numPr>
       </w:pPr>
       <w:r>
-        <w:t xml:space="preserve">D5* — Incidents de livraison … p. 10</w:t>
+        <w:t xml:space="preserve">D5* : Incidents de livraison … p. 10</w:t>
       </w:r>
     </w:p>
     <w:p>
@@ -161,7 +146,7 @@
         </w:numPr>
       </w:pPr>
       <w:r>
-        <w:t xml:space="preserve">R5* — Capacités et créneaux … p. 11</w:t>
+        <w:t xml:space="preserve">R5* : Capacités et créneaux … p. 11</w:t>
       </w:r>
     </w:p>
     <w:p>
@@ -172,7 +157,7 @@
         </w:numPr>
       </w:pPr>
       <w:r>
-        <w:t xml:space="preserve">R6* — Offres et promotions … p. 12</w:t>
+        <w:t xml:space="preserve">R6* : Offres et promotions … p. 12</w:t>
       </w:r>
     </w:p>
     <w:p>
@@ -183,7 +168,7 @@
         </w:numPr>
       </w:pPr>
       <w:r>
-        <w:t xml:space="preserve">A3* — Supervision des livraisons … p. 13</w:t>
+        <w:t xml:space="preserve">A3* : Supervision des livraisons … p. 13</w:t>
       </w:r>
     </w:p>
     <w:p>
@@ -194,7 +179,7 @@
         </w:numPr>
       </w:pPr>
       <w:r>
-        <w:t xml:space="preserve">AI3* — Recommandations … p. 14</w:t>
+        <w:t xml:space="preserve">AI3* : Recommandations … p. 14</w:t>
       </w:r>
     </w:p>
     <w:p>
@@ -208,21 +193,21 @@
         <w:t xml:space="preserve">Auto-évaluation … p. 15</w:t>
       </w:r>
     </w:p>
-    <w:bookmarkStart w:id="20" w:name="périmètre-des-preuves"/>
-    <w:p>
-      <w:pPr>
-        <w:pStyle w:val="Heading3"/>
-      </w:pPr>
-      <w:r>
-        <w:t xml:space="preserve">Périmètre des preuves</w:t>
-      </w:r>
-    </w:p>
-    <w:p>
-      <w:pPr>
-        <w:pStyle w:val="FirstParagraph"/>
-      </w:pPr>
-      <w:r>
-        <w:t xml:space="preserve">L’archive develop contient le code et les configurations, sans historique .git ni résultat SonarQube. Le D0 Team-J a été fourni séparément sous le nom PS7-Sheet (2).pdf : les exigences stratégiques et D4 ci-dessous sont comparées à ces engagements. Le présent D1 décrit l’implémentation observée, et non les seules intentions de conception.</w:t>
+    <w:bookmarkStart w:id="20" w:name="périmètre-du-rapport"/>
+    <w:p>
+      <w:pPr>
+        <w:pStyle w:val="Heading3"/>
+      </w:pPr>
+      <w:r>
+        <w:t xml:space="preserve">Périmètre du rapport</w:t>
+      </w:r>
+    </w:p>
+    <w:p>
+      <w:pPr>
+        <w:pStyle w:val="FirstParagraph"/>
+      </w:pPr>
+      <w:r>
+        <w:t xml:space="preserve">Ce rapport présente l’implémentation du backend STEats et les écarts par rapport aux exigences du D0 Team-J.</w:t>
       </w:r>
     </w:p>
     <w:p>
@@ -231,13 +216,6 @@
       </w:pPr>
       <w:r>
         <w:t xml:space="preserve">DONE signifie que le sous-périmètre identifié est implémenté et validé par les tests exécutés. WIP signale une couverture fonctionnelle partielle ou des limites importantes ; BLOCKED signale une fonctionnalité absente. L’isolation est évaluée par rapport aux défaillances des modules périphériques, et non par rapport à une panne du stockage propre au composant.</w:t>
-      </w:r>
-    </w:p>
-    <w:p>
-      <w:r>
-        <w:pict>
-          <v:rect style="width:0;height:1.5pt" o:hralign="center" o:hrstd="t" o:hr="t"/>
-        </w:pict>
       </w:r>
     </w:p>
     <w:bookmarkEnd w:id="20"/>
@@ -272,126 +250,119 @@
         <w:pStyle w:val="BodyText"/>
       </w:pPr>
       <w:r>
-        <w:t xml:space="preserve">C2 — Filtrage | DONE | Prix inclusifs, cuisines, type ; RestaurantFilterTest et RestaurantServiceTest. | Constructeur court de RestaurantService inutilisable pour findRestaurants (dépendances nulles). | Oui |</w:t>
-      </w:r>
-    </w:p>
-    <w:p>
-      <w:pPr>
-        <w:pStyle w:val="BodyText"/>
-      </w:pPr>
-      <w:r>
-        <w:t xml:space="preserve">C4 — Commandes précédentes | WIP | findByUserId ; classement par nombre de commandes non annulées. | D0 : consulter l’historique ; repository présent, mais pas de façade getOrderHistory ni de test de consultation dédié. | Oui |</w:t>
-      </w:r>
-    </w:p>
-    <w:p>
-      <w:pPr>
-        <w:pStyle w:val="BodyText"/>
-      </w:pPr>
-      <w:r>
-        <w:t xml:space="preserve">C5 — Panier / commande | WIP | Fusion des quantités ; stockage du panier ; lieu et horaire de livraison. | Pas de contrôle du changement de restaurant d’un panier existant ; stock non décrémenté. | Oui |</w:t>
-      </w:r>
-    </w:p>
-    <w:p>
-      <w:pPr>
-        <w:pStyle w:val="BodyText"/>
-      </w:pPr>
-      <w:r>
-        <w:t xml:space="preserve">C6 — Validation | WIP | Refus du panier vide, lieu/horaire inconnus, plat indisponible sur le parcours avec livraison. | createOrder sans livraison ne contrôle pas disponibilité/stock ; pas de validation utilisateur dans OrderService. | Non |</w:t>
-      </w:r>
-    </w:p>
-    <w:p>
-      <w:pPr>
-        <w:pStyle w:val="BodyText"/>
-      </w:pPr>
-      <w:r>
-        <w:t xml:space="preserve">D1 — Connexion livraison | WIP | Gateway injectable ; requête validée ; exception convertie en échec. | Adaptateur simulé ; earliest ready time R5* et créneaux retournés par le fournisseur absents. | Oui |</w:t>
-      </w:r>
-    </w:p>
-    <w:p>
-      <w:pPr>
-        <w:pStyle w:val="BodyText"/>
-      </w:pPr>
-      <w:r>
-        <w:t xml:space="preserve">D3 — Référence livraison | DONE | Référence D-UUID ; DeliveryInfo sauvegardé après succès. | Pas de garde d’idempotence ni de validation d’une référence retournée vide. | Oui |</w:t>
-      </w:r>
-    </w:p>
-    <w:p>
-      <w:pPr>
-        <w:pStyle w:val="BodyText"/>
-      </w:pPr>
-      <w:r>
-        <w:t xml:space="preserve">D4 — Suivi livraison | WIP | ACCEPTED / IN_TRANSIT / DELIVERED ; commande synchronisée. | D0 : 8 statuts et historique horodaté ; seuls 4 statuts présents, sans historique. | Oui |</w:t>
-      </w:r>
-    </w:p>
-    <w:p>
-      <w:pPr>
-        <w:pStyle w:val="BodyText"/>
-      </w:pPr>
-      <w:r>
-        <w:t xml:space="preserve">D5* — Incidents | WIP | FAILED et motif ; commande conservée PAID/READY. | Aucun scénario actif d’incident ; pas de remboursement / relivraison. | Oui |</w:t>
-      </w:r>
-    </w:p>
-    <w:p>
-      <w:pPr>
-        <w:pStyle w:val="BodyText"/>
-      </w:pPr>
-      <w:r>
-        <w:t xml:space="preserve">P1 — Paiement | DONE | Paiement simulé et crédit ; refus, exception, réponse nulle testés. | Pas de banque réelle ; paiement répété non interdit. | Oui |</w:t>
-      </w:r>
-    </w:p>
-    <w:p>
-      <w:pPr>
-        <w:pStyle w:val="BodyText"/>
-      </w:pPr>
-      <w:r>
-        <w:t xml:space="preserve">P2 — Enregistrement | DONE | Commande PENDING avec lignes, total, lieu et horaire. | Stockage volatil ; absence de transaction avec consommation de capacité. | Oui |</w:t>
-      </w:r>
-    </w:p>
-    <w:p>
-      <w:pPr>
-        <w:pStyle w:val="BodyText"/>
-      </w:pPr>
-      <w:r>
-        <w:t xml:space="preserve">R3 — Gestion plats | DONE | Ajout / modification nom et description ; doublon et champs vides refusés. | Pas de contrôle d’autorisation restaurateur ; feature R3 vide. | Oui |</w:t>
-      </w:r>
-    </w:p>
-    <w:p>
-      <w:pPr>
-        <w:pStyle w:val="BodyText"/>
-      </w:pPr>
-      <w:r>
-        <w:t xml:space="preserve">R5* — Capacités / temps | WIP | Capacité par TimeSlot, décrément, refus si pleine. | Pas d’atomicité, restitution après échec, estimation du temps ou réservation avancée. | Non |</w:t>
-      </w:r>
-    </w:p>
-    <w:p>
-      <w:pPr>
-        <w:pStyle w:val="BodyText"/>
-      </w:pPr>
-      <w:r>
-        <w:t xml:space="preserve">R6* — Offres | BLOCKED | Aucune implémentation identifiée. | Pas de modèle promotion ni règle de remise. | Non |</w:t>
-      </w:r>
-    </w:p>
-    <w:p>
-      <w:pPr>
-        <w:pStyle w:val="BodyText"/>
-      </w:pPr>
-      <w:r>
-        <w:t xml:space="preserve">A3* — Supervision | BLOCKED | Statut unitaire disponible dans DeliveryInfo. | Pas de tableau de supervision, agrégation ni service administrateur. | Non |</w:t>
-      </w:r>
-    </w:p>
-    <w:p>
-      <w:pPr>
-        <w:pStyle w:val="BodyText"/>
-      </w:pPr>
-      <w:r>
-        <w:t xml:space="preserve">AI3* — Recommandations | WIP | Premier ajout, filtrage, déduplication, repli si panne. | Diversité minimale D0 non contrôlée ; IA simulée ; code de recommandation dupliqué. | Oui |</w:t>
-      </w:r>
-    </w:p>
-    <w:p>
-      <w:r>
-        <w:pict>
-          <v:rect style="width:0;height:1.5pt" o:hralign="center" o:hrstd="t" o:hr="t"/>
-        </w:pict>
+        <w:t xml:space="preserve">C2 : Filtrage | DONE | Prix inclusifs, cuisines, type ; RestaurantFilterTest et RestaurantServiceTest. | Constructeur court de RestaurantService inutilisable pour findRestaurants (dépendances nulles). | Oui |</w:t>
+      </w:r>
+    </w:p>
+    <w:p>
+      <w:pPr>
+        <w:pStyle w:val="BodyText"/>
+      </w:pPr>
+      <w:r>
+        <w:t xml:space="preserve">C4 : Commandes précédentes | WIP | findByUserId ; classement par nombre de commandes non annulées. | D0 : consulter l’historique ; repository présent, mais pas de façade getOrderHistory ni de test de consultation dédié. | Oui |</w:t>
+      </w:r>
+    </w:p>
+    <w:p>
+      <w:pPr>
+        <w:pStyle w:val="BodyText"/>
+      </w:pPr>
+      <w:r>
+        <w:t xml:space="preserve">C5 : Panier / commande | WIP | Fusion des quantités ; stockage du panier ; lieu et horaire de livraison. | Pas de contrôle du changement de restaurant d’un panier existant ; stock non décrémenté. | Oui |</w:t>
+      </w:r>
+    </w:p>
+    <w:p>
+      <w:pPr>
+        <w:pStyle w:val="BodyText"/>
+      </w:pPr>
+      <w:r>
+        <w:t xml:space="preserve">C6 : Validation | WIP | Refus du panier vide, lieu/horaire inconnus, plat indisponible sur le parcours avec livraison. | createOrder sans livraison ne contrôle pas disponibilité/stock ; pas de validation utilisateur dans OrderService. | Non |</w:t>
+      </w:r>
+    </w:p>
+    <w:p>
+      <w:pPr>
+        <w:pStyle w:val="BodyText"/>
+      </w:pPr>
+      <w:r>
+        <w:t xml:space="preserve">D1 : Connexion livraison | WIP | Gateway injectable ; requête validée ; exception convertie en échec. | Adaptateur simulé ; earliest ready time R5* et créneaux retournés par le fournisseur absents. | Oui |</w:t>
+      </w:r>
+    </w:p>
+    <w:p>
+      <w:pPr>
+        <w:pStyle w:val="BodyText"/>
+      </w:pPr>
+      <w:r>
+        <w:t xml:space="preserve">D3 : Référence livraison | DONE | Référence D-UUID ; DeliveryInfo sauvegardé après succès. | Pas de garde d’idempotence ni de validation d’une référence retournée vide. | Oui |</w:t>
+      </w:r>
+    </w:p>
+    <w:p>
+      <w:pPr>
+        <w:pStyle w:val="BodyText"/>
+      </w:pPr>
+      <w:r>
+        <w:t xml:space="preserve">D4 : Suivi livraison | WIP | ACCEPTED / IN_TRANSIT / DELIVERED ; commande synchronisée. | D0 : 8 statuts et historique horodaté ; seuls 4 statuts présents, sans historique. | Oui |</w:t>
+      </w:r>
+    </w:p>
+    <w:p>
+      <w:pPr>
+        <w:pStyle w:val="BodyText"/>
+      </w:pPr>
+      <w:r>
+        <w:t xml:space="preserve">D5* : Incidents | WIP | FAILED et motif ; commande conservée PAID/READY. | Aucun scénario actif d’incident ; pas de remboursement / relivraison. | Oui |</w:t>
+      </w:r>
+    </w:p>
+    <w:p>
+      <w:pPr>
+        <w:pStyle w:val="BodyText"/>
+      </w:pPr>
+      <w:r>
+        <w:t xml:space="preserve">P1 : Paiement | DONE | Paiement simulé et crédit ; refus, exception, réponse nulle testés. | Pas de banque réelle ; paiement répété non interdit. | Oui |</w:t>
+      </w:r>
+    </w:p>
+    <w:p>
+      <w:pPr>
+        <w:pStyle w:val="BodyText"/>
+      </w:pPr>
+      <w:r>
+        <w:t xml:space="preserve">P2 : Enregistrement | DONE | Commande PENDING avec lignes, total, lieu et horaire. | Stockage volatil ; absence de transaction avec consommation de capacité. | Oui |</w:t>
+      </w:r>
+    </w:p>
+    <w:p>
+      <w:pPr>
+        <w:pStyle w:val="BodyText"/>
+      </w:pPr>
+      <w:r>
+        <w:t xml:space="preserve">R3 : Gestion plats | DONE | Ajout / modification nom et description ; doublon et champs vides refusés. | Pas de contrôle d’autorisation restaurateur ; feature R3 vide. | Oui |</w:t>
+      </w:r>
+    </w:p>
+    <w:p>
+      <w:pPr>
+        <w:pStyle w:val="BodyText"/>
+      </w:pPr>
+      <w:r>
+        <w:t xml:space="preserve">R5* : Capacités / temps | WIP | Capacité par TimeSlot, décrément, refus si pleine. | Pas d’atomicité, restitution après échec, estimation du temps ou réservation avancée. | Non |</w:t>
+      </w:r>
+    </w:p>
+    <w:p>
+      <w:pPr>
+        <w:pStyle w:val="BodyText"/>
+      </w:pPr>
+      <w:r>
+        <w:t xml:space="preserve">R6* : Offres | BLOCKED | Aucune implémentation identifiée. | Pas de modèle promotion ni règle de remise. | Non |</w:t>
+      </w:r>
+    </w:p>
+    <w:p>
+      <w:pPr>
+        <w:pStyle w:val="BodyText"/>
+      </w:pPr>
+      <w:r>
+        <w:t xml:space="preserve">A3* : Supervision | BLOCKED | Statut unitaire disponible dans DeliveryInfo. | Pas de tableau de supervision, agrégation ni service administrateur. | Non |</w:t>
+      </w:r>
+    </w:p>
+    <w:p>
+      <w:pPr>
+        <w:pStyle w:val="BodyText"/>
+      </w:pPr>
+      <w:r>
+        <w:t xml:space="preserve">AI3* : Recommandations | WIP | Premier ajout, filtrage, déduplication, repli si panne. | Diversité minimale D0 non contrôlée ; IA simulée ; code de recommandation dupliqué. | Oui |</w:t>
       </w:r>
     </w:p>
     <w:bookmarkEnd w:id="22"/>
@@ -562,13 +533,6 @@
       </w:pPr>
       <w:r>
         <w:t xml:space="preserve">À vérifier avant dépôt : chaque colonne utilise une fois chacun des rangs 1 à 15 ; les réponses reflètent la maîtrise réelle du membre, indépendamment de l’exigence dont il est référent.</w:t>
-      </w:r>
-    </w:p>
-    <w:p>
-      <w:r>
-        <w:pict>
-          <v:rect style="width:0;height:1.5pt" o:hralign="center" o:hrstd="t" o:hr="t"/>
-        </w:pict>
       </w:r>
     </w:p>
     <w:bookmarkEnd w:id="23"/>
@@ -653,13 +617,6 @@
         <w:t xml:space="preserve">Violet : exigences stratégiques. R6* et A3* sont montrées comme fonctions attendues absentes. C4 est limité au classement par historique ; AI3* est une extension déclenchée au premier ajout au panier.</w:t>
       </w:r>
     </w:p>
-    <w:p>
-      <w:r>
-        <w:pict>
-          <v:rect style="width:0;height:1.5pt" o:hralign="center" o:hrstd="t" o:hr="t"/>
-        </w:pict>
-      </w:r>
-    </w:p>
     <w:bookmarkEnd w:id="27"/>
     <w:bookmarkEnd w:id="28"/>
     <w:bookmarkStart w:id="38" w:name="diagrammes-de-classes-du-cœur"/>
@@ -844,13 +801,6 @@
         <w:t xml:space="preserve">Les interfaces des gateways constituent les points de branchement périphériques. R5* n’a pas de contrat autonome : OrderService lit et modifie directement la capacité de Restaurant. Ce couplage explique l’absence d’isolation fonctionnelle de R5*. Les noms courts représentent les classes réelles ; les implémentations répétitives des repositories sont omises pour la lisibilité.</w:t>
       </w:r>
     </w:p>
-    <w:p>
-      <w:r>
-        <w:pict>
-          <v:rect style="width:0;height:1.5pt" o:hralign="center" o:hrstd="t" o:hr="t"/>
-        </w:pict>
-      </w:r>
-    </w:p>
     <w:bookmarkEnd w:id="38"/>
     <w:bookmarkStart w:id="39" w:name="X14b4e3d5f51630a33aa3d63e7b3815c1218a219"/>
     <w:p>
@@ -858,7 +808,7 @@
         <w:pStyle w:val="Heading2"/>
       </w:pPr>
       <w:r>
-        <w:t xml:space="preserve">3.2 Diagrammes de classes — choix de conception</w:t>
+        <w:t xml:space="preserve">3.2 Diagrammes de classes : choix de conception</w:t>
       </w:r>
     </w:p>
     <w:p>
@@ -891,13 +841,6 @@
       </w:pPr>
       <w:r>
         <w:t xml:space="preserve">Les classes nommées Adapter réalisent les contrats des gateways et permettent leur substitution. Elles ne traduisent pas une API incompatible réelle : aucun Adaptee externe n’est présent. Le patron GoF Adapter n’est donc pas formellement démontré ; il s’agit ici d’implémentations simulées de ports applicatifs. Le choix réduit la dépendance aux services tiers, mais ne prouve pas leur intégration réseau.</w:t>
-      </w:r>
-    </w:p>
-    <w:p>
-      <w:r>
-        <w:pict>
-          <v:rect style="width:0;height:1.5pt" o:hralign="center" o:hrstd="t" o:hr="t"/>
-        </w:pict>
       </w:r>
     </w:p>
     <w:bookmarkEnd w:id="39"/>
@@ -907,7 +850,7 @@
         <w:pStyle w:val="Heading2"/>
       </w:pPr>
       <w:r>
-        <w:t xml:space="preserve">3.3 Diagramme de séquence unique — scénario nominal</w:t>
+        <w:t xml:space="preserve">3.3 Diagramme de séquence unique : scénario nominal</w:t>
       </w:r>
     </w:p>
     <w:p>
@@ -973,13 +916,6 @@
         <w:t xml:space="preserve">Scénario nominal reconstitué : recherche, premier ajout avec recommandation, validation avec livraison, paiement, demande puis suivi de livraison. Ce parcours est rapproché des UC2, UC4 et UC5 du D0, adaptés à l’architecture actuelle ; le texte TD1 n’étant pas joint, sa correspondance exacte reste à confirmer. Il ne s’agit pas d’un test bout en bout existant : les tests fournis valident ces opérations par sous-parcours. Les appels des gateways et des notifications sont simulés.</w:t>
       </w:r>
     </w:p>
-    <w:p>
-      <w:r>
-        <w:pict>
-          <v:rect style="width:0;height:1.5pt" o:hralign="center" o:hrstd="t" o:hr="t"/>
-        </w:pict>
-      </w:r>
-    </w:p>
     <w:bookmarkEnd w:id="43"/>
     <w:bookmarkStart w:id="47" w:name="X27ba99c9add4ea573d0e1303e171965406375ec"/>
     <w:p>
@@ -1036,15 +972,15 @@
         <w:pStyle w:val="BodyText"/>
       </w:pPr>
       <w:r>
-        <w:t xml:space="preserve">Capture SonarQube | Non fournie — preuve obligatoire à insérer ici. |</w:t>
-      </w:r>
-    </w:p>
-    <w:p>
-      <w:pPr>
-        <w:pStyle w:val="BodyText"/>
-      </w:pPr>
-      <w:r>
-        <w:t xml:space="preserve">Validation Maven locale : 126 tests réussis (93 JUnit + 33 scénarios Cucumber), 0 échec, 0 erreur, 0 ignoré ; demo-1.0-SNAPSHOT.jar produit. Source : journal Maven et rapports Surefire de l’archive develop analysée.</w:t>
+        <w:t xml:space="preserve">Capture SonarQube | Non fournie : preuve obligatoire à insérer ici. |</w:t>
+      </w:r>
+    </w:p>
+    <w:p>
+      <w:pPr>
+        <w:pStyle w:val="BodyText"/>
+      </w:pPr>
+      <w:r>
+        <w:t xml:space="preserve">Validation Maven locale : 126 tests réussis (93 JUnit + 33 scénarios Cucumber), 0 échec, 0 erreur, 0 ignoré ; demo-1.0-SNAPSHOT.jar produit. Source : journal Maven et rapports Surefire de l’exécution locale.</w:t>
       </w:r>
     </w:p>
     <w:bookmarkEnd w:id="44"/>
@@ -1144,20 +1080,13 @@
         <w:pStyle w:val="FirstParagraph"/>
       </w:pPr>
       <w:r>
-        <w:t xml:space="preserve">Archive fournie : branche develop ; workflows configurés pour main et/ou develop.</w:t>
+        <w:t xml:space="preserve">Branche de travail : develop ; workflows configurés pour main et/ou develop.</w:t>
       </w:r>
       <w:r>
         <w:t xml:space="preserve"> </w:t>
       </w:r>
       <w:r>
         <w:t xml:space="preserve">Stratégie de branches, revues de PR et validation par un pair : à confirmer par l’équipe.</w:t>
-      </w:r>
-    </w:p>
-    <w:p>
-      <w:r>
-        <w:pict>
-          <v:rect style="width:0;height:1.5pt" o:hralign="center" o:hrstd="t" o:hr="t"/>
-        </w:pict>
       </w:r>
     </w:p>
     <w:bookmarkEnd w:id="46"/>
@@ -1168,7 +1097,7 @@
         <w:pStyle w:val="Heading2"/>
       </w:pPr>
       <w:r>
-        <w:t xml:space="preserve">5. D5* — Incidents de livraison</w:t>
+        <w:t xml:space="preserve">5. D5* : Incidents de livraison</w:t>
       </w:r>
     </w:p>
     <w:bookmarkStart w:id="48" w:name="étudiant-responsable"/>
@@ -1185,7 +1114,7 @@
         <w:pStyle w:val="FirstParagraph"/>
       </w:pPr>
       <w:r>
-        <w:t xml:space="preserve">MOROU Essognina Fadilou — référent indiqué dans le D0 Team-J.</w:t>
+        <w:t xml:space="preserve">MOROU Essognina Fadilou : référent indiqué dans le D0 Team-J.</w:t>
       </w:r>
     </w:p>
     <w:bookmarkEnd w:id="48"/>
@@ -1211,7 +1140,7 @@
         <w:pStyle w:val="BodyText"/>
       </w:pPr>
       <w:r>
-        <w:t xml:space="preserve">Spécifications — écarts par rapport à D0 : NO_SHOW devait entraîner clôture sans remboursement après 10 minutes ; faute du livreur et lieu inaccessible devaient entraîner annulation et remboursement intégral selon le moyen de paiement. Le D0 imposait aussi historique permanent horodaté et notification. Aucun de ces traitements n’est implémenté ; conserver PAID/READY constitue une réduction du périmètre, non une conformité.</w:t>
+        <w:t xml:space="preserve">Spécifications : écarts par rapport à D0 : NO_SHOW devait entraîner clôture sans remboursement après 10 minutes ; faute du livreur et lieu inaccessible devaient entraîner annulation et remboursement intégral selon le moyen de paiement. Le D0 imposait aussi historique permanent horodaté et notification. Aucun de ces traitements n’est implémenté ; conserver PAID/READY constitue une réduction du périmètre, non une conformité.</w:t>
       </w:r>
     </w:p>
     <w:bookmarkEnd w:id="49"/>
@@ -1333,13 +1262,6 @@
         <w:t xml:space="preserve">Les step definitions contiennent des pas de panne et d’incident, mais les trois scénarios actifs DeliveryTraking.feature ne les utilisent pas. Aucun test direct de FAILED, du motif, de réponse nulle, de refus du fournisseur ou d’exception RequestDelivery n’a été identifié. Aucun contrôle des transitions, mécanisme de compensation, relivraison ou remboursement. D5* reste WIP.</w:t>
       </w:r>
     </w:p>
-    <w:p>
-      <w:r>
-        <w:pict>
-          <v:rect style="width:0;height:1.5pt" o:hralign="center" o:hrstd="t" o:hr="t"/>
-        </w:pict>
-      </w:r>
-    </w:p>
     <w:bookmarkEnd w:id="56"/>
     <w:bookmarkEnd w:id="57"/>
     <w:bookmarkStart w:id="67" w:name="r5-capacités-et-créneaux"/>
@@ -1348,7 +1270,7 @@
         <w:pStyle w:val="Heading2"/>
       </w:pPr>
       <w:r>
-        <w:t xml:space="preserve">6. R5* — Capacités et créneaux</w:t>
+        <w:t xml:space="preserve">6. R5* : Capacités et créneaux</w:t>
       </w:r>
     </w:p>
     <w:bookmarkStart w:id="58" w:name="étudiant-responsable-1"/>
@@ -1365,7 +1287,7 @@
         <w:pStyle w:val="FirstParagraph"/>
       </w:pPr>
       <w:r>
-        <w:t xml:space="preserve">LOUBARIS Adam — référent indiqué dans le D0 Team-J.</w:t>
+        <w:t xml:space="preserve">LOUBARIS Adam : référent indiqué dans le D0 Team-J.</w:t>
       </w:r>
     </w:p>
     <w:bookmarkEnd w:id="58"/>
@@ -1391,7 +1313,7 @@
         <w:pStyle w:val="BodyText"/>
       </w:pPr>
       <w:r>
-        <w:t xml:space="preserve">Spécifications — écarts par rapport à D0 : deux stratégies étaient prévues (FixedSlotCapacityPolicy et PreparationTimeCapacityPolicy), via CapacityPolicy.computeEarliestReadyTime. Le code réalise uniquement un quota fixe restant par enum TimeSlot ; il ne calcule pas estimatedReadyTime, ne gère ni personnel ni temps de préparation, et ne transmet pas cette information à la livraison.</w:t>
+        <w:t xml:space="preserve">Spécifications : écarts par rapport à D0 : deux stratégies étaient prévues (FixedSlotCapacityPolicy et PreparationTimeCapacityPolicy), via CapacityPolicy.computeEarliestReadyTime. Le code réalise uniquement un quota fixe restant par enum TimeSlot ; il ne calcule pas estimatedReadyTime, ne gère ni personnel ni temps de préparation, et ne transmet pas cette information à la livraison.</w:t>
       </w:r>
     </w:p>
     <w:bookmarkEnd w:id="59"/>
@@ -1529,13 +1451,6 @@
         <w:t xml:space="preserve">La lecture puis décrémentation n’est pas atomique ; les HashMap ne sont pas protégées contre les accès concurrents. La capacité est consommée avant paiement et n’est jamais restituée en cas d’échec. Si la sauvegarde de commande échoue, la capacité peut être perdue. Le setter du modèle peut accepter une valeur négative en contournant le service ; le service interdit de configurer zéro. Pas de calcul de temps de préparation ni de cohérence entre DeliveryTime et TimeSlot : état WIP.</w:t>
       </w:r>
     </w:p>
-    <w:p>
-      <w:r>
-        <w:pict>
-          <v:rect style="width:0;height:1.5pt" o:hralign="center" o:hrstd="t" o:hr="t"/>
-        </w:pict>
-      </w:r>
-    </w:p>
     <w:bookmarkEnd w:id="66"/>
     <w:bookmarkEnd w:id="67"/>
     <w:bookmarkStart w:id="74" w:name="r6-offres-et-promotions"/>
@@ -1544,7 +1459,7 @@
         <w:pStyle w:val="Heading2"/>
       </w:pPr>
       <w:r>
-        <w:t xml:space="preserve">7. R6* — Offres et promotions</w:t>
+        <w:t xml:space="preserve">7. R6* : Offres et promotions</w:t>
       </w:r>
     </w:p>
     <w:bookmarkStart w:id="68" w:name="étudiant-responsable-2"/>
@@ -1561,7 +1476,7 @@
         <w:pStyle w:val="FirstParagraph"/>
       </w:pPr>
       <w:r>
-        <w:t xml:space="preserve">ATI-ATCHA Wahid — référent indiqué dans le D0 Team-J.</w:t>
+        <w:t xml:space="preserve">ATI-ATCHA Wahid : référent indiqué dans le D0 Team-J.</w:t>
       </w:r>
     </w:p>
     <w:bookmarkEnd w:id="68"/>
@@ -1587,7 +1502,7 @@
         <w:pStyle w:val="BodyText"/>
       </w:pPr>
       <w:r>
-        <w:t xml:space="preserve">Spécifications — écarts par rapport à D0 : Campus Specials ciblés par plat/catégorie, type utilisateur, fenêtre de validité et quotas ; fidélité par couple utilisateur/restaurant, points après paiement, récompense et cumul dans un ordre précis. PromotionService, Promotion, CampusSpecial, LoyaltyProgram, Discount et LoyaltyAccount ne sont pas présents. Le module prévu est entièrement non réalisé.</w:t>
+        <w:t xml:space="preserve">Spécifications : écarts par rapport à D0 : Campus Specials ciblés par plat/catégorie, type utilisateur, fenêtre de validité et quotas ; fidélité par couple utilisateur/restaurant, points après paiement, récompense et cumul dans un ordre précis. PromotionService, Promotion, CampusSpecial, LoyaltyProgram, Discount et LoyaltyAccount ne sont pas présents. Le module prévu est entièrement non réalisé.</w:t>
       </w:r>
     </w:p>
     <w:bookmarkEnd w:id="69"/>
@@ -1660,13 +1575,6 @@
       </w:pPr>
       <w:r>
         <w:t xml:space="preserve">Aucun test JUnit, scénario Gherkin ou indicateur de qualité propre à R6* identifié. État BLOCKED. Une implémentation ultérieure devra définir les règles métier et leur cumul, puis valider le montant de commande et de paiement. Ce travail n’est pas présenté comme déjà réalisé.</w:t>
-      </w:r>
-    </w:p>
-    <w:p>
-      <w:r>
-        <w:pict>
-          <v:rect style="width:0;height:1.5pt" o:hralign="center" o:hrstd="t" o:hr="t"/>
-        </w:pict>
       </w:r>
     </w:p>
     <w:bookmarkEnd w:id="73"/>
@@ -1677,7 +1585,7 @@
         <w:pStyle w:val="Heading2"/>
       </w:pPr>
       <w:r>
-        <w:t xml:space="preserve">8. A3* — Supervision des livraisons</w:t>
+        <w:t xml:space="preserve">8. A3* : Supervision des livraisons</w:t>
       </w:r>
     </w:p>
     <w:bookmarkStart w:id="75" w:name="étudiant-responsable-3"/>
@@ -1694,7 +1602,7 @@
         <w:pStyle w:val="FirstParagraph"/>
       </w:pPr>
       <w:r>
-        <w:t xml:space="preserve">ADJEGAN Justice — référent indiqué dans le D0 Team-J.</w:t>
+        <w:t xml:space="preserve">ADJEGAN Justice : référent indiqué dans le D0 Team-J.</w:t>
       </w:r>
     </w:p>
     <w:bookmarkEnd w:id="75"/>
@@ -1720,7 +1628,7 @@
         <w:pStyle w:val="BodyText"/>
       </w:pPr>
       <w:r>
-        <w:t xml:space="preserve">Spécifications — écarts par rapport à D0 : calcul des taux d’acceptation et d’échec, fenêtre de 20 livraisons avec minimum 5, seuil d’échec &gt; 20 %, retard &gt; 15 minutes, anti-spam et boîte administrateur. DeliveryMonitor, DeliveryStats, AlertRule et AdminInboxNotifier sont absents.</w:t>
+        <w:t xml:space="preserve">Spécifications : écarts par rapport à D0 : calcul des taux d’acceptation et d’échec, fenêtre de 20 livraisons avec minimum 5, seuil d’échec &gt; 20 %, retard &gt; 15 minutes, anti-spam et boîte administrateur. DeliveryMonitor, DeliveryStats, AlertRule et AdminInboxNotifier sont absents.</w:t>
       </w:r>
     </w:p>
     <w:bookmarkEnd w:id="76"/>
@@ -1793,13 +1701,6 @@
       </w:pPr>
       <w:r>
         <w:t xml:space="preserve">Aucun test spécifique de supervision ou d’agrégation. Les trois scénarios de suivi unitaire ne valident pas A3*. État BLOCKED ; la fonctionnalité devra définir les opérations observées, les acteurs autorisés et les données agrégées avant implémentation.</w:t>
-      </w:r>
-    </w:p>
-    <w:p>
-      <w:r>
-        <w:pict>
-          <v:rect style="width:0;height:1.5pt" o:hralign="center" o:hrstd="t" o:hr="t"/>
-        </w:pict>
       </w:r>
     </w:p>
     <w:bookmarkEnd w:id="80"/>
@@ -1810,7 +1711,7 @@
         <w:pStyle w:val="Heading2"/>
       </w:pPr>
       <w:r>
-        <w:t xml:space="preserve">9. AI3* — Recommandations</w:t>
+        <w:t xml:space="preserve">9. AI3* : Recommandations</w:t>
       </w:r>
     </w:p>
     <w:bookmarkStart w:id="82" w:name="étudiant-responsable-4"/>
@@ -1827,7 +1728,7 @@
         <w:pStyle w:val="FirstParagraph"/>
       </w:pPr>
       <w:r>
-        <w:t xml:space="preserve">TSOULI Younes — référent indiqué dans le D0 Team-J.</w:t>
+        <w:t xml:space="preserve">TSOULI Younes : référent indiqué dans le D0 Team-J.</w:t>
       </w:r>
     </w:p>
     <w:bookmarkEnd w:id="82"/>
@@ -1861,7 +1762,7 @@
         <w:pStyle w:val="BodyText"/>
       </w:pPr>
       <w:r>
-        <w:t xml:space="preserve">Spécifications — écarts par rapport à D0 : le premier Dish d’une Order est devenu le premier ajout dans Cart ; recommandations limitées au même restaurant et hors panier ; réponse sans élément valide remplacée par le repli local. La diversité minimale évoquée par D0 n’est ni définie ni vérifiée, et les préférences utilisateur ne sont pas transmises. Le D0 présente une tension entre repli local et absence de suggestion lorsque toutes les réponses sont invalides ; le code retient le repli.</w:t>
+        <w:t xml:space="preserve">Spécifications : écarts par rapport à D0 : le premier Dish d’une Order est devenu le premier ajout dans Cart ; recommandations limitées au même restaurant et hors panier ; réponse sans élément valide remplacée par le repli local. La diversité minimale évoquée par D0 n’est ni définie ni vérifiée, et les préférences utilisateur ne sont pas transmises. Le D0 présente une tension entre repli local et absence de suggestion lorsque toutes les réponses sont invalides ; le code retient le repli.</w:t>
       </w:r>
     </w:p>
     <w:bookmarkEnd w:id="83"/>
@@ -1992,13 +1893,6 @@
       </w:pPr>
       <w:r>
         <w:t xml:space="preserve">9 tests CartServiceTest, 8 DishRecommendationServiceTest, 4 ExternalAIAdapterTest et 4 scénarios BDD. Les cas couvrent premier ajout, absence de relance, panne IA, références invalides et doublons, plats d’un autre restaurant, indisponibilité et absence d’alternative. Les doublures sont des lambdas/objets simulés, sans Mockito pour ce module. Limites : code dupliqué, pas de délai maximal d’appel, ni de classement métier du repli.</w:t>
-      </w:r>
-    </w:p>
-    <w:p>
-      <w:r>
-        <w:pict>
-          <v:rect style="width:0;height:1.5pt" o:hralign="center" o:hrstd="t" o:hr="t"/>
-        </w:pict>
       </w:r>
     </w:p>
     <w:bookmarkEnd w:id="90"/>

</xml_diff>

<commit_message>
Finalize cleaned D1 Word document
</commit_message>
<xml_diff>
--- a/doc/J-renduD1-modifiable.docx
+++ b/doc/J-renduD1-modifiable.docx
@@ -2,6 +2,24 @@
 <file path=word/document.xml><?xml version="1.0" encoding="utf-8"?>
 <w:document xmlns:w="http://schemas.openxmlformats.org/wordprocessingml/2006/main" xmlns:m="http://schemas.openxmlformats.org/officeDocument/2006/math" xmlns:r="http://schemas.openxmlformats.org/officeDocument/2006/relationships" xmlns:o="urn:schemas-microsoft-com:office:office" xmlns:v="urn:schemas-microsoft-com:vml" xmlns:w10="urn:schemas-microsoft-com:office:word" xmlns:a="http://schemas.openxmlformats.org/drawingml/2006/main" xmlns:pic="http://schemas.openxmlformats.org/drawingml/2006/picture" xmlns:wp="http://schemas.openxmlformats.org/drawingml/2006/wordprocessingDrawing">
   <w:body>
+    <w:bookmarkStart w:id="96" w:name="steats-équipe-j"/>
+    <w:p>
+      <w:pPr>
+        <w:pStyle w:val="Heading1"/>
+      </w:pPr>
+      <w:r>
+        <w:t xml:space="preserve">STEats : Équipe J</w:t>
+      </w:r>
+    </w:p>
+    <w:bookmarkStart w:id="20" w:name="rendu-d1-backend-java-maven"/>
+    <w:p>
+      <w:pPr>
+        <w:pStyle w:val="Heading2"/>
+      </w:pPr>
+      <w:r>
+        <w:t xml:space="preserve">Rendu D1 : Backend Java / Maven</w:t>
+      </w:r>
+    </w:p>
     <w:p>
       <w:pPr>
         <w:pStyle w:val="FirstParagraph"/>
@@ -10,71 +28,260 @@
         <w:t xml:space="preserve">Groupe 13 : Conception orientée objet : SI4 : 2026/2027</w:t>
       </w:r>
     </w:p>
+    <w:tbl>
+      <w:tblPr>
+        <w:tblStyle w:val="Table"/>
+        <w:tblW w:type="auto" w:w="0"/>
+        <w:jc w:val="left"/>
+        <w:tblLook w:firstRow="1" w:lastRow="0" w:firstColumn="0" w:lastColumn="0" w:noHBand="0" w:noVBand="0" w:val="0020"/>
+      </w:tblPr>
+      <w:tblGrid>
+        <w:gridCol w:w="2640"/>
+        <w:gridCol w:w="2640"/>
+        <w:gridCol w:w="2640"/>
+      </w:tblGrid>
+      <w:tr>
+        <w:trPr>
+          <w:tblHeader w:val="on"/>
+        </w:trPr>
+        <w:tc>
+          <w:tcPr/>
+          <w:p>
+            <w:pPr>
+              <w:pStyle w:val="Compact"/>
+              <w:jc w:val="left"/>
+            </w:pPr>
+            <w:r>
+              <w:t xml:space="preserve">Membre (nom et prénom : D0)</w:t>
+            </w:r>
+          </w:p>
+        </w:tc>
+        <w:tc>
+          <w:tcPr/>
+          <w:p>
+            <w:pPr>
+              <w:pStyle w:val="Compact"/>
+              <w:jc w:val="left"/>
+            </w:pPr>
+            <w:r>
+              <w:t xml:space="preserve">Rôle principal</w:t>
+            </w:r>
+          </w:p>
+        </w:tc>
+        <w:tc>
+          <w:tcPr/>
+          <w:p>
+            <w:pPr>
+              <w:pStyle w:val="Compact"/>
+              <w:jc w:val="left"/>
+            </w:pPr>
+            <w:r>
+              <w:t xml:space="preserve">Exigence stratégique</w:t>
+            </w:r>
+          </w:p>
+        </w:tc>
+      </w:tr>
+      <w:tr>
+        <w:tc>
+          <w:tcPr/>
+          <w:p>
+            <w:pPr>
+              <w:pStyle w:val="Compact"/>
+              <w:jc w:val="left"/>
+            </w:pPr>
+            <w:r>
+              <w:t xml:space="preserve">ADJEGAN Justice</w:t>
+            </w:r>
+          </w:p>
+        </w:tc>
+        <w:tc>
+          <w:tcPr/>
+          <w:p>
+            <w:pPr>
+              <w:pStyle w:val="Compact"/>
+              <w:jc w:val="left"/>
+            </w:pPr>
+            <w:r>
+              <w:t xml:space="preserve">Quality Assurance (QA)</w:t>
+            </w:r>
+          </w:p>
+        </w:tc>
+        <w:tc>
+          <w:tcPr/>
+          <w:p>
+            <w:pPr>
+              <w:pStyle w:val="Compact"/>
+              <w:jc w:val="left"/>
+            </w:pPr>
+            <w:r>
+              <w:t xml:space="preserve">A3* : Supervision</w:t>
+            </w:r>
+          </w:p>
+        </w:tc>
+      </w:tr>
+      <w:tr>
+        <w:tc>
+          <w:tcPr/>
+          <w:p>
+            <w:pPr>
+              <w:pStyle w:val="Compact"/>
+              <w:jc w:val="left"/>
+            </w:pPr>
+            <w:r>
+              <w:t xml:space="preserve">ATI-ATCHA Wahid</w:t>
+            </w:r>
+          </w:p>
+        </w:tc>
+        <w:tc>
+          <w:tcPr/>
+          <w:p>
+            <w:pPr>
+              <w:pStyle w:val="Compact"/>
+              <w:jc w:val="left"/>
+            </w:pPr>
+            <w:r>
+              <w:t xml:space="preserve">Software Architect</w:t>
+            </w:r>
+          </w:p>
+        </w:tc>
+        <w:tc>
+          <w:tcPr/>
+          <w:p>
+            <w:pPr>
+              <w:pStyle w:val="Compact"/>
+              <w:jc w:val="left"/>
+            </w:pPr>
+            <w:r>
+              <w:t xml:space="preserve">R6* : Offres / fidélité</w:t>
+            </w:r>
+          </w:p>
+        </w:tc>
+      </w:tr>
+      <w:tr>
+        <w:tc>
+          <w:tcPr/>
+          <w:p>
+            <w:pPr>
+              <w:pStyle w:val="Compact"/>
+              <w:jc w:val="left"/>
+            </w:pPr>
+            <w:r>
+              <w:t xml:space="preserve">LOUBARIS Adam</w:t>
+            </w:r>
+          </w:p>
+        </w:tc>
+        <w:tc>
+          <w:tcPr/>
+          <w:p>
+            <w:pPr>
+              <w:pStyle w:val="Compact"/>
+              <w:jc w:val="left"/>
+            </w:pPr>
+            <w:r>
+              <w:t xml:space="preserve">External Integration Manager</w:t>
+            </w:r>
+          </w:p>
+        </w:tc>
+        <w:tc>
+          <w:tcPr/>
+          <w:p>
+            <w:pPr>
+              <w:pStyle w:val="Compact"/>
+              <w:jc w:val="left"/>
+            </w:pPr>
+            <w:r>
+              <w:t xml:space="preserve">R5* : Capacités</w:t>
+            </w:r>
+          </w:p>
+        </w:tc>
+      </w:tr>
+      <w:tr>
+        <w:tc>
+          <w:tcPr/>
+          <w:p>
+            <w:pPr>
+              <w:pStyle w:val="Compact"/>
+              <w:jc w:val="left"/>
+            </w:pPr>
+            <w:r>
+              <w:t xml:space="preserve">MOROU Essognina Fadilou</w:t>
+            </w:r>
+          </w:p>
+        </w:tc>
+        <w:tc>
+          <w:tcPr/>
+          <w:p>
+            <w:pPr>
+              <w:pStyle w:val="Compact"/>
+              <w:jc w:val="left"/>
+            </w:pPr>
+            <w:r>
+              <w:t xml:space="preserve">Product Owner (PO)</w:t>
+            </w:r>
+          </w:p>
+        </w:tc>
+        <w:tc>
+          <w:tcPr/>
+          <w:p>
+            <w:pPr>
+              <w:pStyle w:val="Compact"/>
+              <w:jc w:val="left"/>
+            </w:pPr>
+            <w:r>
+              <w:t xml:space="preserve">D5* : Incidents</w:t>
+            </w:r>
+          </w:p>
+        </w:tc>
+      </w:tr>
+      <w:tr>
+        <w:tc>
+          <w:tcPr/>
+          <w:p>
+            <w:pPr>
+              <w:pStyle w:val="Compact"/>
+              <w:jc w:val="left"/>
+            </w:pPr>
+            <w:r>
+              <w:t xml:space="preserve">TSOULI Younes</w:t>
+            </w:r>
+          </w:p>
+        </w:tc>
+        <w:tc>
+          <w:tcPr/>
+          <w:p>
+            <w:pPr>
+              <w:pStyle w:val="Compact"/>
+              <w:jc w:val="left"/>
+            </w:pPr>
+            <w:r>
+              <w:t xml:space="preserve">Ops</w:t>
+            </w:r>
+          </w:p>
+        </w:tc>
+        <w:tc>
+          <w:tcPr/>
+          <w:p>
+            <w:pPr>
+              <w:pStyle w:val="Compact"/>
+              <w:jc w:val="left"/>
+            </w:pPr>
+            <w:r>
+              <w:t xml:space="preserve">AI3* : Recommandations</w:t>
+            </w:r>
+          </w:p>
+        </w:tc>
+      </w:tr>
+    </w:tbl>
     <w:p>
       <w:pPr>
         <w:pStyle w:val="BodyText"/>
       </w:pPr>
       <w:r>
-        <w:t xml:space="preserve">Membre (nom et prénom : D0) | Rôle principal | Exigence stratégique |</w:t>
-      </w:r>
-    </w:p>
-    <w:p>
-      <w:pPr>
-        <w:pStyle w:val="BodyText"/>
-      </w:pPr>
-      <w:r>
-        <w:t xml:space="preserve">— | — | — |</w:t>
-      </w:r>
-    </w:p>
-    <w:p>
-      <w:pPr>
-        <w:pStyle w:val="BodyText"/>
-      </w:pPr>
-      <w:r>
-        <w:t xml:space="preserve">ADJEGAN Justice | Quality Assurance (QA) | A3* : Supervision |</w:t>
-      </w:r>
-    </w:p>
-    <w:p>
-      <w:pPr>
-        <w:pStyle w:val="BodyText"/>
-      </w:pPr>
-      <w:r>
-        <w:t xml:space="preserve">ATI-ATCHA Wahid | Software Architect | R6* : Offres / fidélité |</w:t>
-      </w:r>
-    </w:p>
-    <w:p>
-      <w:pPr>
-        <w:pStyle w:val="BodyText"/>
-      </w:pPr>
-      <w:r>
-        <w:t xml:space="preserve">LOUBARIS Adam | External Integration Manager | R5* : Capacités |</w:t>
-      </w:r>
-    </w:p>
-    <w:p>
-      <w:pPr>
-        <w:pStyle w:val="BodyText"/>
-      </w:pPr>
-      <w:r>
-        <w:t xml:space="preserve">MOROU Essognina Fadilou | Product Owner (PO) | D5* : Incidents |</w:t>
-      </w:r>
-    </w:p>
-    <w:p>
-      <w:pPr>
-        <w:pStyle w:val="BodyText"/>
-      </w:pPr>
-      <w:r>
-        <w:t xml:space="preserve">TSOULI Younes | Ops | AI3* : Recommandations |</w:t>
-      </w:r>
-    </w:p>
-    <w:p>
-      <w:pPr>
-        <w:pStyle w:val="BodyText"/>
-      </w:pPr>
-      <w:r>
         <w:t xml:space="preserve">Version technique documentée, à compléter avant dépôt. Les identités et exigences référentes sont reprises du D0 fourni (PS7-Sheet (2).pdf). Les rôles et les 100 points par membre sont confirmés par l’équipe. Les classements de maîtrise, le bilan de collaboration et les preuves SonarQube restent à renseigner. Aucun résultat personnel ou indicateur SonarQube n’est inventé.</w:t>
       </w:r>
     </w:p>
-    <w:bookmarkStart w:id="21" w:name="table-des-matières"/>
+    <w:bookmarkEnd w:id="20"/>
+    <w:bookmarkStart w:id="22" w:name="table-des-matières"/>
     <w:p>
       <w:pPr>
         <w:pStyle w:val="Heading2"/>
@@ -91,7 +298,7 @@
         </w:numPr>
       </w:pPr>
       <w:r>
-        <w:t xml:space="preserve">Périmètre fonctionnel … p. 3</w:t>
+        <w:t xml:space="preserve">Périmètre fonctionnel … p. 3</w:t>
       </w:r>
     </w:p>
     <w:p>
@@ -102,7 +309,7 @@
         </w:numPr>
       </w:pPr>
       <w:r>
-        <w:t xml:space="preserve">Périmètre de compétence … p. 4</w:t>
+        <w:t xml:space="preserve">Périmètre de compétence … p. 4</w:t>
       </w:r>
     </w:p>
     <w:p>
@@ -113,7 +320,7 @@
         </w:numPr>
       </w:pPr>
       <w:r>
-        <w:t xml:space="preserve">Conception UML du cœur fonctionnel … p. 5</w:t>
+        <w:t xml:space="preserve">Conception UML du cœur fonctionnel … p. 5</w:t>
       </w:r>
     </w:p>
     <w:p>
@@ -124,7 +331,7 @@
         </w:numPr>
       </w:pPr>
       <w:r>
-        <w:t xml:space="preserve">Qualité du code, tests et gestion de projet … p. 9</w:t>
+        <w:t xml:space="preserve">Qualité du code, tests et gestion de projet … p. 9</w:t>
       </w:r>
     </w:p>
     <w:p>
@@ -135,7 +342,7 @@
         </w:numPr>
       </w:pPr>
       <w:r>
-        <w:t xml:space="preserve">D5* : Incidents de livraison … p. 10</w:t>
+        <w:t xml:space="preserve">D5* : Incidents de livraison … p. 10</w:t>
       </w:r>
     </w:p>
     <w:p>
@@ -146,7 +353,7 @@
         </w:numPr>
       </w:pPr>
       <w:r>
-        <w:t xml:space="preserve">R5* : Capacités et créneaux … p. 11</w:t>
+        <w:t xml:space="preserve">R5* : Capacités et créneaux … p. 11</w:t>
       </w:r>
     </w:p>
     <w:p>
@@ -157,7 +364,7 @@
         </w:numPr>
       </w:pPr>
       <w:r>
-        <w:t xml:space="preserve">R6* : Offres et promotions … p. 12</w:t>
+        <w:t xml:space="preserve">R6* : Offres et promotions … p. 12</w:t>
       </w:r>
     </w:p>
     <w:p>
@@ -168,7 +375,7 @@
         </w:numPr>
       </w:pPr>
       <w:r>
-        <w:t xml:space="preserve">A3* : Supervision des livraisons … p. 13</w:t>
+        <w:t xml:space="preserve">A3* : Supervision des livraisons … p. 13</w:t>
       </w:r>
     </w:p>
     <w:p>
@@ -179,7 +386,7 @@
         </w:numPr>
       </w:pPr>
       <w:r>
-        <w:t xml:space="preserve">AI3* : Recommandations … p. 14</w:t>
+        <w:t xml:space="preserve">AI3* : Recommandations … p. 14</w:t>
       </w:r>
     </w:p>
     <w:p>
@@ -190,10 +397,10 @@
         </w:numPr>
       </w:pPr>
       <w:r>
-        <w:t xml:space="preserve">Auto-évaluation … p. 15</w:t>
-      </w:r>
-    </w:p>
-    <w:bookmarkStart w:id="20" w:name="périmètre-du-rapport"/>
+        <w:t xml:space="preserve">Auto-évaluation … p. 15</w:t>
+      </w:r>
+    </w:p>
+    <w:bookmarkStart w:id="21" w:name="périmètre-du-rapport"/>
     <w:p>
       <w:pPr>
         <w:pStyle w:val="Heading3"/>
@@ -218,9 +425,9 @@
         <w:t xml:space="preserve">DONE signifie que le sous-périmètre identifié est implémenté et validé par les tests exécutés. WIP signale une couverture fonctionnelle partielle ou des limites importantes ; BLOCKED signale une fonctionnalité absente. L’isolation est évaluée par rapport aux défaillances des modules périphériques, et non par rapport à une panne du stockage propre au composant.</w:t>
       </w:r>
     </w:p>
-    <w:bookmarkEnd w:id="20"/>
     <w:bookmarkEnd w:id="21"/>
-    <w:bookmarkStart w:id="22" w:name="périmètre-fonctionnel"/>
+    <w:bookmarkEnd w:id="22"/>
+    <w:bookmarkStart w:id="23" w:name="périmètre-fonctionnel"/>
     <w:p>
       <w:pPr>
         <w:pStyle w:val="Heading2"/>
@@ -229,12 +436,1033 @@
         <w:t xml:space="preserve">1. Périmètre fonctionnel</w:t>
       </w:r>
     </w:p>
+    <w:tbl>
+      <w:tblPr>
+        <w:tblStyle w:val="Table"/>
+        <w:tblW w:type="pct" w:w="5000"/>
+        <w:jc w:val="left"/>
+        <w:tblLayout w:type="fixed"/>
+        <w:tblLook w:firstRow="1" w:lastRow="0" w:firstColumn="0" w:lastColumn="0" w:noHBand="0" w:noVBand="0" w:val="0020"/>
+      </w:tblPr>
+      <w:tblGrid>
+        <w:gridCol w:w="1584"/>
+        <w:gridCol w:w="1584"/>
+        <w:gridCol w:w="1584"/>
+        <w:gridCol w:w="1584"/>
+        <w:gridCol w:w="1584"/>
+      </w:tblGrid>
+      <w:tr>
+        <w:trPr>
+          <w:tblHeader w:val="on"/>
+        </w:trPr>
+        <w:tc>
+          <w:tcPr/>
+          <w:p>
+            <w:pPr>
+              <w:pStyle w:val="Compact"/>
+              <w:jc w:val="left"/>
+            </w:pPr>
+            <w:r>
+              <w:t xml:space="preserve">Exigence</w:t>
+            </w:r>
+          </w:p>
+        </w:tc>
+        <w:tc>
+          <w:tcPr/>
+          <w:p>
+            <w:pPr>
+              <w:pStyle w:val="Compact"/>
+              <w:jc w:val="left"/>
+            </w:pPr>
+            <w:r>
+              <w:t xml:space="preserve">État</w:t>
+            </w:r>
+          </w:p>
+        </w:tc>
+        <w:tc>
+          <w:tcPr/>
+          <w:p>
+            <w:pPr>
+              <w:pStyle w:val="Compact"/>
+              <w:jc w:val="left"/>
+            </w:pPr>
+            <w:r>
+              <w:t xml:space="preserve">Points forts</w:t>
+            </w:r>
+          </w:p>
+        </w:tc>
+        <w:tc>
+          <w:tcPr/>
+          <w:p>
+            <w:pPr>
+              <w:pStyle w:val="Compact"/>
+              <w:jc w:val="left"/>
+            </w:pPr>
+            <w:r>
+              <w:t xml:space="preserve">Points faibles</w:t>
+            </w:r>
+          </w:p>
+        </w:tc>
+        <w:tc>
+          <w:tcPr/>
+          <w:p>
+            <w:pPr>
+              <w:pStyle w:val="Compact"/>
+              <w:jc w:val="left"/>
+            </w:pPr>
+            <w:r>
+              <w:t xml:space="preserve">Peut être isolé fonctionnellement</w:t>
+            </w:r>
+          </w:p>
+        </w:tc>
+      </w:tr>
+      <w:tr>
+        <w:tc>
+          <w:tcPr/>
+          <w:p>
+            <w:pPr>
+              <w:pStyle w:val="Compact"/>
+              <w:jc w:val="left"/>
+            </w:pPr>
+            <w:r>
+              <w:t xml:space="preserve">C2 : Filtrage</w:t>
+            </w:r>
+          </w:p>
+        </w:tc>
+        <w:tc>
+          <w:tcPr/>
+          <w:p>
+            <w:pPr>
+              <w:pStyle w:val="Compact"/>
+              <w:jc w:val="left"/>
+            </w:pPr>
+            <w:r>
+              <w:t xml:space="preserve">DONE</w:t>
+            </w:r>
+          </w:p>
+        </w:tc>
+        <w:tc>
+          <w:tcPr/>
+          <w:p>
+            <w:pPr>
+              <w:pStyle w:val="Compact"/>
+              <w:jc w:val="left"/>
+            </w:pPr>
+            <w:r>
+              <w:t xml:space="preserve">Prix inclusifs, cuisines, type ; RestaurantFilterTest et RestaurantServiceTest.</w:t>
+            </w:r>
+          </w:p>
+        </w:tc>
+        <w:tc>
+          <w:tcPr/>
+          <w:p>
+            <w:pPr>
+              <w:pStyle w:val="Compact"/>
+              <w:jc w:val="left"/>
+            </w:pPr>
+            <w:r>
+              <w:t xml:space="preserve">Constructeur court de RestaurantService inutilisable pour findRestaurants (dépendances nulles).</w:t>
+            </w:r>
+          </w:p>
+        </w:tc>
+        <w:tc>
+          <w:tcPr/>
+          <w:p>
+            <w:pPr>
+              <w:pStyle w:val="Compact"/>
+              <w:jc w:val="left"/>
+            </w:pPr>
+            <w:r>
+              <w:t xml:space="preserve">Oui</w:t>
+            </w:r>
+          </w:p>
+        </w:tc>
+      </w:tr>
+      <w:tr>
+        <w:tc>
+          <w:tcPr/>
+          <w:p>
+            <w:pPr>
+              <w:pStyle w:val="Compact"/>
+              <w:jc w:val="left"/>
+            </w:pPr>
+            <w:r>
+              <w:t xml:space="preserve">C4 : Commandes précédentes</w:t>
+            </w:r>
+          </w:p>
+        </w:tc>
+        <w:tc>
+          <w:tcPr/>
+          <w:p>
+            <w:pPr>
+              <w:pStyle w:val="Compact"/>
+              <w:jc w:val="left"/>
+            </w:pPr>
+            <w:r>
+              <w:t xml:space="preserve">WIP</w:t>
+            </w:r>
+          </w:p>
+        </w:tc>
+        <w:tc>
+          <w:tcPr/>
+          <w:p>
+            <w:pPr>
+              <w:pStyle w:val="Compact"/>
+              <w:jc w:val="left"/>
+            </w:pPr>
+            <w:r>
+              <w:t xml:space="preserve">findByUserId ; classement par nombre de commandes non annulées.</w:t>
+            </w:r>
+          </w:p>
+        </w:tc>
+        <w:tc>
+          <w:tcPr/>
+          <w:p>
+            <w:pPr>
+              <w:pStyle w:val="Compact"/>
+              <w:jc w:val="left"/>
+            </w:pPr>
+            <w:r>
+              <w:t xml:space="preserve">D0 : consulter l’historique ; repository présent, mais pas de façade getOrderHistory ni de test de consultation dédié.</w:t>
+            </w:r>
+          </w:p>
+        </w:tc>
+        <w:tc>
+          <w:tcPr/>
+          <w:p>
+            <w:pPr>
+              <w:pStyle w:val="Compact"/>
+              <w:jc w:val="left"/>
+            </w:pPr>
+            <w:r>
+              <w:t xml:space="preserve">Oui</w:t>
+            </w:r>
+          </w:p>
+        </w:tc>
+      </w:tr>
+      <w:tr>
+        <w:tc>
+          <w:tcPr/>
+          <w:p>
+            <w:pPr>
+              <w:pStyle w:val="Compact"/>
+              <w:jc w:val="left"/>
+            </w:pPr>
+            <w:r>
+              <w:t xml:space="preserve">C5 : Panier / commande</w:t>
+            </w:r>
+          </w:p>
+        </w:tc>
+        <w:tc>
+          <w:tcPr/>
+          <w:p>
+            <w:pPr>
+              <w:pStyle w:val="Compact"/>
+              <w:jc w:val="left"/>
+            </w:pPr>
+            <w:r>
+              <w:t xml:space="preserve">WIP</w:t>
+            </w:r>
+          </w:p>
+        </w:tc>
+        <w:tc>
+          <w:tcPr/>
+          <w:p>
+            <w:pPr>
+              <w:pStyle w:val="Compact"/>
+              <w:jc w:val="left"/>
+            </w:pPr>
+            <w:r>
+              <w:t xml:space="preserve">Fusion des quantités ; stockage du panier ; lieu et horaire de livraison.</w:t>
+            </w:r>
+          </w:p>
+        </w:tc>
+        <w:tc>
+          <w:tcPr/>
+          <w:p>
+            <w:pPr>
+              <w:pStyle w:val="Compact"/>
+              <w:jc w:val="left"/>
+            </w:pPr>
+            <w:r>
+              <w:t xml:space="preserve">Pas de contrôle du changement de restaurant d’un panier existant ; stock non décrémenté.</w:t>
+            </w:r>
+          </w:p>
+        </w:tc>
+        <w:tc>
+          <w:tcPr/>
+          <w:p>
+            <w:pPr>
+              <w:pStyle w:val="Compact"/>
+              <w:jc w:val="left"/>
+            </w:pPr>
+            <w:r>
+              <w:t xml:space="preserve">Oui</w:t>
+            </w:r>
+          </w:p>
+        </w:tc>
+      </w:tr>
+      <w:tr>
+        <w:tc>
+          <w:tcPr/>
+          <w:p>
+            <w:pPr>
+              <w:pStyle w:val="Compact"/>
+              <w:jc w:val="left"/>
+            </w:pPr>
+            <w:r>
+              <w:t xml:space="preserve">C6 : Validation</w:t>
+            </w:r>
+          </w:p>
+        </w:tc>
+        <w:tc>
+          <w:tcPr/>
+          <w:p>
+            <w:pPr>
+              <w:pStyle w:val="Compact"/>
+              <w:jc w:val="left"/>
+            </w:pPr>
+            <w:r>
+              <w:t xml:space="preserve">WIP</w:t>
+            </w:r>
+          </w:p>
+        </w:tc>
+        <w:tc>
+          <w:tcPr/>
+          <w:p>
+            <w:pPr>
+              <w:pStyle w:val="Compact"/>
+              <w:jc w:val="left"/>
+            </w:pPr>
+            <w:r>
+              <w:t xml:space="preserve">Refus du panier vide, lieu/horaire inconnus, plat indisponible sur le parcours avec livraison.</w:t>
+            </w:r>
+          </w:p>
+        </w:tc>
+        <w:tc>
+          <w:tcPr/>
+          <w:p>
+            <w:pPr>
+              <w:pStyle w:val="Compact"/>
+              <w:jc w:val="left"/>
+            </w:pPr>
+            <w:r>
+              <w:t xml:space="preserve">createOrder sans livraison ne contrôle pas disponibilité/stock ; pas de validation utilisateur dans OrderService.</w:t>
+            </w:r>
+          </w:p>
+        </w:tc>
+        <w:tc>
+          <w:tcPr/>
+          <w:p>
+            <w:pPr>
+              <w:pStyle w:val="Compact"/>
+              <w:jc w:val="left"/>
+            </w:pPr>
+            <w:r>
+              <w:t xml:space="preserve">Non</w:t>
+            </w:r>
+          </w:p>
+        </w:tc>
+      </w:tr>
+      <w:tr>
+        <w:tc>
+          <w:tcPr/>
+          <w:p>
+            <w:pPr>
+              <w:pStyle w:val="Compact"/>
+              <w:jc w:val="left"/>
+            </w:pPr>
+            <w:r>
+              <w:t xml:space="preserve">D1 : Connexion livraison</w:t>
+            </w:r>
+          </w:p>
+        </w:tc>
+        <w:tc>
+          <w:tcPr/>
+          <w:p>
+            <w:pPr>
+              <w:pStyle w:val="Compact"/>
+              <w:jc w:val="left"/>
+            </w:pPr>
+            <w:r>
+              <w:t xml:space="preserve">WIP</w:t>
+            </w:r>
+          </w:p>
+        </w:tc>
+        <w:tc>
+          <w:tcPr/>
+          <w:p>
+            <w:pPr>
+              <w:pStyle w:val="Compact"/>
+              <w:jc w:val="left"/>
+            </w:pPr>
+            <w:r>
+              <w:t xml:space="preserve">Gateway injectable ; requête validée ; exception convertie en échec.</w:t>
+            </w:r>
+          </w:p>
+        </w:tc>
+        <w:tc>
+          <w:tcPr/>
+          <w:p>
+            <w:pPr>
+              <w:pStyle w:val="Compact"/>
+              <w:jc w:val="left"/>
+            </w:pPr>
+            <w:r>
+              <w:t xml:space="preserve">Adaptateur simulé ; earliest ready time R5* et créneaux retournés par le fournisseur absents.</w:t>
+            </w:r>
+          </w:p>
+        </w:tc>
+        <w:tc>
+          <w:tcPr/>
+          <w:p>
+            <w:pPr>
+              <w:pStyle w:val="Compact"/>
+              <w:jc w:val="left"/>
+            </w:pPr>
+            <w:r>
+              <w:t xml:space="preserve">Oui</w:t>
+            </w:r>
+          </w:p>
+        </w:tc>
+      </w:tr>
+      <w:tr>
+        <w:tc>
+          <w:tcPr/>
+          <w:p>
+            <w:pPr>
+              <w:pStyle w:val="Compact"/>
+              <w:jc w:val="left"/>
+            </w:pPr>
+            <w:r>
+              <w:t xml:space="preserve">D3 : Référence livraison</w:t>
+            </w:r>
+          </w:p>
+        </w:tc>
+        <w:tc>
+          <w:tcPr/>
+          <w:p>
+            <w:pPr>
+              <w:pStyle w:val="Compact"/>
+              <w:jc w:val="left"/>
+            </w:pPr>
+            <w:r>
+              <w:t xml:space="preserve">DONE</w:t>
+            </w:r>
+          </w:p>
+        </w:tc>
+        <w:tc>
+          <w:tcPr/>
+          <w:p>
+            <w:pPr>
+              <w:pStyle w:val="Compact"/>
+              <w:jc w:val="left"/>
+            </w:pPr>
+            <w:r>
+              <w:t xml:space="preserve">Référence D-UUID ; DeliveryInfo sauvegardé après succès.</w:t>
+            </w:r>
+          </w:p>
+        </w:tc>
+        <w:tc>
+          <w:tcPr/>
+          <w:p>
+            <w:pPr>
+              <w:pStyle w:val="Compact"/>
+              <w:jc w:val="left"/>
+            </w:pPr>
+            <w:r>
+              <w:t xml:space="preserve">Pas de garde d’idempotence ni de validation d’une référence retournée vide.</w:t>
+            </w:r>
+          </w:p>
+        </w:tc>
+        <w:tc>
+          <w:tcPr/>
+          <w:p>
+            <w:pPr>
+              <w:pStyle w:val="Compact"/>
+              <w:jc w:val="left"/>
+            </w:pPr>
+            <w:r>
+              <w:t xml:space="preserve">Oui</w:t>
+            </w:r>
+          </w:p>
+        </w:tc>
+      </w:tr>
+      <w:tr>
+        <w:tc>
+          <w:tcPr/>
+          <w:p>
+            <w:pPr>
+              <w:pStyle w:val="Compact"/>
+              <w:jc w:val="left"/>
+            </w:pPr>
+            <w:r>
+              <w:t xml:space="preserve">D4 : Suivi livraison</w:t>
+            </w:r>
+          </w:p>
+        </w:tc>
+        <w:tc>
+          <w:tcPr/>
+          <w:p>
+            <w:pPr>
+              <w:pStyle w:val="Compact"/>
+              <w:jc w:val="left"/>
+            </w:pPr>
+            <w:r>
+              <w:t xml:space="preserve">WIP</w:t>
+            </w:r>
+          </w:p>
+        </w:tc>
+        <w:tc>
+          <w:tcPr/>
+          <w:p>
+            <w:pPr>
+              <w:pStyle w:val="Compact"/>
+              <w:jc w:val="left"/>
+            </w:pPr>
+            <w:r>
+              <w:t xml:space="preserve">ACCEPTED / IN_TRANSIT / DELIVERED ; commande synchronisée.</w:t>
+            </w:r>
+          </w:p>
+        </w:tc>
+        <w:tc>
+          <w:tcPr/>
+          <w:p>
+            <w:pPr>
+              <w:pStyle w:val="Compact"/>
+              <w:jc w:val="left"/>
+            </w:pPr>
+            <w:r>
+              <w:t xml:space="preserve">D0 : 8 statuts et historique horodaté ; seuls 4 statuts présents, sans historique.</w:t>
+            </w:r>
+          </w:p>
+        </w:tc>
+        <w:tc>
+          <w:tcPr/>
+          <w:p>
+            <w:pPr>
+              <w:pStyle w:val="Compact"/>
+              <w:jc w:val="left"/>
+            </w:pPr>
+            <w:r>
+              <w:t xml:space="preserve">Oui</w:t>
+            </w:r>
+          </w:p>
+        </w:tc>
+      </w:tr>
+      <w:tr>
+        <w:tc>
+          <w:tcPr/>
+          <w:p>
+            <w:pPr>
+              <w:pStyle w:val="Compact"/>
+              <w:jc w:val="left"/>
+            </w:pPr>
+            <w:r>
+              <w:t xml:space="preserve">D5* : Incidents</w:t>
+            </w:r>
+          </w:p>
+        </w:tc>
+        <w:tc>
+          <w:tcPr/>
+          <w:p>
+            <w:pPr>
+              <w:pStyle w:val="Compact"/>
+              <w:jc w:val="left"/>
+            </w:pPr>
+            <w:r>
+              <w:t xml:space="preserve">WIP</w:t>
+            </w:r>
+          </w:p>
+        </w:tc>
+        <w:tc>
+          <w:tcPr/>
+          <w:p>
+            <w:pPr>
+              <w:pStyle w:val="Compact"/>
+              <w:jc w:val="left"/>
+            </w:pPr>
+            <w:r>
+              <w:t xml:space="preserve">FAILED et motif ; commande conservée PAID/READY.</w:t>
+            </w:r>
+          </w:p>
+        </w:tc>
+        <w:tc>
+          <w:tcPr/>
+          <w:p>
+            <w:pPr>
+              <w:pStyle w:val="Compact"/>
+              <w:jc w:val="left"/>
+            </w:pPr>
+            <w:r>
+              <w:t xml:space="preserve">Aucun scénario actif d’incident ; pas de remboursement / relivraison.</w:t>
+            </w:r>
+          </w:p>
+        </w:tc>
+        <w:tc>
+          <w:tcPr/>
+          <w:p>
+            <w:pPr>
+              <w:pStyle w:val="Compact"/>
+              <w:jc w:val="left"/>
+            </w:pPr>
+            <w:r>
+              <w:t xml:space="preserve">Oui</w:t>
+            </w:r>
+          </w:p>
+        </w:tc>
+      </w:tr>
+      <w:tr>
+        <w:tc>
+          <w:tcPr/>
+          <w:p>
+            <w:pPr>
+              <w:pStyle w:val="Compact"/>
+              <w:jc w:val="left"/>
+            </w:pPr>
+            <w:r>
+              <w:t xml:space="preserve">P1 : Paiement</w:t>
+            </w:r>
+          </w:p>
+        </w:tc>
+        <w:tc>
+          <w:tcPr/>
+          <w:p>
+            <w:pPr>
+              <w:pStyle w:val="Compact"/>
+              <w:jc w:val="left"/>
+            </w:pPr>
+            <w:r>
+              <w:t xml:space="preserve">DONE</w:t>
+            </w:r>
+          </w:p>
+        </w:tc>
+        <w:tc>
+          <w:tcPr/>
+          <w:p>
+            <w:pPr>
+              <w:pStyle w:val="Compact"/>
+              <w:jc w:val="left"/>
+            </w:pPr>
+            <w:r>
+              <w:t xml:space="preserve">Paiement simulé et crédit ; refus, exception, réponse nulle testés.</w:t>
+            </w:r>
+          </w:p>
+        </w:tc>
+        <w:tc>
+          <w:tcPr/>
+          <w:p>
+            <w:pPr>
+              <w:pStyle w:val="Compact"/>
+              <w:jc w:val="left"/>
+            </w:pPr>
+            <w:r>
+              <w:t xml:space="preserve">Pas de banque réelle ; paiement répété non interdit.</w:t>
+            </w:r>
+          </w:p>
+        </w:tc>
+        <w:tc>
+          <w:tcPr/>
+          <w:p>
+            <w:pPr>
+              <w:pStyle w:val="Compact"/>
+              <w:jc w:val="left"/>
+            </w:pPr>
+            <w:r>
+              <w:t xml:space="preserve">Oui</w:t>
+            </w:r>
+          </w:p>
+        </w:tc>
+      </w:tr>
+      <w:tr>
+        <w:tc>
+          <w:tcPr/>
+          <w:p>
+            <w:pPr>
+              <w:pStyle w:val="Compact"/>
+              <w:jc w:val="left"/>
+            </w:pPr>
+            <w:r>
+              <w:t xml:space="preserve">P2 : Enregistrement</w:t>
+            </w:r>
+          </w:p>
+        </w:tc>
+        <w:tc>
+          <w:tcPr/>
+          <w:p>
+            <w:pPr>
+              <w:pStyle w:val="Compact"/>
+              <w:jc w:val="left"/>
+            </w:pPr>
+            <w:r>
+              <w:t xml:space="preserve">DONE</w:t>
+            </w:r>
+          </w:p>
+        </w:tc>
+        <w:tc>
+          <w:tcPr/>
+          <w:p>
+            <w:pPr>
+              <w:pStyle w:val="Compact"/>
+              <w:jc w:val="left"/>
+            </w:pPr>
+            <w:r>
+              <w:t xml:space="preserve">Commande PENDING avec lignes, total, lieu et horaire.</w:t>
+            </w:r>
+          </w:p>
+        </w:tc>
+        <w:tc>
+          <w:tcPr/>
+          <w:p>
+            <w:pPr>
+              <w:pStyle w:val="Compact"/>
+              <w:jc w:val="left"/>
+            </w:pPr>
+            <w:r>
+              <w:t xml:space="preserve">Stockage volatil ; absence de transaction avec consommation de capacité.</w:t>
+            </w:r>
+          </w:p>
+        </w:tc>
+        <w:tc>
+          <w:tcPr/>
+          <w:p>
+            <w:pPr>
+              <w:pStyle w:val="Compact"/>
+              <w:jc w:val="left"/>
+            </w:pPr>
+            <w:r>
+              <w:t xml:space="preserve">Oui</w:t>
+            </w:r>
+          </w:p>
+        </w:tc>
+      </w:tr>
+      <w:tr>
+        <w:tc>
+          <w:tcPr/>
+          <w:p>
+            <w:pPr>
+              <w:pStyle w:val="Compact"/>
+              <w:jc w:val="left"/>
+            </w:pPr>
+            <w:r>
+              <w:t xml:space="preserve">R3 : Gestion plats</w:t>
+            </w:r>
+          </w:p>
+        </w:tc>
+        <w:tc>
+          <w:tcPr/>
+          <w:p>
+            <w:pPr>
+              <w:pStyle w:val="Compact"/>
+              <w:jc w:val="left"/>
+            </w:pPr>
+            <w:r>
+              <w:t xml:space="preserve">DONE</w:t>
+            </w:r>
+          </w:p>
+        </w:tc>
+        <w:tc>
+          <w:tcPr/>
+          <w:p>
+            <w:pPr>
+              <w:pStyle w:val="Compact"/>
+              <w:jc w:val="left"/>
+            </w:pPr>
+            <w:r>
+              <w:t xml:space="preserve">Ajout / modification nom et description ; doublon et champs vides refusés.</w:t>
+            </w:r>
+          </w:p>
+        </w:tc>
+        <w:tc>
+          <w:tcPr/>
+          <w:p>
+            <w:pPr>
+              <w:pStyle w:val="Compact"/>
+              <w:jc w:val="left"/>
+            </w:pPr>
+            <w:r>
+              <w:t xml:space="preserve">Pas de contrôle d’autorisation restaurateur ; feature R3 vide.</w:t>
+            </w:r>
+          </w:p>
+        </w:tc>
+        <w:tc>
+          <w:tcPr/>
+          <w:p>
+            <w:pPr>
+              <w:pStyle w:val="Compact"/>
+              <w:jc w:val="left"/>
+            </w:pPr>
+            <w:r>
+              <w:t xml:space="preserve">Oui</w:t>
+            </w:r>
+          </w:p>
+        </w:tc>
+      </w:tr>
+      <w:tr>
+        <w:tc>
+          <w:tcPr/>
+          <w:p>
+            <w:pPr>
+              <w:pStyle w:val="Compact"/>
+              <w:jc w:val="left"/>
+            </w:pPr>
+            <w:r>
+              <w:t xml:space="preserve">R5* : Capacités / temps</w:t>
+            </w:r>
+          </w:p>
+        </w:tc>
+        <w:tc>
+          <w:tcPr/>
+          <w:p>
+            <w:pPr>
+              <w:pStyle w:val="Compact"/>
+              <w:jc w:val="left"/>
+            </w:pPr>
+            <w:r>
+              <w:t xml:space="preserve">WIP</w:t>
+            </w:r>
+          </w:p>
+        </w:tc>
+        <w:tc>
+          <w:tcPr/>
+          <w:p>
+            <w:pPr>
+              <w:pStyle w:val="Compact"/>
+              <w:jc w:val="left"/>
+            </w:pPr>
+            <w:r>
+              <w:t xml:space="preserve">Capacité par TimeSlot, décrément, refus si pleine.</w:t>
+            </w:r>
+          </w:p>
+        </w:tc>
+        <w:tc>
+          <w:tcPr/>
+          <w:p>
+            <w:pPr>
+              <w:pStyle w:val="Compact"/>
+              <w:jc w:val="left"/>
+            </w:pPr>
+            <w:r>
+              <w:t xml:space="preserve">Pas d’atomicité, restitution après échec, estimation du temps ou réservation avancée.</w:t>
+            </w:r>
+          </w:p>
+        </w:tc>
+        <w:tc>
+          <w:tcPr/>
+          <w:p>
+            <w:pPr>
+              <w:pStyle w:val="Compact"/>
+              <w:jc w:val="left"/>
+            </w:pPr>
+            <w:r>
+              <w:t xml:space="preserve">Non</w:t>
+            </w:r>
+          </w:p>
+        </w:tc>
+      </w:tr>
+      <w:tr>
+        <w:tc>
+          <w:tcPr/>
+          <w:p>
+            <w:pPr>
+              <w:pStyle w:val="Compact"/>
+              <w:jc w:val="left"/>
+            </w:pPr>
+            <w:r>
+              <w:t xml:space="preserve">R6* : Offres</w:t>
+            </w:r>
+          </w:p>
+        </w:tc>
+        <w:tc>
+          <w:tcPr/>
+          <w:p>
+            <w:pPr>
+              <w:pStyle w:val="Compact"/>
+              <w:jc w:val="left"/>
+            </w:pPr>
+            <w:r>
+              <w:t xml:space="preserve">BLOCKED</w:t>
+            </w:r>
+          </w:p>
+        </w:tc>
+        <w:tc>
+          <w:tcPr/>
+          <w:p>
+            <w:pPr>
+              <w:pStyle w:val="Compact"/>
+              <w:jc w:val="left"/>
+            </w:pPr>
+            <w:r>
+              <w:t xml:space="preserve">Aucune implémentation identifiée.</w:t>
+            </w:r>
+          </w:p>
+        </w:tc>
+        <w:tc>
+          <w:tcPr/>
+          <w:p>
+            <w:pPr>
+              <w:pStyle w:val="Compact"/>
+              <w:jc w:val="left"/>
+            </w:pPr>
+            <w:r>
+              <w:t xml:space="preserve">Pas de modèle promotion ni règle de remise.</w:t>
+            </w:r>
+          </w:p>
+        </w:tc>
+        <w:tc>
+          <w:tcPr/>
+          <w:p>
+            <w:pPr>
+              <w:pStyle w:val="Compact"/>
+              <w:jc w:val="left"/>
+            </w:pPr>
+            <w:r>
+              <w:t xml:space="preserve">Non</w:t>
+            </w:r>
+          </w:p>
+        </w:tc>
+      </w:tr>
+      <w:tr>
+        <w:tc>
+          <w:tcPr/>
+          <w:p>
+            <w:pPr>
+              <w:pStyle w:val="Compact"/>
+              <w:jc w:val="left"/>
+            </w:pPr>
+            <w:r>
+              <w:t xml:space="preserve">A3* : Supervision</w:t>
+            </w:r>
+          </w:p>
+        </w:tc>
+        <w:tc>
+          <w:tcPr/>
+          <w:p>
+            <w:pPr>
+              <w:pStyle w:val="Compact"/>
+              <w:jc w:val="left"/>
+            </w:pPr>
+            <w:r>
+              <w:t xml:space="preserve">BLOCKED</w:t>
+            </w:r>
+          </w:p>
+        </w:tc>
+        <w:tc>
+          <w:tcPr/>
+          <w:p>
+            <w:pPr>
+              <w:pStyle w:val="Compact"/>
+              <w:jc w:val="left"/>
+            </w:pPr>
+            <w:r>
+              <w:t xml:space="preserve">Statut unitaire disponible dans DeliveryInfo.</w:t>
+            </w:r>
+          </w:p>
+        </w:tc>
+        <w:tc>
+          <w:tcPr/>
+          <w:p>
+            <w:pPr>
+              <w:pStyle w:val="Compact"/>
+              <w:jc w:val="left"/>
+            </w:pPr>
+            <w:r>
+              <w:t xml:space="preserve">Pas de tableau de supervision, agrégation ni service administrateur.</w:t>
+            </w:r>
+          </w:p>
+        </w:tc>
+        <w:tc>
+          <w:tcPr/>
+          <w:p>
+            <w:pPr>
+              <w:pStyle w:val="Compact"/>
+              <w:jc w:val="left"/>
+            </w:pPr>
+            <w:r>
+              <w:t xml:space="preserve">Non</w:t>
+            </w:r>
+          </w:p>
+        </w:tc>
+      </w:tr>
+      <w:tr>
+        <w:tc>
+          <w:tcPr/>
+          <w:p>
+            <w:pPr>
+              <w:pStyle w:val="Compact"/>
+              <w:jc w:val="left"/>
+            </w:pPr>
+            <w:r>
+              <w:t xml:space="preserve">AI3* : Recommandations</w:t>
+            </w:r>
+          </w:p>
+        </w:tc>
+        <w:tc>
+          <w:tcPr/>
+          <w:p>
+            <w:pPr>
+              <w:pStyle w:val="Compact"/>
+              <w:jc w:val="left"/>
+            </w:pPr>
+            <w:r>
+              <w:t xml:space="preserve">WIP</w:t>
+            </w:r>
+          </w:p>
+        </w:tc>
+        <w:tc>
+          <w:tcPr/>
+          <w:p>
+            <w:pPr>
+              <w:pStyle w:val="Compact"/>
+              <w:jc w:val="left"/>
+            </w:pPr>
+            <w:r>
+              <w:t xml:space="preserve">Premier ajout, filtrage, déduplication, repli si panne.</w:t>
+            </w:r>
+          </w:p>
+        </w:tc>
+        <w:tc>
+          <w:tcPr/>
+          <w:p>
+            <w:pPr>
+              <w:pStyle w:val="Compact"/>
+              <w:jc w:val="left"/>
+            </w:pPr>
+            <w:r>
+              <w:t xml:space="preserve">Diversité minimale D0 non contrôlée ; IA simulée ; code de recommandation dupliqué.</w:t>
+            </w:r>
+          </w:p>
+        </w:tc>
+        <w:tc>
+          <w:tcPr/>
+          <w:p>
+            <w:pPr>
+              <w:pStyle w:val="Compact"/>
+              <w:jc w:val="left"/>
+            </w:pPr>
+            <w:r>
+              <w:t xml:space="preserve">Oui</w:t>
+            </w:r>
+          </w:p>
+        </w:tc>
+      </w:tr>
+    </w:tbl>
+    <w:bookmarkEnd w:id="23"/>
+    <w:bookmarkStart w:id="24" w:name="périmètre-de-compétence"/>
+    <w:p>
+      <w:pPr>
+        <w:pStyle w:val="Heading2"/>
+      </w:pPr>
+      <w:r>
+        <w:t xml:space="preserve">2. Périmètre de compétence</w:t>
+      </w:r>
+    </w:p>
     <w:p>
       <w:pPr>
         <w:pStyle w:val="FirstParagraph"/>
       </w:pPr>
       <w:r>
-        <w:t xml:space="preserve">Exigence | État | Points forts | Points faibles | Peut être isolé fonctionnellement |</w:t>
+        <w:t xml:space="preserve">Les cinq membres doivent classer les 15 exigences : chaque colonne doit être une permutation de 1 à 15, de la moins maîtrisée à la mieux maîtrisée. Le classement individuel ne mesure ni le nombre de commits ni le rôle déclaré ; il doit être renseigné personnellement.</w:t>
       </w:r>
     </w:p>
     <w:p>
@@ -242,310 +1470,1425 @@
         <w:pStyle w:val="BodyText"/>
       </w:pPr>
       <w:r>
-        <w:t xml:space="preserve">— | — | — | — | — |</w:t>
-      </w:r>
-    </w:p>
+        <w:t xml:space="preserve">Les colonnes suivent l’ordre alphabétique des noms du D0 : ADJEGAN, ATI-ATCHA, LOUBARIS, MOROU, TSOULI. Aucune auto-évaluation n’a été déduite du code ; chaque membre doit renseigner sa propre colonne.</w:t>
+      </w:r>
+    </w:p>
+    <w:tbl>
+      <w:tblPr>
+        <w:tblStyle w:val="Table"/>
+        <w:tblW w:type="pct" w:w="5000"/>
+        <w:jc w:val="left"/>
+        <w:tblLayout w:type="fixed"/>
+        <w:tblLook w:firstRow="1" w:lastRow="0" w:firstColumn="0" w:lastColumn="0" w:noHBand="0" w:noVBand="0" w:val="0020"/>
+      </w:tblPr>
+      <w:tblGrid>
+        <w:gridCol w:w="1131"/>
+        <w:gridCol w:w="1131"/>
+        <w:gridCol w:w="1131"/>
+        <w:gridCol w:w="1131"/>
+        <w:gridCol w:w="1131"/>
+        <w:gridCol w:w="1131"/>
+        <w:gridCol w:w="1131"/>
+      </w:tblGrid>
+      <w:tr>
+        <w:trPr>
+          <w:tblHeader w:val="on"/>
+        </w:trPr>
+        <w:tc>
+          <w:tcPr/>
+          <w:p>
+            <w:pPr>
+              <w:pStyle w:val="Compact"/>
+              <w:jc w:val="left"/>
+            </w:pPr>
+            <w:r>
+              <w:t xml:space="preserve">Exigence</w:t>
+            </w:r>
+          </w:p>
+        </w:tc>
+        <w:tc>
+          <w:tcPr/>
+          <w:p>
+            <w:pPr>
+              <w:pStyle w:val="Compact"/>
+              <w:jc w:val="left"/>
+            </w:pPr>
+            <w:r>
+              <w:t xml:space="preserve">État</w:t>
+            </w:r>
+          </w:p>
+        </w:tc>
+        <w:tc>
+          <w:tcPr/>
+          <w:p>
+            <w:pPr>
+              <w:pStyle w:val="Compact"/>
+              <w:jc w:val="left"/>
+            </w:pPr>
+            <w:r>
+              <w:t xml:space="preserve">ADJEGAN Justice</w:t>
+            </w:r>
+          </w:p>
+        </w:tc>
+        <w:tc>
+          <w:tcPr/>
+          <w:p>
+            <w:pPr>
+              <w:pStyle w:val="Compact"/>
+              <w:jc w:val="left"/>
+            </w:pPr>
+            <w:r>
+              <w:t xml:space="preserve">ATI-ATCHA Wahid</w:t>
+            </w:r>
+          </w:p>
+        </w:tc>
+        <w:tc>
+          <w:tcPr/>
+          <w:p>
+            <w:pPr>
+              <w:pStyle w:val="Compact"/>
+              <w:jc w:val="left"/>
+            </w:pPr>
+            <w:r>
+              <w:t xml:space="preserve">LOUBARIS Adam</w:t>
+            </w:r>
+          </w:p>
+        </w:tc>
+        <w:tc>
+          <w:tcPr/>
+          <w:p>
+            <w:pPr>
+              <w:pStyle w:val="Compact"/>
+              <w:jc w:val="left"/>
+            </w:pPr>
+            <w:r>
+              <w:t xml:space="preserve">MOROU E. Fadilou</w:t>
+            </w:r>
+          </w:p>
+        </w:tc>
+        <w:tc>
+          <w:tcPr/>
+          <w:p>
+            <w:pPr>
+              <w:pStyle w:val="Compact"/>
+              <w:jc w:val="left"/>
+            </w:pPr>
+            <w:r>
+              <w:t xml:space="preserve">TSOULI Younes</w:t>
+            </w:r>
+          </w:p>
+        </w:tc>
+      </w:tr>
+      <w:tr>
+        <w:tc>
+          <w:tcPr/>
+          <w:p>
+            <w:pPr>
+              <w:pStyle w:val="Compact"/>
+              <w:jc w:val="left"/>
+            </w:pPr>
+            <w:r>
+              <w:t xml:space="preserve">C2</w:t>
+            </w:r>
+          </w:p>
+        </w:tc>
+        <w:tc>
+          <w:tcPr/>
+          <w:p>
+            <w:pPr>
+              <w:pStyle w:val="Compact"/>
+              <w:jc w:val="left"/>
+            </w:pPr>
+            <w:r>
+              <w:t xml:space="preserve">DONE</w:t>
+            </w:r>
+          </w:p>
+        </w:tc>
+        <w:tc>
+          <w:tcPr/>
+          <w:p>
+            <w:pPr>
+              <w:pStyle w:val="Compact"/>
+              <w:jc w:val="left"/>
+            </w:pPr>
+            <w:r>
+              <w:t xml:space="preserve">À saisir</w:t>
+            </w:r>
+          </w:p>
+        </w:tc>
+        <w:tc>
+          <w:tcPr/>
+          <w:p>
+            <w:pPr>
+              <w:pStyle w:val="Compact"/>
+              <w:jc w:val="left"/>
+            </w:pPr>
+            <w:r>
+              <w:t xml:space="preserve">À saisir</w:t>
+            </w:r>
+          </w:p>
+        </w:tc>
+        <w:tc>
+          <w:tcPr/>
+          <w:p>
+            <w:pPr>
+              <w:pStyle w:val="Compact"/>
+              <w:jc w:val="left"/>
+            </w:pPr>
+            <w:r>
+              <w:t xml:space="preserve">À saisir</w:t>
+            </w:r>
+          </w:p>
+        </w:tc>
+        <w:tc>
+          <w:tcPr/>
+          <w:p>
+            <w:pPr>
+              <w:pStyle w:val="Compact"/>
+              <w:jc w:val="left"/>
+            </w:pPr>
+            <w:r>
+              <w:t xml:space="preserve">À saisir</w:t>
+            </w:r>
+          </w:p>
+        </w:tc>
+        <w:tc>
+          <w:tcPr/>
+          <w:p>
+            <w:pPr>
+              <w:pStyle w:val="Compact"/>
+              <w:jc w:val="left"/>
+            </w:pPr>
+            <w:r>
+              <w:t xml:space="preserve">À saisir</w:t>
+            </w:r>
+          </w:p>
+        </w:tc>
+      </w:tr>
+      <w:tr>
+        <w:tc>
+          <w:tcPr/>
+          <w:p>
+            <w:pPr>
+              <w:pStyle w:val="Compact"/>
+              <w:jc w:val="left"/>
+            </w:pPr>
+            <w:r>
+              <w:t xml:space="preserve">C4</w:t>
+            </w:r>
+          </w:p>
+        </w:tc>
+        <w:tc>
+          <w:tcPr/>
+          <w:p>
+            <w:pPr>
+              <w:pStyle w:val="Compact"/>
+              <w:jc w:val="left"/>
+            </w:pPr>
+            <w:r>
+              <w:t xml:space="preserve">WIP</w:t>
+            </w:r>
+          </w:p>
+        </w:tc>
+        <w:tc>
+          <w:tcPr/>
+          <w:p>
+            <w:pPr>
+              <w:pStyle w:val="Compact"/>
+              <w:jc w:val="left"/>
+            </w:pPr>
+            <w:r>
+              <w:t xml:space="preserve">À saisir</w:t>
+            </w:r>
+          </w:p>
+        </w:tc>
+        <w:tc>
+          <w:tcPr/>
+          <w:p>
+            <w:pPr>
+              <w:pStyle w:val="Compact"/>
+              <w:jc w:val="left"/>
+            </w:pPr>
+            <w:r>
+              <w:t xml:space="preserve">À saisir</w:t>
+            </w:r>
+          </w:p>
+        </w:tc>
+        <w:tc>
+          <w:tcPr/>
+          <w:p>
+            <w:pPr>
+              <w:pStyle w:val="Compact"/>
+              <w:jc w:val="left"/>
+            </w:pPr>
+            <w:r>
+              <w:t xml:space="preserve">À saisir</w:t>
+            </w:r>
+          </w:p>
+        </w:tc>
+        <w:tc>
+          <w:tcPr/>
+          <w:p>
+            <w:pPr>
+              <w:pStyle w:val="Compact"/>
+              <w:jc w:val="left"/>
+            </w:pPr>
+            <w:r>
+              <w:t xml:space="preserve">À saisir</w:t>
+            </w:r>
+          </w:p>
+        </w:tc>
+        <w:tc>
+          <w:tcPr/>
+          <w:p>
+            <w:pPr>
+              <w:pStyle w:val="Compact"/>
+              <w:jc w:val="left"/>
+            </w:pPr>
+            <w:r>
+              <w:t xml:space="preserve">À saisir</w:t>
+            </w:r>
+          </w:p>
+        </w:tc>
+      </w:tr>
+      <w:tr>
+        <w:tc>
+          <w:tcPr/>
+          <w:p>
+            <w:pPr>
+              <w:pStyle w:val="Compact"/>
+              <w:jc w:val="left"/>
+            </w:pPr>
+            <w:r>
+              <w:t xml:space="preserve">C5</w:t>
+            </w:r>
+          </w:p>
+        </w:tc>
+        <w:tc>
+          <w:tcPr/>
+          <w:p>
+            <w:pPr>
+              <w:pStyle w:val="Compact"/>
+              <w:jc w:val="left"/>
+            </w:pPr>
+            <w:r>
+              <w:t xml:space="preserve">WIP</w:t>
+            </w:r>
+          </w:p>
+        </w:tc>
+        <w:tc>
+          <w:tcPr/>
+          <w:p>
+            <w:pPr>
+              <w:pStyle w:val="Compact"/>
+              <w:jc w:val="left"/>
+            </w:pPr>
+            <w:r>
+              <w:t xml:space="preserve">À saisir</w:t>
+            </w:r>
+          </w:p>
+        </w:tc>
+        <w:tc>
+          <w:tcPr/>
+          <w:p>
+            <w:pPr>
+              <w:pStyle w:val="Compact"/>
+              <w:jc w:val="left"/>
+            </w:pPr>
+            <w:r>
+              <w:t xml:space="preserve">À saisir</w:t>
+            </w:r>
+          </w:p>
+        </w:tc>
+        <w:tc>
+          <w:tcPr/>
+          <w:p>
+            <w:pPr>
+              <w:pStyle w:val="Compact"/>
+              <w:jc w:val="left"/>
+            </w:pPr>
+            <w:r>
+              <w:t xml:space="preserve">À saisir</w:t>
+            </w:r>
+          </w:p>
+        </w:tc>
+        <w:tc>
+          <w:tcPr/>
+          <w:p>
+            <w:pPr>
+              <w:pStyle w:val="Compact"/>
+              <w:jc w:val="left"/>
+            </w:pPr>
+            <w:r>
+              <w:t xml:space="preserve">À saisir</w:t>
+            </w:r>
+          </w:p>
+        </w:tc>
+        <w:tc>
+          <w:tcPr/>
+          <w:p>
+            <w:pPr>
+              <w:pStyle w:val="Compact"/>
+              <w:jc w:val="left"/>
+            </w:pPr>
+            <w:r>
+              <w:t xml:space="preserve">À saisir</w:t>
+            </w:r>
+          </w:p>
+        </w:tc>
+      </w:tr>
+      <w:tr>
+        <w:tc>
+          <w:tcPr/>
+          <w:p>
+            <w:pPr>
+              <w:pStyle w:val="Compact"/>
+              <w:jc w:val="left"/>
+            </w:pPr>
+            <w:r>
+              <w:t xml:space="preserve">C6</w:t>
+            </w:r>
+          </w:p>
+        </w:tc>
+        <w:tc>
+          <w:tcPr/>
+          <w:p>
+            <w:pPr>
+              <w:pStyle w:val="Compact"/>
+              <w:jc w:val="left"/>
+            </w:pPr>
+            <w:r>
+              <w:t xml:space="preserve">WIP</w:t>
+            </w:r>
+          </w:p>
+        </w:tc>
+        <w:tc>
+          <w:tcPr/>
+          <w:p>
+            <w:pPr>
+              <w:pStyle w:val="Compact"/>
+              <w:jc w:val="left"/>
+            </w:pPr>
+            <w:r>
+              <w:t xml:space="preserve">À saisir</w:t>
+            </w:r>
+          </w:p>
+        </w:tc>
+        <w:tc>
+          <w:tcPr/>
+          <w:p>
+            <w:pPr>
+              <w:pStyle w:val="Compact"/>
+              <w:jc w:val="left"/>
+            </w:pPr>
+            <w:r>
+              <w:t xml:space="preserve">À saisir</w:t>
+            </w:r>
+          </w:p>
+        </w:tc>
+        <w:tc>
+          <w:tcPr/>
+          <w:p>
+            <w:pPr>
+              <w:pStyle w:val="Compact"/>
+              <w:jc w:val="left"/>
+            </w:pPr>
+            <w:r>
+              <w:t xml:space="preserve">À saisir</w:t>
+            </w:r>
+          </w:p>
+        </w:tc>
+        <w:tc>
+          <w:tcPr/>
+          <w:p>
+            <w:pPr>
+              <w:pStyle w:val="Compact"/>
+              <w:jc w:val="left"/>
+            </w:pPr>
+            <w:r>
+              <w:t xml:space="preserve">À saisir</w:t>
+            </w:r>
+          </w:p>
+        </w:tc>
+        <w:tc>
+          <w:tcPr/>
+          <w:p>
+            <w:pPr>
+              <w:pStyle w:val="Compact"/>
+              <w:jc w:val="left"/>
+            </w:pPr>
+            <w:r>
+              <w:t xml:space="preserve">À saisir</w:t>
+            </w:r>
+          </w:p>
+        </w:tc>
+      </w:tr>
+      <w:tr>
+        <w:tc>
+          <w:tcPr/>
+          <w:p>
+            <w:pPr>
+              <w:pStyle w:val="Compact"/>
+              <w:jc w:val="left"/>
+            </w:pPr>
+            <w:r>
+              <w:t xml:space="preserve">D1</w:t>
+            </w:r>
+          </w:p>
+        </w:tc>
+        <w:tc>
+          <w:tcPr/>
+          <w:p>
+            <w:pPr>
+              <w:pStyle w:val="Compact"/>
+              <w:jc w:val="left"/>
+            </w:pPr>
+            <w:r>
+              <w:t xml:space="preserve">WIP</w:t>
+            </w:r>
+          </w:p>
+        </w:tc>
+        <w:tc>
+          <w:tcPr/>
+          <w:p>
+            <w:pPr>
+              <w:pStyle w:val="Compact"/>
+              <w:jc w:val="left"/>
+            </w:pPr>
+            <w:r>
+              <w:t xml:space="preserve">À saisir</w:t>
+            </w:r>
+          </w:p>
+        </w:tc>
+        <w:tc>
+          <w:tcPr/>
+          <w:p>
+            <w:pPr>
+              <w:pStyle w:val="Compact"/>
+              <w:jc w:val="left"/>
+            </w:pPr>
+            <w:r>
+              <w:t xml:space="preserve">À saisir</w:t>
+            </w:r>
+          </w:p>
+        </w:tc>
+        <w:tc>
+          <w:tcPr/>
+          <w:p>
+            <w:pPr>
+              <w:pStyle w:val="Compact"/>
+              <w:jc w:val="left"/>
+            </w:pPr>
+            <w:r>
+              <w:t xml:space="preserve">À saisir</w:t>
+            </w:r>
+          </w:p>
+        </w:tc>
+        <w:tc>
+          <w:tcPr/>
+          <w:p>
+            <w:pPr>
+              <w:pStyle w:val="Compact"/>
+              <w:jc w:val="left"/>
+            </w:pPr>
+            <w:r>
+              <w:t xml:space="preserve">À saisir</w:t>
+            </w:r>
+          </w:p>
+        </w:tc>
+        <w:tc>
+          <w:tcPr/>
+          <w:p>
+            <w:pPr>
+              <w:pStyle w:val="Compact"/>
+              <w:jc w:val="left"/>
+            </w:pPr>
+            <w:r>
+              <w:t xml:space="preserve">À saisir</w:t>
+            </w:r>
+          </w:p>
+        </w:tc>
+      </w:tr>
+      <w:tr>
+        <w:tc>
+          <w:tcPr/>
+          <w:p>
+            <w:pPr>
+              <w:pStyle w:val="Compact"/>
+              <w:jc w:val="left"/>
+            </w:pPr>
+            <w:r>
+              <w:t xml:space="preserve">D3</w:t>
+            </w:r>
+          </w:p>
+        </w:tc>
+        <w:tc>
+          <w:tcPr/>
+          <w:p>
+            <w:pPr>
+              <w:pStyle w:val="Compact"/>
+              <w:jc w:val="left"/>
+            </w:pPr>
+            <w:r>
+              <w:t xml:space="preserve">DONE</w:t>
+            </w:r>
+          </w:p>
+        </w:tc>
+        <w:tc>
+          <w:tcPr/>
+          <w:p>
+            <w:pPr>
+              <w:pStyle w:val="Compact"/>
+              <w:jc w:val="left"/>
+            </w:pPr>
+            <w:r>
+              <w:t xml:space="preserve">À saisir</w:t>
+            </w:r>
+          </w:p>
+        </w:tc>
+        <w:tc>
+          <w:tcPr/>
+          <w:p>
+            <w:pPr>
+              <w:pStyle w:val="Compact"/>
+              <w:jc w:val="left"/>
+            </w:pPr>
+            <w:r>
+              <w:t xml:space="preserve">À saisir</w:t>
+            </w:r>
+          </w:p>
+        </w:tc>
+        <w:tc>
+          <w:tcPr/>
+          <w:p>
+            <w:pPr>
+              <w:pStyle w:val="Compact"/>
+              <w:jc w:val="left"/>
+            </w:pPr>
+            <w:r>
+              <w:t xml:space="preserve">À saisir</w:t>
+            </w:r>
+          </w:p>
+        </w:tc>
+        <w:tc>
+          <w:tcPr/>
+          <w:p>
+            <w:pPr>
+              <w:pStyle w:val="Compact"/>
+              <w:jc w:val="left"/>
+            </w:pPr>
+            <w:r>
+              <w:t xml:space="preserve">À saisir</w:t>
+            </w:r>
+          </w:p>
+        </w:tc>
+        <w:tc>
+          <w:tcPr/>
+          <w:p>
+            <w:pPr>
+              <w:pStyle w:val="Compact"/>
+              <w:jc w:val="left"/>
+            </w:pPr>
+            <w:r>
+              <w:t xml:space="preserve">À saisir</w:t>
+            </w:r>
+          </w:p>
+        </w:tc>
+      </w:tr>
+      <w:tr>
+        <w:tc>
+          <w:tcPr/>
+          <w:p>
+            <w:pPr>
+              <w:pStyle w:val="Compact"/>
+              <w:jc w:val="left"/>
+            </w:pPr>
+            <w:r>
+              <w:t xml:space="preserve">D4</w:t>
+            </w:r>
+          </w:p>
+        </w:tc>
+        <w:tc>
+          <w:tcPr/>
+          <w:p>
+            <w:pPr>
+              <w:pStyle w:val="Compact"/>
+              <w:jc w:val="left"/>
+            </w:pPr>
+            <w:r>
+              <w:t xml:space="preserve">WIP</w:t>
+            </w:r>
+          </w:p>
+        </w:tc>
+        <w:tc>
+          <w:tcPr/>
+          <w:p>
+            <w:pPr>
+              <w:pStyle w:val="Compact"/>
+              <w:jc w:val="left"/>
+            </w:pPr>
+            <w:r>
+              <w:t xml:space="preserve">À saisir</w:t>
+            </w:r>
+          </w:p>
+        </w:tc>
+        <w:tc>
+          <w:tcPr/>
+          <w:p>
+            <w:pPr>
+              <w:pStyle w:val="Compact"/>
+              <w:jc w:val="left"/>
+            </w:pPr>
+            <w:r>
+              <w:t xml:space="preserve">À saisir</w:t>
+            </w:r>
+          </w:p>
+        </w:tc>
+        <w:tc>
+          <w:tcPr/>
+          <w:p>
+            <w:pPr>
+              <w:pStyle w:val="Compact"/>
+              <w:jc w:val="left"/>
+            </w:pPr>
+            <w:r>
+              <w:t xml:space="preserve">À saisir</w:t>
+            </w:r>
+          </w:p>
+        </w:tc>
+        <w:tc>
+          <w:tcPr/>
+          <w:p>
+            <w:pPr>
+              <w:pStyle w:val="Compact"/>
+              <w:jc w:val="left"/>
+            </w:pPr>
+            <w:r>
+              <w:t xml:space="preserve">À saisir</w:t>
+            </w:r>
+          </w:p>
+        </w:tc>
+        <w:tc>
+          <w:tcPr/>
+          <w:p>
+            <w:pPr>
+              <w:pStyle w:val="Compact"/>
+              <w:jc w:val="left"/>
+            </w:pPr>
+            <w:r>
+              <w:t xml:space="preserve">À saisir</w:t>
+            </w:r>
+          </w:p>
+        </w:tc>
+      </w:tr>
+      <w:tr>
+        <w:tc>
+          <w:tcPr/>
+          <w:p>
+            <w:pPr>
+              <w:pStyle w:val="Compact"/>
+              <w:jc w:val="left"/>
+            </w:pPr>
+            <w:r>
+              <w:t xml:space="preserve">D5*</w:t>
+            </w:r>
+          </w:p>
+        </w:tc>
+        <w:tc>
+          <w:tcPr/>
+          <w:p>
+            <w:pPr>
+              <w:pStyle w:val="Compact"/>
+              <w:jc w:val="left"/>
+            </w:pPr>
+            <w:r>
+              <w:t xml:space="preserve">WIP</w:t>
+            </w:r>
+          </w:p>
+        </w:tc>
+        <w:tc>
+          <w:tcPr/>
+          <w:p>
+            <w:pPr>
+              <w:pStyle w:val="Compact"/>
+              <w:jc w:val="left"/>
+            </w:pPr>
+            <w:r>
+              <w:t xml:space="preserve">À saisir</w:t>
+            </w:r>
+          </w:p>
+        </w:tc>
+        <w:tc>
+          <w:tcPr/>
+          <w:p>
+            <w:pPr>
+              <w:pStyle w:val="Compact"/>
+              <w:jc w:val="left"/>
+            </w:pPr>
+            <w:r>
+              <w:t xml:space="preserve">À saisir</w:t>
+            </w:r>
+          </w:p>
+        </w:tc>
+        <w:tc>
+          <w:tcPr/>
+          <w:p>
+            <w:pPr>
+              <w:pStyle w:val="Compact"/>
+              <w:jc w:val="left"/>
+            </w:pPr>
+            <w:r>
+              <w:t xml:space="preserve">À saisir</w:t>
+            </w:r>
+          </w:p>
+        </w:tc>
+        <w:tc>
+          <w:tcPr/>
+          <w:p>
+            <w:pPr>
+              <w:pStyle w:val="Compact"/>
+              <w:jc w:val="left"/>
+            </w:pPr>
+            <w:r>
+              <w:t xml:space="preserve">À saisir</w:t>
+            </w:r>
+          </w:p>
+        </w:tc>
+        <w:tc>
+          <w:tcPr/>
+          <w:p>
+            <w:pPr>
+              <w:pStyle w:val="Compact"/>
+              <w:jc w:val="left"/>
+            </w:pPr>
+            <w:r>
+              <w:t xml:space="preserve">À saisir</w:t>
+            </w:r>
+          </w:p>
+        </w:tc>
+      </w:tr>
+      <w:tr>
+        <w:tc>
+          <w:tcPr/>
+          <w:p>
+            <w:pPr>
+              <w:pStyle w:val="Compact"/>
+              <w:jc w:val="left"/>
+            </w:pPr>
+            <w:r>
+              <w:t xml:space="preserve">P1</w:t>
+            </w:r>
+          </w:p>
+        </w:tc>
+        <w:tc>
+          <w:tcPr/>
+          <w:p>
+            <w:pPr>
+              <w:pStyle w:val="Compact"/>
+              <w:jc w:val="left"/>
+            </w:pPr>
+            <w:r>
+              <w:t xml:space="preserve">DONE</w:t>
+            </w:r>
+          </w:p>
+        </w:tc>
+        <w:tc>
+          <w:tcPr/>
+          <w:p>
+            <w:pPr>
+              <w:pStyle w:val="Compact"/>
+              <w:jc w:val="left"/>
+            </w:pPr>
+            <w:r>
+              <w:t xml:space="preserve">À saisir</w:t>
+            </w:r>
+          </w:p>
+        </w:tc>
+        <w:tc>
+          <w:tcPr/>
+          <w:p>
+            <w:pPr>
+              <w:pStyle w:val="Compact"/>
+              <w:jc w:val="left"/>
+            </w:pPr>
+            <w:r>
+              <w:t xml:space="preserve">À saisir</w:t>
+            </w:r>
+          </w:p>
+        </w:tc>
+        <w:tc>
+          <w:tcPr/>
+          <w:p>
+            <w:pPr>
+              <w:pStyle w:val="Compact"/>
+              <w:jc w:val="left"/>
+            </w:pPr>
+            <w:r>
+              <w:t xml:space="preserve">À saisir</w:t>
+            </w:r>
+          </w:p>
+        </w:tc>
+        <w:tc>
+          <w:tcPr/>
+          <w:p>
+            <w:pPr>
+              <w:pStyle w:val="Compact"/>
+              <w:jc w:val="left"/>
+            </w:pPr>
+            <w:r>
+              <w:t xml:space="preserve">À saisir</w:t>
+            </w:r>
+          </w:p>
+        </w:tc>
+        <w:tc>
+          <w:tcPr/>
+          <w:p>
+            <w:pPr>
+              <w:pStyle w:val="Compact"/>
+              <w:jc w:val="left"/>
+            </w:pPr>
+            <w:r>
+              <w:t xml:space="preserve">À saisir</w:t>
+            </w:r>
+          </w:p>
+        </w:tc>
+      </w:tr>
+      <w:tr>
+        <w:tc>
+          <w:tcPr/>
+          <w:p>
+            <w:pPr>
+              <w:pStyle w:val="Compact"/>
+              <w:jc w:val="left"/>
+            </w:pPr>
+            <w:r>
+              <w:t xml:space="preserve">P2</w:t>
+            </w:r>
+          </w:p>
+        </w:tc>
+        <w:tc>
+          <w:tcPr/>
+          <w:p>
+            <w:pPr>
+              <w:pStyle w:val="Compact"/>
+              <w:jc w:val="left"/>
+            </w:pPr>
+            <w:r>
+              <w:t xml:space="preserve">DONE</w:t>
+            </w:r>
+          </w:p>
+        </w:tc>
+        <w:tc>
+          <w:tcPr/>
+          <w:p>
+            <w:pPr>
+              <w:pStyle w:val="Compact"/>
+              <w:jc w:val="left"/>
+            </w:pPr>
+            <w:r>
+              <w:t xml:space="preserve">À saisir</w:t>
+            </w:r>
+          </w:p>
+        </w:tc>
+        <w:tc>
+          <w:tcPr/>
+          <w:p>
+            <w:pPr>
+              <w:pStyle w:val="Compact"/>
+              <w:jc w:val="left"/>
+            </w:pPr>
+            <w:r>
+              <w:t xml:space="preserve">À saisir</w:t>
+            </w:r>
+          </w:p>
+        </w:tc>
+        <w:tc>
+          <w:tcPr/>
+          <w:p>
+            <w:pPr>
+              <w:pStyle w:val="Compact"/>
+              <w:jc w:val="left"/>
+            </w:pPr>
+            <w:r>
+              <w:t xml:space="preserve">À saisir</w:t>
+            </w:r>
+          </w:p>
+        </w:tc>
+        <w:tc>
+          <w:tcPr/>
+          <w:p>
+            <w:pPr>
+              <w:pStyle w:val="Compact"/>
+              <w:jc w:val="left"/>
+            </w:pPr>
+            <w:r>
+              <w:t xml:space="preserve">À saisir</w:t>
+            </w:r>
+          </w:p>
+        </w:tc>
+        <w:tc>
+          <w:tcPr/>
+          <w:p>
+            <w:pPr>
+              <w:pStyle w:val="Compact"/>
+              <w:jc w:val="left"/>
+            </w:pPr>
+            <w:r>
+              <w:t xml:space="preserve">À saisir</w:t>
+            </w:r>
+          </w:p>
+        </w:tc>
+      </w:tr>
+      <w:tr>
+        <w:tc>
+          <w:tcPr/>
+          <w:p>
+            <w:pPr>
+              <w:pStyle w:val="Compact"/>
+              <w:jc w:val="left"/>
+            </w:pPr>
+            <w:r>
+              <w:t xml:space="preserve">R3</w:t>
+            </w:r>
+          </w:p>
+        </w:tc>
+        <w:tc>
+          <w:tcPr/>
+          <w:p>
+            <w:pPr>
+              <w:pStyle w:val="Compact"/>
+              <w:jc w:val="left"/>
+            </w:pPr>
+            <w:r>
+              <w:t xml:space="preserve">DONE</w:t>
+            </w:r>
+          </w:p>
+        </w:tc>
+        <w:tc>
+          <w:tcPr/>
+          <w:p>
+            <w:pPr>
+              <w:pStyle w:val="Compact"/>
+              <w:jc w:val="left"/>
+            </w:pPr>
+            <w:r>
+              <w:t xml:space="preserve">À saisir</w:t>
+            </w:r>
+          </w:p>
+        </w:tc>
+        <w:tc>
+          <w:tcPr/>
+          <w:p>
+            <w:pPr>
+              <w:pStyle w:val="Compact"/>
+              <w:jc w:val="left"/>
+            </w:pPr>
+            <w:r>
+              <w:t xml:space="preserve">À saisir</w:t>
+            </w:r>
+          </w:p>
+        </w:tc>
+        <w:tc>
+          <w:tcPr/>
+          <w:p>
+            <w:pPr>
+              <w:pStyle w:val="Compact"/>
+              <w:jc w:val="left"/>
+            </w:pPr>
+            <w:r>
+              <w:t xml:space="preserve">À saisir</w:t>
+            </w:r>
+          </w:p>
+        </w:tc>
+        <w:tc>
+          <w:tcPr/>
+          <w:p>
+            <w:pPr>
+              <w:pStyle w:val="Compact"/>
+              <w:jc w:val="left"/>
+            </w:pPr>
+            <w:r>
+              <w:t xml:space="preserve">À saisir</w:t>
+            </w:r>
+          </w:p>
+        </w:tc>
+        <w:tc>
+          <w:tcPr/>
+          <w:p>
+            <w:pPr>
+              <w:pStyle w:val="Compact"/>
+              <w:jc w:val="left"/>
+            </w:pPr>
+            <w:r>
+              <w:t xml:space="preserve">À saisir</w:t>
+            </w:r>
+          </w:p>
+        </w:tc>
+      </w:tr>
+      <w:tr>
+        <w:tc>
+          <w:tcPr/>
+          <w:p>
+            <w:pPr>
+              <w:pStyle w:val="Compact"/>
+              <w:jc w:val="left"/>
+            </w:pPr>
+            <w:r>
+              <w:t xml:space="preserve">R5*</w:t>
+            </w:r>
+          </w:p>
+        </w:tc>
+        <w:tc>
+          <w:tcPr/>
+          <w:p>
+            <w:pPr>
+              <w:pStyle w:val="Compact"/>
+              <w:jc w:val="left"/>
+            </w:pPr>
+            <w:r>
+              <w:t xml:space="preserve">WIP</w:t>
+            </w:r>
+          </w:p>
+        </w:tc>
+        <w:tc>
+          <w:tcPr/>
+          <w:p>
+            <w:pPr>
+              <w:pStyle w:val="Compact"/>
+              <w:jc w:val="left"/>
+            </w:pPr>
+            <w:r>
+              <w:t xml:space="preserve">À saisir</w:t>
+            </w:r>
+          </w:p>
+        </w:tc>
+        <w:tc>
+          <w:tcPr/>
+          <w:p>
+            <w:pPr>
+              <w:pStyle w:val="Compact"/>
+              <w:jc w:val="left"/>
+            </w:pPr>
+            <w:r>
+              <w:t xml:space="preserve">À saisir</w:t>
+            </w:r>
+          </w:p>
+        </w:tc>
+        <w:tc>
+          <w:tcPr/>
+          <w:p>
+            <w:pPr>
+              <w:pStyle w:val="Compact"/>
+              <w:jc w:val="left"/>
+            </w:pPr>
+            <w:r>
+              <w:t xml:space="preserve">À saisir</w:t>
+            </w:r>
+          </w:p>
+        </w:tc>
+        <w:tc>
+          <w:tcPr/>
+          <w:p>
+            <w:pPr>
+              <w:pStyle w:val="Compact"/>
+              <w:jc w:val="left"/>
+            </w:pPr>
+            <w:r>
+              <w:t xml:space="preserve">À saisir</w:t>
+            </w:r>
+          </w:p>
+        </w:tc>
+        <w:tc>
+          <w:tcPr/>
+          <w:p>
+            <w:pPr>
+              <w:pStyle w:val="Compact"/>
+              <w:jc w:val="left"/>
+            </w:pPr>
+            <w:r>
+              <w:t xml:space="preserve">À saisir</w:t>
+            </w:r>
+          </w:p>
+        </w:tc>
+      </w:tr>
+      <w:tr>
+        <w:tc>
+          <w:tcPr/>
+          <w:p>
+            <w:pPr>
+              <w:pStyle w:val="Compact"/>
+              <w:jc w:val="left"/>
+            </w:pPr>
+            <w:r>
+              <w:t xml:space="preserve">R6*</w:t>
+            </w:r>
+          </w:p>
+        </w:tc>
+        <w:tc>
+          <w:tcPr/>
+          <w:p>
+            <w:pPr>
+              <w:pStyle w:val="Compact"/>
+              <w:jc w:val="left"/>
+            </w:pPr>
+            <w:r>
+              <w:t xml:space="preserve">BLOCKED</w:t>
+            </w:r>
+          </w:p>
+        </w:tc>
+        <w:tc>
+          <w:tcPr/>
+          <w:p>
+            <w:pPr>
+              <w:pStyle w:val="Compact"/>
+              <w:jc w:val="left"/>
+            </w:pPr>
+            <w:r>
+              <w:t xml:space="preserve">À saisir</w:t>
+            </w:r>
+          </w:p>
+        </w:tc>
+        <w:tc>
+          <w:tcPr/>
+          <w:p>
+            <w:pPr>
+              <w:pStyle w:val="Compact"/>
+              <w:jc w:val="left"/>
+            </w:pPr>
+            <w:r>
+              <w:t xml:space="preserve">À saisir</w:t>
+            </w:r>
+          </w:p>
+        </w:tc>
+        <w:tc>
+          <w:tcPr/>
+          <w:p>
+            <w:pPr>
+              <w:pStyle w:val="Compact"/>
+              <w:jc w:val="left"/>
+            </w:pPr>
+            <w:r>
+              <w:t xml:space="preserve">À saisir</w:t>
+            </w:r>
+          </w:p>
+        </w:tc>
+        <w:tc>
+          <w:tcPr/>
+          <w:p>
+            <w:pPr>
+              <w:pStyle w:val="Compact"/>
+              <w:jc w:val="left"/>
+            </w:pPr>
+            <w:r>
+              <w:t xml:space="preserve">À saisir</w:t>
+            </w:r>
+          </w:p>
+        </w:tc>
+        <w:tc>
+          <w:tcPr/>
+          <w:p>
+            <w:pPr>
+              <w:pStyle w:val="Compact"/>
+              <w:jc w:val="left"/>
+            </w:pPr>
+            <w:r>
+              <w:t xml:space="preserve">À saisir</w:t>
+            </w:r>
+          </w:p>
+        </w:tc>
+      </w:tr>
+      <w:tr>
+        <w:tc>
+          <w:tcPr/>
+          <w:p>
+            <w:pPr>
+              <w:pStyle w:val="Compact"/>
+              <w:jc w:val="left"/>
+            </w:pPr>
+            <w:r>
+              <w:t xml:space="preserve">A3*</w:t>
+            </w:r>
+          </w:p>
+        </w:tc>
+        <w:tc>
+          <w:tcPr/>
+          <w:p>
+            <w:pPr>
+              <w:pStyle w:val="Compact"/>
+              <w:jc w:val="left"/>
+            </w:pPr>
+            <w:r>
+              <w:t xml:space="preserve">BLOCKED</w:t>
+            </w:r>
+          </w:p>
+        </w:tc>
+        <w:tc>
+          <w:tcPr/>
+          <w:p>
+            <w:pPr>
+              <w:pStyle w:val="Compact"/>
+              <w:jc w:val="left"/>
+            </w:pPr>
+            <w:r>
+              <w:t xml:space="preserve">À saisir</w:t>
+            </w:r>
+          </w:p>
+        </w:tc>
+        <w:tc>
+          <w:tcPr/>
+          <w:p>
+            <w:pPr>
+              <w:pStyle w:val="Compact"/>
+              <w:jc w:val="left"/>
+            </w:pPr>
+            <w:r>
+              <w:t xml:space="preserve">À saisir</w:t>
+            </w:r>
+          </w:p>
+        </w:tc>
+        <w:tc>
+          <w:tcPr/>
+          <w:p>
+            <w:pPr>
+              <w:pStyle w:val="Compact"/>
+              <w:jc w:val="left"/>
+            </w:pPr>
+            <w:r>
+              <w:t xml:space="preserve">À saisir</w:t>
+            </w:r>
+          </w:p>
+        </w:tc>
+        <w:tc>
+          <w:tcPr/>
+          <w:p>
+            <w:pPr>
+              <w:pStyle w:val="Compact"/>
+              <w:jc w:val="left"/>
+            </w:pPr>
+            <w:r>
+              <w:t xml:space="preserve">À saisir</w:t>
+            </w:r>
+          </w:p>
+        </w:tc>
+        <w:tc>
+          <w:tcPr/>
+          <w:p>
+            <w:pPr>
+              <w:pStyle w:val="Compact"/>
+              <w:jc w:val="left"/>
+            </w:pPr>
+            <w:r>
+              <w:t xml:space="preserve">À saisir</w:t>
+            </w:r>
+          </w:p>
+        </w:tc>
+      </w:tr>
+      <w:tr>
+        <w:tc>
+          <w:tcPr/>
+          <w:p>
+            <w:pPr>
+              <w:pStyle w:val="Compact"/>
+              <w:jc w:val="left"/>
+            </w:pPr>
+            <w:r>
+              <w:t xml:space="preserve">AI3*</w:t>
+            </w:r>
+          </w:p>
+        </w:tc>
+        <w:tc>
+          <w:tcPr/>
+          <w:p>
+            <w:pPr>
+              <w:pStyle w:val="Compact"/>
+              <w:jc w:val="left"/>
+            </w:pPr>
+            <w:r>
+              <w:t xml:space="preserve">WIP</w:t>
+            </w:r>
+          </w:p>
+        </w:tc>
+        <w:tc>
+          <w:tcPr/>
+          <w:p>
+            <w:pPr>
+              <w:pStyle w:val="Compact"/>
+              <w:jc w:val="left"/>
+            </w:pPr>
+            <w:r>
+              <w:t xml:space="preserve">À saisir</w:t>
+            </w:r>
+          </w:p>
+        </w:tc>
+        <w:tc>
+          <w:tcPr/>
+          <w:p>
+            <w:pPr>
+              <w:pStyle w:val="Compact"/>
+              <w:jc w:val="left"/>
+            </w:pPr>
+            <w:r>
+              <w:t xml:space="preserve">À saisir</w:t>
+            </w:r>
+          </w:p>
+        </w:tc>
+        <w:tc>
+          <w:tcPr/>
+          <w:p>
+            <w:pPr>
+              <w:pStyle w:val="Compact"/>
+              <w:jc w:val="left"/>
+            </w:pPr>
+            <w:r>
+              <w:t xml:space="preserve">À saisir</w:t>
+            </w:r>
+          </w:p>
+        </w:tc>
+        <w:tc>
+          <w:tcPr/>
+          <w:p>
+            <w:pPr>
+              <w:pStyle w:val="Compact"/>
+              <w:jc w:val="left"/>
+            </w:pPr>
+            <w:r>
+              <w:t xml:space="preserve">À saisir</w:t>
+            </w:r>
+          </w:p>
+        </w:tc>
+        <w:tc>
+          <w:tcPr/>
+          <w:p>
+            <w:pPr>
+              <w:pStyle w:val="Compact"/>
+              <w:jc w:val="left"/>
+            </w:pPr>
+            <w:r>
+              <w:t xml:space="preserve">À saisir</w:t>
+            </w:r>
+          </w:p>
+        </w:tc>
+      </w:tr>
+    </w:tbl>
     <w:p>
       <w:pPr>
         <w:pStyle w:val="BodyText"/>
       </w:pPr>
       <w:r>
-        <w:t xml:space="preserve">C2 : Filtrage | DONE | Prix inclusifs, cuisines, type ; RestaurantFilterTest et RestaurantServiceTest. | Constructeur court de RestaurantService inutilisable pour findRestaurants (dépendances nulles). | Oui |</w:t>
-      </w:r>
-    </w:p>
-    <w:p>
-      <w:pPr>
-        <w:pStyle w:val="BodyText"/>
-      </w:pPr>
-      <w:r>
-        <w:t xml:space="preserve">C4 : Commandes précédentes | WIP | findByUserId ; classement par nombre de commandes non annulées. | D0 : consulter l’historique ; repository présent, mais pas de façade getOrderHistory ni de test de consultation dédié. | Oui |</w:t>
-      </w:r>
-    </w:p>
-    <w:p>
-      <w:pPr>
-        <w:pStyle w:val="BodyText"/>
-      </w:pPr>
-      <w:r>
-        <w:t xml:space="preserve">C5 : Panier / commande | WIP | Fusion des quantités ; stockage du panier ; lieu et horaire de livraison. | Pas de contrôle du changement de restaurant d’un panier existant ; stock non décrémenté. | Oui |</w:t>
-      </w:r>
-    </w:p>
-    <w:p>
-      <w:pPr>
-        <w:pStyle w:val="BodyText"/>
-      </w:pPr>
-      <w:r>
-        <w:t xml:space="preserve">C6 : Validation | WIP | Refus du panier vide, lieu/horaire inconnus, plat indisponible sur le parcours avec livraison. | createOrder sans livraison ne contrôle pas disponibilité/stock ; pas de validation utilisateur dans OrderService. | Non |</w:t>
-      </w:r>
-    </w:p>
-    <w:p>
-      <w:pPr>
-        <w:pStyle w:val="BodyText"/>
-      </w:pPr>
-      <w:r>
-        <w:t xml:space="preserve">D1 : Connexion livraison | WIP | Gateway injectable ; requête validée ; exception convertie en échec. | Adaptateur simulé ; earliest ready time R5* et créneaux retournés par le fournisseur absents. | Oui |</w:t>
-      </w:r>
-    </w:p>
-    <w:p>
-      <w:pPr>
-        <w:pStyle w:val="BodyText"/>
-      </w:pPr>
-      <w:r>
-        <w:t xml:space="preserve">D3 : Référence livraison | DONE | Référence D-UUID ; DeliveryInfo sauvegardé après succès. | Pas de garde d’idempotence ni de validation d’une référence retournée vide. | Oui |</w:t>
-      </w:r>
-    </w:p>
-    <w:p>
-      <w:pPr>
-        <w:pStyle w:val="BodyText"/>
-      </w:pPr>
-      <w:r>
-        <w:t xml:space="preserve">D4 : Suivi livraison | WIP | ACCEPTED / IN_TRANSIT / DELIVERED ; commande synchronisée. | D0 : 8 statuts et historique horodaté ; seuls 4 statuts présents, sans historique. | Oui |</w:t>
-      </w:r>
-    </w:p>
-    <w:p>
-      <w:pPr>
-        <w:pStyle w:val="BodyText"/>
-      </w:pPr>
-      <w:r>
-        <w:t xml:space="preserve">D5* : Incidents | WIP | FAILED et motif ; commande conservée PAID/READY. | Aucun scénario actif d’incident ; pas de remboursement / relivraison. | Oui |</w:t>
-      </w:r>
-    </w:p>
-    <w:p>
-      <w:pPr>
-        <w:pStyle w:val="BodyText"/>
-      </w:pPr>
-      <w:r>
-        <w:t xml:space="preserve">P1 : Paiement | DONE | Paiement simulé et crédit ; refus, exception, réponse nulle testés. | Pas de banque réelle ; paiement répété non interdit. | Oui |</w:t>
-      </w:r>
-    </w:p>
-    <w:p>
-      <w:pPr>
-        <w:pStyle w:val="BodyText"/>
-      </w:pPr>
-      <w:r>
-        <w:t xml:space="preserve">P2 : Enregistrement | DONE | Commande PENDING avec lignes, total, lieu et horaire. | Stockage volatil ; absence de transaction avec consommation de capacité. | Oui |</w:t>
-      </w:r>
-    </w:p>
-    <w:p>
-      <w:pPr>
-        <w:pStyle w:val="BodyText"/>
-      </w:pPr>
-      <w:r>
-        <w:t xml:space="preserve">R3 : Gestion plats | DONE | Ajout / modification nom et description ; doublon et champs vides refusés. | Pas de contrôle d’autorisation restaurateur ; feature R3 vide. | Oui |</w:t>
-      </w:r>
-    </w:p>
-    <w:p>
-      <w:pPr>
-        <w:pStyle w:val="BodyText"/>
-      </w:pPr>
-      <w:r>
-        <w:t xml:space="preserve">R5* : Capacités / temps | WIP | Capacité par TimeSlot, décrément, refus si pleine. | Pas d’atomicité, restitution après échec, estimation du temps ou réservation avancée. | Non |</w:t>
-      </w:r>
-    </w:p>
-    <w:p>
-      <w:pPr>
-        <w:pStyle w:val="BodyText"/>
-      </w:pPr>
-      <w:r>
-        <w:t xml:space="preserve">R6* : Offres | BLOCKED | Aucune implémentation identifiée. | Pas de modèle promotion ni règle de remise. | Non |</w:t>
-      </w:r>
-    </w:p>
-    <w:p>
-      <w:pPr>
-        <w:pStyle w:val="BodyText"/>
-      </w:pPr>
-      <w:r>
-        <w:t xml:space="preserve">A3* : Supervision | BLOCKED | Statut unitaire disponible dans DeliveryInfo. | Pas de tableau de supervision, agrégation ni service administrateur. | Non |</w:t>
-      </w:r>
-    </w:p>
-    <w:p>
-      <w:pPr>
-        <w:pStyle w:val="BodyText"/>
-      </w:pPr>
-      <w:r>
-        <w:t xml:space="preserve">AI3* : Recommandations | WIP | Premier ajout, filtrage, déduplication, repli si panne. | Diversité minimale D0 non contrôlée ; IA simulée ; code de recommandation dupliqué. | Oui |</w:t>
-      </w:r>
-    </w:p>
-    <w:bookmarkEnd w:id="22"/>
-    <w:bookmarkStart w:id="23" w:name="périmètre-de-compétence"/>
+        <w:t xml:space="preserve">À vérifier avant dépôt : chaque colonne utilise une fois chacun des rangs 1 à 15 ; les réponses reflètent la maîtrise réelle du membre, indépendamment de l’exigence dont il est référent.</w:t>
+      </w:r>
+    </w:p>
+    <w:bookmarkEnd w:id="24"/>
+    <w:bookmarkStart w:id="29" w:name="conception-uml-du-cœur-fonctionnel"/>
     <w:p>
       <w:pPr>
         <w:pStyle w:val="Heading2"/>
       </w:pPr>
       <w:r>
-        <w:t xml:space="preserve">2. Périmètre de compétence</w:t>
-      </w:r>
-    </w:p>
-    <w:p>
-      <w:pPr>
-        <w:pStyle w:val="FirstParagraph"/>
-      </w:pPr>
-      <w:r>
-        <w:t xml:space="preserve">Les cinq membres doivent classer les 15 exigences : chaque colonne doit être une permutation de 1 à 15, de la moins maîtrisée à la mieux maîtrisée. Le classement individuel ne mesure ni le nombre de commits ni le rôle déclaré ; il doit être renseigné personnellement.</w:t>
-      </w:r>
-    </w:p>
-    <w:p>
-      <w:pPr>
-        <w:pStyle w:val="BodyText"/>
-      </w:pPr>
-      <w:r>
-        <w:t xml:space="preserve">Les colonnes suivent l’ordre alphabétique des noms du D0 : ADJEGAN, ATI-ATCHA, LOUBARIS, MOROU, TSOULI. Aucune auto-évaluation n’a été déduite du code ; chaque membre doit renseigner sa propre colonne.</w:t>
-      </w:r>
-    </w:p>
-    <w:p>
-      <w:pPr>
-        <w:pStyle w:val="BodyText"/>
-      </w:pPr>
-      <w:r>
-        <w:t xml:space="preserve">Exigence | État | ADJEGAN Justice | ATI-ATCHA Wahid | LOUBARIS Adam | MOROU E. Fadilou | TSOULI Younes |</w:t>
-      </w:r>
-    </w:p>
-    <w:p>
-      <w:pPr>
-        <w:pStyle w:val="BodyText"/>
-      </w:pPr>
-      <w:r>
-        <w:t xml:space="preserve">— | — | — | — | — | — | — |</w:t>
-      </w:r>
-    </w:p>
-    <w:p>
-      <w:pPr>
-        <w:pStyle w:val="BodyText"/>
-      </w:pPr>
-      <w:r>
-        <w:t xml:space="preserve">C2 | DONE | À saisir | À saisir | À saisir | À saisir | À saisir |</w:t>
-      </w:r>
-    </w:p>
-    <w:p>
-      <w:pPr>
-        <w:pStyle w:val="BodyText"/>
-      </w:pPr>
-      <w:r>
-        <w:t xml:space="preserve">C4 | WIP | À saisir | À saisir | À saisir | À saisir | À saisir |</w:t>
-      </w:r>
-    </w:p>
-    <w:p>
-      <w:pPr>
-        <w:pStyle w:val="BodyText"/>
-      </w:pPr>
-      <w:r>
-        <w:t xml:space="preserve">C5 | WIP | À saisir | À saisir | À saisir | À saisir | À saisir |</w:t>
-      </w:r>
-    </w:p>
-    <w:p>
-      <w:pPr>
-        <w:pStyle w:val="BodyText"/>
-      </w:pPr>
-      <w:r>
-        <w:t xml:space="preserve">C6 | WIP | À saisir | À saisir | À saisir | À saisir | À saisir |</w:t>
-      </w:r>
-    </w:p>
-    <w:p>
-      <w:pPr>
-        <w:pStyle w:val="BodyText"/>
-      </w:pPr>
-      <w:r>
-        <w:t xml:space="preserve">D1 | WIP | À saisir | À saisir | À saisir | À saisir | À saisir |</w:t>
-      </w:r>
-    </w:p>
-    <w:p>
-      <w:pPr>
-        <w:pStyle w:val="BodyText"/>
-      </w:pPr>
-      <w:r>
-        <w:t xml:space="preserve">D3 | DONE | À saisir | À saisir | À saisir | À saisir | À saisir |</w:t>
-      </w:r>
-    </w:p>
-    <w:p>
-      <w:pPr>
-        <w:pStyle w:val="BodyText"/>
-      </w:pPr>
-      <w:r>
-        <w:t xml:space="preserve">D4 | WIP | À saisir | À saisir | À saisir | À saisir | À saisir |</w:t>
-      </w:r>
-    </w:p>
-    <w:p>
-      <w:pPr>
-        <w:pStyle w:val="BodyText"/>
-      </w:pPr>
-      <w:r>
-        <w:t xml:space="preserve">D5* | WIP | À saisir | À saisir | À saisir | À saisir | À saisir |</w:t>
-      </w:r>
-    </w:p>
-    <w:p>
-      <w:pPr>
-        <w:pStyle w:val="BodyText"/>
-      </w:pPr>
-      <w:r>
-        <w:t xml:space="preserve">P1 | DONE | À saisir | À saisir | À saisir | À saisir | À saisir |</w:t>
-      </w:r>
-    </w:p>
-    <w:p>
-      <w:pPr>
-        <w:pStyle w:val="BodyText"/>
-      </w:pPr>
-      <w:r>
-        <w:t xml:space="preserve">P2 | DONE | À saisir | À saisir | À saisir | À saisir | À saisir |</w:t>
-      </w:r>
-    </w:p>
-    <w:p>
-      <w:pPr>
-        <w:pStyle w:val="BodyText"/>
-      </w:pPr>
-      <w:r>
-        <w:t xml:space="preserve">R3 | DONE | À saisir | À saisir | À saisir | À saisir | À saisir |</w:t>
-      </w:r>
-    </w:p>
-    <w:p>
-      <w:pPr>
-        <w:pStyle w:val="BodyText"/>
-      </w:pPr>
-      <w:r>
-        <w:t xml:space="preserve">R5* | WIP | À saisir | À saisir | À saisir | À saisir | À saisir |</w:t>
-      </w:r>
-    </w:p>
-    <w:p>
-      <w:pPr>
-        <w:pStyle w:val="BodyText"/>
-      </w:pPr>
-      <w:r>
-        <w:t xml:space="preserve">R6* | BLOCKED | À saisir | À saisir | À saisir | À saisir | À saisir |</w:t>
-      </w:r>
-    </w:p>
-    <w:p>
-      <w:pPr>
-        <w:pStyle w:val="BodyText"/>
-      </w:pPr>
-      <w:r>
-        <w:t xml:space="preserve">A3* | BLOCKED | À saisir | À saisir | À saisir | À saisir | À saisir |</w:t>
-      </w:r>
-    </w:p>
-    <w:p>
-      <w:pPr>
-        <w:pStyle w:val="BodyText"/>
-      </w:pPr>
-      <w:r>
-        <w:t xml:space="preserve">AI3* | WIP | À saisir | À saisir | À saisir | À saisir | À saisir |</w:t>
-      </w:r>
-    </w:p>
-    <w:p>
-      <w:pPr>
-        <w:pStyle w:val="BodyText"/>
-      </w:pPr>
-      <w:r>
-        <w:t xml:space="preserve">À vérifier avant dépôt : chaque colonne utilise une fois chacun des rangs 1 à 15 ; les réponses reflètent la maîtrise réelle du membre, indépendamment de l’exigence dont il est référent.</w:t>
-      </w:r>
-    </w:p>
-    <w:bookmarkEnd w:id="23"/>
-    <w:bookmarkStart w:id="28" w:name="conception-uml-du-cœur-fonctionnel"/>
-    <w:p>
-      <w:pPr>
-        <w:pStyle w:val="Heading2"/>
-      </w:pPr>
-      <w:r>
         <w:t xml:space="preserve">3. Conception UML du cœur fonctionnel</w:t>
       </w:r>
     </w:p>
-    <w:bookmarkStart w:id="27" w:name="diagramme-de-cas-dutilisation-global"/>
+    <w:bookmarkStart w:id="28" w:name="diagramme-de-cas-dutilisation-global"/>
     <w:p>
       <w:pPr>
         <w:pStyle w:val="Heading3"/>
@@ -563,18 +2906,18 @@
           <wp:inline>
             <wp:extent cx="5334000" cy="5868189"/>
             <wp:effectExtent b="0" l="0" r="0" t="0"/>
-            <wp:docPr descr="Diagramme cas-utilisation" title="" id="25" name="Picture"/>
+            <wp:docPr descr="Diagramme cas-utilisation" title="" id="26" name="Picture"/>
             <a:graphic>
               <a:graphicData uri="http://schemas.openxmlformats.org/drawingml/2006/picture">
                 <pic:pic>
                   <pic:nvPicPr>
-                    <pic:cNvPr descr="uml/cas-utilisation.png" id="26" name="Picture"/>
+                    <pic:cNvPr descr="uml/cas-utilisation.png" id="27" name="Picture"/>
                     <pic:cNvPicPr>
                       <a:picLocks noChangeArrowheads="1" noChangeAspect="1"/>
                     </pic:cNvPicPr>
                   </pic:nvPicPr>
                   <pic:blipFill>
-                    <a:blip r:embed="rId24"/>
+                    <a:blip r:embed="rId25"/>
                     <a:stretch>
                       <a:fillRect/>
                     </a:stretch>
@@ -617,9 +2960,9 @@
         <w:t xml:space="preserve">Violet : exigences stratégiques. R6* et A3* sont montrées comme fonctions attendues absentes. C4 est limité au classement par historique ; AI3* est une extension déclenchée au premier ajout au panier.</w:t>
       </w:r>
     </w:p>
-    <w:bookmarkEnd w:id="27"/>
     <w:bookmarkEnd w:id="28"/>
-    <w:bookmarkStart w:id="38" w:name="diagrammes-de-classes-du-cœur"/>
+    <w:bookmarkEnd w:id="29"/>
+    <w:bookmarkStart w:id="39" w:name="diagrammes-de-classes-du-cœur"/>
     <w:p>
       <w:pPr>
         <w:pStyle w:val="Heading2"/>
@@ -637,18 +2980,18 @@
           <wp:inline>
             <wp:extent cx="5334000" cy="2383959"/>
             <wp:effectExtent b="0" l="0" r="0" t="0"/>
-            <wp:docPr descr="Diagramme coeur" title="" id="30" name="Picture"/>
+            <wp:docPr descr="Diagramme coeur" title="" id="31" name="Picture"/>
             <a:graphic>
               <a:graphicData uri="http://schemas.openxmlformats.org/drawingml/2006/picture">
                 <pic:pic>
                   <pic:nvPicPr>
-                    <pic:cNvPr descr="uml/coeur.png" id="31" name="Picture"/>
+                    <pic:cNvPr descr="uml/coeur.png" id="32" name="Picture"/>
                     <pic:cNvPicPr>
                       <a:picLocks noChangeArrowheads="1" noChangeAspect="1"/>
                     </pic:cNvPicPr>
                   </pic:nvPicPr>
                   <pic:blipFill>
-                    <a:blip r:embed="rId29"/>
+                    <a:blip r:embed="rId30"/>
                     <a:stretch>
                       <a:fillRect/>
                     </a:stretch>
@@ -692,18 +3035,18 @@
           <wp:inline>
             <wp:extent cx="5334000" cy="1100137"/>
             <wp:effectExtent b="0" l="0" r="0" t="0"/>
-            <wp:docPr descr="Diagramme frontieres" title="" id="33" name="Picture"/>
+            <wp:docPr descr="Diagramme frontieres" title="" id="34" name="Picture"/>
             <a:graphic>
               <a:graphicData uri="http://schemas.openxmlformats.org/drawingml/2006/picture">
                 <pic:pic>
                   <pic:nvPicPr>
-                    <pic:cNvPr descr="uml/frontieres.png" id="34" name="Picture"/>
+                    <pic:cNvPr descr="uml/frontieres.png" id="35" name="Picture"/>
                     <pic:cNvPicPr>
                       <a:picLocks noChangeArrowheads="1" noChangeAspect="1"/>
                     </pic:cNvPicPr>
                   </pic:nvPicPr>
                   <pic:blipFill>
-                    <a:blip r:embed="rId32"/>
+                    <a:blip r:embed="rId33"/>
                     <a:stretch>
                       <a:fillRect/>
                     </a:stretch>
@@ -747,18 +3090,18 @@
           <wp:inline>
             <wp:extent cx="5334000" cy="3705655"/>
             <wp:effectExtent b="0" l="0" r="0" t="0"/>
-            <wp:docPr descr="Diagramme modele" title="" id="36" name="Picture"/>
+            <wp:docPr descr="Diagramme modele" title="" id="37" name="Picture"/>
             <a:graphic>
               <a:graphicData uri="http://schemas.openxmlformats.org/drawingml/2006/picture">
                 <pic:pic>
                   <pic:nvPicPr>
-                    <pic:cNvPr descr="uml/modele.png" id="37" name="Picture"/>
+                    <pic:cNvPr descr="uml/modele.png" id="38" name="Picture"/>
                     <pic:cNvPicPr>
                       <a:picLocks noChangeArrowheads="1" noChangeAspect="1"/>
                     </pic:cNvPicPr>
                   </pic:nvPicPr>
                   <pic:blipFill>
-                    <a:blip r:embed="rId35"/>
+                    <a:blip r:embed="rId36"/>
                     <a:stretch>
                       <a:fillRect/>
                     </a:stretch>
@@ -801,8 +3144,8 @@
         <w:t xml:space="preserve">Les interfaces des gateways constituent les points de branchement périphériques. R5* n’a pas de contrat autonome : OrderService lit et modifie directement la capacité de Restaurant. Ce couplage explique l’absence d’isolation fonctionnelle de R5*. Les noms courts représentent les classes réelles ; les implémentations répétitives des repositories sont omises pour la lisibilité.</w:t>
       </w:r>
     </w:p>
-    <w:bookmarkEnd w:id="38"/>
-    <w:bookmarkStart w:id="39" w:name="X14b4e3d5f51630a33aa3d63e7b3815c1218a219"/>
+    <w:bookmarkEnd w:id="39"/>
+    <w:bookmarkStart w:id="40" w:name="X14b4e3d5f51630a33aa3d63e7b3815c1218a219"/>
     <w:p>
       <w:pPr>
         <w:pStyle w:val="Heading2"/>
@@ -843,8 +3186,8 @@
         <w:t xml:space="preserve">Les classes nommées Adapter réalisent les contrats des gateways et permettent leur substitution. Elles ne traduisent pas une API incompatible réelle : aucun Adaptee externe n’est présent. Le patron GoF Adapter n’est donc pas formellement démontré ; il s’agit ici d’implémentations simulées de ports applicatifs. Le choix réduit la dépendance aux services tiers, mais ne prouve pas leur intégration réseau.</w:t>
       </w:r>
     </w:p>
-    <w:bookmarkEnd w:id="39"/>
-    <w:bookmarkStart w:id="43" w:name="Xfec03ce422be1579091617fa8eb59912d2efb58"/>
+    <w:bookmarkEnd w:id="40"/>
+    <w:bookmarkStart w:id="44" w:name="Xfec03ce422be1579091617fa8eb59912d2efb58"/>
     <w:p>
       <w:pPr>
         <w:pStyle w:val="Heading2"/>
@@ -862,18 +3205,18 @@
           <wp:inline>
             <wp:extent cx="5334000" cy="3973404"/>
             <wp:effectExtent b="0" l="0" r="0" t="0"/>
-            <wp:docPr descr="Diagramme sequence" title="" id="41" name="Picture"/>
+            <wp:docPr descr="Diagramme sequence" title="" id="42" name="Picture"/>
             <a:graphic>
               <a:graphicData uri="http://schemas.openxmlformats.org/drawingml/2006/picture">
                 <pic:pic>
                   <pic:nvPicPr>
-                    <pic:cNvPr descr="uml/sequence.png" id="42" name="Picture"/>
+                    <pic:cNvPr descr="uml/sequence.png" id="43" name="Picture"/>
                     <pic:cNvPicPr>
                       <a:picLocks noChangeArrowheads="1" noChangeAspect="1"/>
                     </pic:cNvPicPr>
                   </pic:nvPicPr>
                   <pic:blipFill>
-                    <a:blip r:embed="rId40"/>
+                    <a:blip r:embed="rId41"/>
                     <a:stretch>
                       <a:fillRect/>
                     </a:stretch>
@@ -916,8 +3259,8 @@
         <w:t xml:space="preserve">Scénario nominal reconstitué : recherche, premier ajout avec recommandation, validation avec livraison, paiement, demande puis suivi de livraison. Ce parcours est rapproché des UC2, UC4 et UC5 du D0, adaptés à l’architecture actuelle ; le texte TD1 n’étant pas joint, sa correspondance exacte reste à confirmer. Il ne s’agit pas d’un test bout en bout existant : les tests fournis valident ces opérations par sous-parcours. Les appels des gateways et des notifications sont simulés.</w:t>
       </w:r>
     </w:p>
-    <w:bookmarkEnd w:id="43"/>
-    <w:bookmarkStart w:id="47" w:name="X27ba99c9add4ea573d0e1303e171965406375ec"/>
+    <w:bookmarkEnd w:id="44"/>
+    <w:bookmarkStart w:id="48" w:name="X27ba99c9add4ea573d0e1303e171965406375ec"/>
     <w:p>
       <w:pPr>
         <w:pStyle w:val="Heading2"/>
@@ -926,7 +3269,7 @@
         <w:t xml:space="preserve">4. Qualité du code, tests et gestion de projet</w:t>
       </w:r>
     </w:p>
-    <w:bookmarkStart w:id="44" w:name="focus-sur-le-cœur-fonctionnel"/>
+    <w:bookmarkStart w:id="45" w:name="focus-sur-le-cœur-fonctionnel"/>
     <w:p>
       <w:pPr>
         <w:pStyle w:val="Heading3"/>
@@ -935,12 +3278,588 @@
         <w:t xml:space="preserve">4.1 Focus sur le cœur fonctionnel</w:t>
       </w:r>
     </w:p>
+    <w:tbl>
+      <w:tblPr>
+        <w:tblStyle w:val="Table"/>
+        <w:tblW w:type="pct" w:w="5000"/>
+        <w:jc w:val="left"/>
+        <w:tblLayout w:type="fixed"/>
+        <w:tblLook w:firstRow="1" w:lastRow="0" w:firstColumn="0" w:lastColumn="0" w:noHBand="0" w:noVBand="0" w:val="0020"/>
+      </w:tblPr>
+      <w:tblGrid>
+        <w:gridCol w:w="3960"/>
+        <w:gridCol w:w="3960"/>
+      </w:tblGrid>
+      <w:tr>
+        <w:trPr>
+          <w:tblHeader w:val="on"/>
+        </w:trPr>
+        <w:tc>
+          <w:tcPr/>
+          <w:p>
+            <w:pPr>
+              <w:pStyle w:val="Compact"/>
+              <w:jc w:val="left"/>
+            </w:pPr>
+            <w:r>
+              <w:t xml:space="preserve">Indicateur demandé</w:t>
+            </w:r>
+          </w:p>
+        </w:tc>
+        <w:tc>
+          <w:tcPr/>
+          <w:p>
+            <w:pPr>
+              <w:pStyle w:val="Compact"/>
+              <w:jc w:val="left"/>
+            </w:pPr>
+            <w:r>
+              <w:t xml:space="preserve">Preuve disponible</w:t>
+            </w:r>
+          </w:p>
+        </w:tc>
+      </w:tr>
+      <w:tr>
+        <w:tc>
+          <w:tcPr/>
+          <w:p>
+            <w:pPr>
+              <w:pStyle w:val="Compact"/>
+              <w:jc w:val="left"/>
+            </w:pPr>
+            <w:r>
+              <w:t xml:space="preserve">Nombre de tests unitaires JUnit (SonarQube)</w:t>
+            </w:r>
+          </w:p>
+        </w:tc>
+        <w:tc>
+          <w:tcPr/>
+          <w:p>
+            <w:pPr>
+              <w:pStyle w:val="Compact"/>
+              <w:jc w:val="left"/>
+            </w:pPr>
+            <w:r>
+              <w:t xml:space="preserve">Non fourni. Surefire compte 93 tests JUnit, mêlant tests unitaires et intégration ; ce total ne prouve pas le nombre de tests purement unitaires.</w:t>
+            </w:r>
+          </w:p>
+        </w:tc>
+      </w:tr>
+      <w:tr>
+        <w:tc>
+          <w:tcPr/>
+          <w:p>
+            <w:pPr>
+              <w:pStyle w:val="Compact"/>
+              <w:jc w:val="left"/>
+            </w:pPr>
+            <w:r>
+              <w:t xml:space="preserve">Couverture du cœur (SonarQube)</w:t>
+            </w:r>
+          </w:p>
+        </w:tc>
+        <w:tc>
+          <w:tcPr/>
+          <w:p>
+            <w:pPr>
+              <w:pStyle w:val="Compact"/>
+              <w:jc w:val="left"/>
+            </w:pPr>
+            <w:r>
+              <w:t xml:space="preserve">Non fournie ; aucun taux de couverture vérifiable.</w:t>
+            </w:r>
+          </w:p>
+        </w:tc>
+      </w:tr>
+      <w:tr>
+        <w:tc>
+          <w:tcPr/>
+          <w:p>
+            <w:pPr>
+              <w:pStyle w:val="Compact"/>
+              <w:jc w:val="left"/>
+            </w:pPr>
+            <w:r>
+              <w:t xml:space="preserve">Capture SonarQube</w:t>
+            </w:r>
+          </w:p>
+        </w:tc>
+        <w:tc>
+          <w:tcPr/>
+          <w:p>
+            <w:pPr>
+              <w:pStyle w:val="Compact"/>
+              <w:jc w:val="left"/>
+            </w:pPr>
+            <w:r>
+              <w:t xml:space="preserve">Non fournie : preuve obligatoire à insérer ici.</w:t>
+            </w:r>
+          </w:p>
+        </w:tc>
+      </w:tr>
+    </w:tbl>
+    <w:p>
+      <w:pPr>
+        <w:pStyle w:val="BodyText"/>
+      </w:pPr>
+      <w:r>
+        <w:t xml:space="preserve">Validation Maven locale : 126 tests réussis (93 JUnit + 33 scénarios Cucumber), 0 échec, 0 erreur, 0 ignoré ; demo-1.0-SNAPSHOT.jar produit. Source : journal Maven et rapports Surefire de l’exécution locale.</w:t>
+      </w:r>
+    </w:p>
+    <w:bookmarkEnd w:id="45"/>
+    <w:bookmarkStart w:id="46" w:name="Xb14a40cd66e4fc100ab83771657a0a3aae85482"/>
+    <w:p>
+      <w:pPr>
+        <w:pStyle w:val="Heading3"/>
+      </w:pPr>
+      <w:r>
+        <w:t xml:space="preserve">4.2 Traçabilité des tests d’intégration étroits</w:t>
+      </w:r>
+    </w:p>
+    <w:tbl>
+      <w:tblPr>
+        <w:tblStyle w:val="Table"/>
+        <w:tblW w:type="pct" w:w="5000"/>
+        <w:jc w:val="left"/>
+        <w:tblLayout w:type="fixed"/>
+        <w:tblLook w:firstRow="1" w:lastRow="0" w:firstColumn="0" w:lastColumn="0" w:noHBand="0" w:noVBand="0" w:val="0020"/>
+      </w:tblPr>
+      <w:tblGrid>
+        <w:gridCol w:w="1980"/>
+        <w:gridCol w:w="1980"/>
+        <w:gridCol w:w="1980"/>
+        <w:gridCol w:w="1980"/>
+      </w:tblGrid>
+      <w:tr>
+        <w:trPr>
+          <w:tblHeader w:val="on"/>
+        </w:trPr>
+        <w:tc>
+          <w:tcPr/>
+          <w:p>
+            <w:pPr>
+              <w:pStyle w:val="Compact"/>
+              <w:jc w:val="left"/>
+            </w:pPr>
+            <w:r>
+              <w:t xml:space="preserve">Composant / fonctionnalité</w:t>
+            </w:r>
+          </w:p>
+        </w:tc>
+        <w:tc>
+          <w:tcPr/>
+          <w:p>
+            <w:pPr>
+              <w:pStyle w:val="Compact"/>
+              <w:jc w:val="left"/>
+            </w:pPr>
+            <w:r>
+              <w:t xml:space="preserve">Nombre de tests d’intégration étroits</w:t>
+            </w:r>
+          </w:p>
+        </w:tc>
+        <w:tc>
+          <w:tcPr/>
+          <w:p>
+            <w:pPr>
+              <w:pStyle w:val="Compact"/>
+              <w:jc w:val="left"/>
+            </w:pPr>
+            <w:r>
+              <w:t xml:space="preserve">Nom d’un test clé utilisant Mockito</w:t>
+            </w:r>
+          </w:p>
+        </w:tc>
+        <w:tc>
+          <w:tcPr/>
+          <w:p>
+            <w:pPr>
+              <w:pStyle w:val="Compact"/>
+              <w:jc w:val="left"/>
+            </w:pPr>
+            <w:r>
+              <w:t xml:space="preserve">Comportement testé</w:t>
+            </w:r>
+          </w:p>
+        </w:tc>
+      </w:tr>
+      <w:tr>
+        <w:tc>
+          <w:tcPr/>
+          <w:p>
+            <w:pPr>
+              <w:pStyle w:val="Compact"/>
+              <w:jc w:val="left"/>
+            </w:pPr>
+            <w:r>
+              <w:t xml:space="preserve">Delivery Service</w:t>
+            </w:r>
+          </w:p>
+        </w:tc>
+        <w:tc>
+          <w:tcPr/>
+          <w:p>
+            <w:pPr>
+              <w:pStyle w:val="Compact"/>
+              <w:jc w:val="left"/>
+            </w:pPr>
+            <w:r>
+              <w:t xml:space="preserve">3 scénarios BDD de livraison</w:t>
+            </w:r>
+          </w:p>
+        </w:tc>
+        <w:tc>
+          <w:tcPr/>
+          <w:p>
+            <w:pPr>
+              <w:pStyle w:val="Compact"/>
+              <w:jc w:val="left"/>
+            </w:pPr>
+            <w:r>
+              <w:t xml:space="preserve">Absent : scénarios sans Mockito</w:t>
+            </w:r>
+          </w:p>
+        </w:tc>
+        <w:tc>
+          <w:tcPr/>
+          <w:p>
+            <w:pPr>
+              <w:pStyle w:val="Compact"/>
+              <w:jc w:val="left"/>
+            </w:pPr>
+            <w:r>
+              <w:t xml:space="preserve">Nominal : transmission, suivi DELIVERED ; refus d’une commande impayée.</w:t>
+            </w:r>
+          </w:p>
+        </w:tc>
+      </w:tr>
+      <w:tr>
+        <w:tc>
+          <w:tcPr/>
+          <w:p>
+            <w:pPr>
+              <w:pStyle w:val="Compact"/>
+              <w:jc w:val="left"/>
+            </w:pPr>
+            <w:r>
+              <w:t xml:space="preserve">Payment Service</w:t>
+            </w:r>
+          </w:p>
+        </w:tc>
+        <w:tc>
+          <w:tcPr/>
+          <w:p>
+            <w:pPr>
+              <w:pStyle w:val="Compact"/>
+              <w:jc w:val="left"/>
+            </w:pPr>
+            <w:r>
+              <w:t xml:space="preserve">9 JUnit ProcessPaymentTest</w:t>
+            </w:r>
+          </w:p>
+        </w:tc>
+        <w:tc>
+          <w:tcPr/>
+          <w:p>
+            <w:pPr>
+              <w:pStyle w:val="Compact"/>
+              <w:jc w:val="left"/>
+            </w:pPr>
+            <w:r>
+              <w:t xml:space="preserve">ProcessPaymentTest.gatewayExceptionIsIsolatedAndDoesNotBreakFlow</w:t>
+            </w:r>
+          </w:p>
+        </w:tc>
+        <w:tc>
+          <w:tcPr/>
+          <w:p>
+            <w:pPr>
+              <w:pStyle w:val="Compact"/>
+              <w:jc w:val="left"/>
+            </w:pPr>
+            <w:r>
+              <w:t xml:space="preserve">Défaillance : exception du gateway → résultat d’échec, statut PENDING conservé.</w:t>
+            </w:r>
+          </w:p>
+        </w:tc>
+      </w:tr>
+      <w:tr>
+        <w:tc>
+          <w:tcPr/>
+          <w:p>
+            <w:pPr>
+              <w:pStyle w:val="Compact"/>
+              <w:jc w:val="left"/>
+            </w:pPr>
+            <w:r>
+              <w:t xml:space="preserve">AI Recommandation</w:t>
+            </w:r>
+          </w:p>
+        </w:tc>
+        <w:tc>
+          <w:tcPr/>
+          <w:p>
+            <w:pPr>
+              <w:pStyle w:val="Compact"/>
+              <w:jc w:val="left"/>
+            </w:pPr>
+            <w:r>
+              <w:t xml:space="preserve">15 JUnit ciblés : 7 panier + 8 recommandation</w:t>
+            </w:r>
+          </w:p>
+        </w:tc>
+        <w:tc>
+          <w:tcPr/>
+          <w:p>
+            <w:pPr>
+              <w:pStyle w:val="Compact"/>
+              <w:jc w:val="left"/>
+            </w:pPr>
+            <w:r>
+              <w:t xml:space="preserve">Absent : doublures lambda, pas Mockito</w:t>
+            </w:r>
+          </w:p>
+        </w:tc>
+        <w:tc>
+          <w:tcPr/>
+          <w:p>
+            <w:pPr>
+              <w:pStyle w:val="Compact"/>
+              <w:jc w:val="left"/>
+            </w:pPr>
+            <w:r>
+              <w:t xml:space="preserve">Nominal et panne : filtrage, tentative unique, repli sans bloquer la commande.</w:t>
+            </w:r>
+          </w:p>
+        </w:tc>
+      </w:tr>
+      <w:tr>
+        <w:tc>
+          <w:tcPr/>
+          <w:p>
+            <w:pPr>
+              <w:pStyle w:val="Compact"/>
+              <w:jc w:val="left"/>
+            </w:pPr>
+            <w:r>
+              <w:t xml:space="preserve">Capacities &amp; times</w:t>
+            </w:r>
+          </w:p>
+        </w:tc>
+        <w:tc>
+          <w:tcPr/>
+          <w:p>
+            <w:pPr>
+              <w:pStyle w:val="Compact"/>
+              <w:jc w:val="left"/>
+            </w:pPr>
+            <w:r>
+              <w:t xml:space="preserve">2 JUnit ciblés + 2 BDD ciblés</w:t>
+            </w:r>
+          </w:p>
+        </w:tc>
+        <w:tc>
+          <w:tcPr/>
+          <w:p>
+            <w:pPr>
+              <w:pStyle w:val="Compact"/>
+              <w:jc w:val="left"/>
+            </w:pPr>
+            <w:r>
+              <w:t xml:space="preserve">Absent : repositories en mémoire, pas Mockito</w:t>
+            </w:r>
+          </w:p>
+        </w:tc>
+        <w:tc>
+          <w:tcPr/>
+          <w:p>
+            <w:pPr>
+              <w:pStyle w:val="Compact"/>
+              <w:jc w:val="left"/>
+            </w:pPr>
+            <w:r>
+              <w:t xml:space="preserve">Nominal / saturation : configure le quota, refuse la commande au-delà.</w:t>
+            </w:r>
+          </w:p>
+        </w:tc>
+      </w:tr>
+      <w:tr>
+        <w:tc>
+          <w:tcPr/>
+          <w:p>
+            <w:pPr>
+              <w:pStyle w:val="Compact"/>
+              <w:jc w:val="left"/>
+            </w:pPr>
+            <w:r>
+              <w:t xml:space="preserve">Offers/Specials</w:t>
+            </w:r>
+          </w:p>
+        </w:tc>
+        <w:tc>
+          <w:tcPr/>
+          <w:p>
+            <w:pPr>
+              <w:pStyle w:val="Compact"/>
+              <w:jc w:val="left"/>
+            </w:pPr>
+            <w:r>
+              <w:t xml:space="preserve">0</w:t>
+            </w:r>
+          </w:p>
+        </w:tc>
+        <w:tc>
+          <w:tcPr/>
+          <w:p>
+            <w:pPr>
+              <w:pStyle w:val="Compact"/>
+              <w:jc w:val="left"/>
+            </w:pPr>
+            <w:r>
+              <w:t xml:space="preserve">Absent</w:t>
+            </w:r>
+          </w:p>
+        </w:tc>
+        <w:tc>
+          <w:tcPr/>
+          <w:p>
+            <w:pPr>
+              <w:pStyle w:val="Compact"/>
+              <w:jc w:val="left"/>
+            </w:pPr>
+            <w:r>
+              <w:t xml:space="preserve">Non implémenté.</w:t>
+            </w:r>
+          </w:p>
+        </w:tc>
+      </w:tr>
+      <w:tr>
+        <w:tc>
+          <w:tcPr/>
+          <w:p>
+            <w:pPr>
+              <w:pStyle w:val="Compact"/>
+              <w:jc w:val="left"/>
+            </w:pPr>
+            <w:r>
+              <w:t xml:space="preserve">Monitor delivery operations</w:t>
+            </w:r>
+          </w:p>
+        </w:tc>
+        <w:tc>
+          <w:tcPr/>
+          <w:p>
+            <w:pPr>
+              <w:pStyle w:val="Compact"/>
+              <w:jc w:val="left"/>
+            </w:pPr>
+            <w:r>
+              <w:t xml:space="preserve">0</w:t>
+            </w:r>
+          </w:p>
+        </w:tc>
+        <w:tc>
+          <w:tcPr/>
+          <w:p>
+            <w:pPr>
+              <w:pStyle w:val="Compact"/>
+              <w:jc w:val="left"/>
+            </w:pPr>
+            <w:r>
+              <w:t xml:space="preserve">Absent</w:t>
+            </w:r>
+          </w:p>
+        </w:tc>
+        <w:tc>
+          <w:tcPr/>
+          <w:p>
+            <w:pPr>
+              <w:pStyle w:val="Compact"/>
+              <w:jc w:val="left"/>
+            </w:pPr>
+            <w:r>
+              <w:t xml:space="preserve">Non implémenté.</w:t>
+            </w:r>
+          </w:p>
+        </w:tc>
+      </w:tr>
+    </w:tbl>
+    <w:p>
+      <w:pPr>
+        <w:pStyle w:val="BodyText"/>
+      </w:pPr>
+      <w:r>
+        <w:t xml:space="preserve">Comptage : tests de frontière ou de collaboration locale, sans service distant réel. Les 4 tests ExternalAIAdapterTest sont exclus (adaptateur seul), ainsi que les 2 tests de panier sur fusion des quantités et protection des listes (hors recommandation). Les tests généraux de validation de commande sont exclus du comptage des capacités. Les tests Mockito exigés restent manquants pour livraison, IA et capacités.</w:t>
+      </w:r>
+    </w:p>
+    <w:bookmarkEnd w:id="46"/>
+    <w:bookmarkStart w:id="47" w:name="gestion-de-projet-2-lignes"/>
+    <w:p>
+      <w:pPr>
+        <w:pStyle w:val="Heading3"/>
+      </w:pPr>
+      <w:r>
+        <w:t xml:space="preserve">4.3 Gestion de projet (2 lignes)</w:t>
+      </w:r>
+    </w:p>
     <w:p>
       <w:pPr>
         <w:pStyle w:val="FirstParagraph"/>
       </w:pPr>
       <w:r>
-        <w:t xml:space="preserve">Indicateur demandé | Preuve disponible |</w:t>
+        <w:t xml:space="preserve">Branche de travail : develop ; workflows configurés pour main et/ou develop.</w:t>
+      </w:r>
+      <w:r>
+        <w:t xml:space="preserve"> </w:t>
+      </w:r>
+      <w:r>
+        <w:t xml:space="preserve">Stratégie de branches, revues de PR et validation par un pair : à confirmer par l’équipe.</w:t>
+      </w:r>
+    </w:p>
+    <w:bookmarkEnd w:id="47"/>
+    <w:bookmarkEnd w:id="48"/>
+    <w:bookmarkStart w:id="58" w:name="d5-incidents-de-livraison"/>
+    <w:p>
+      <w:pPr>
+        <w:pStyle w:val="Heading2"/>
+      </w:pPr>
+      <w:r>
+        <w:t xml:space="preserve">5. D5* : Incidents de livraison</w:t>
+      </w:r>
+    </w:p>
+    <w:bookmarkStart w:id="49" w:name="étudiant-responsable"/>
+    <w:p>
+      <w:pPr>
+        <w:pStyle w:val="Heading3"/>
+      </w:pPr>
+      <w:r>
+        <w:t xml:space="preserve">5.1 Étudiant responsable</w:t>
+      </w:r>
+    </w:p>
+    <w:p>
+      <w:pPr>
+        <w:pStyle w:val="FirstParagraph"/>
+      </w:pPr>
+      <w:r>
+        <w:t xml:space="preserve">MOROU Essognina Fadilou : référent indiqué dans le D0 Team-J.</w:t>
+      </w:r>
+    </w:p>
+    <w:bookmarkEnd w:id="49"/>
+    <w:bookmarkStart w:id="50" w:name="stratégie-métier"/>
+    <w:p>
+      <w:pPr>
+        <w:pStyle w:val="Heading3"/>
+      </w:pPr>
+      <w:r>
+        <w:t xml:space="preserve">5.2 Stratégie métier</w:t>
+      </w:r>
+    </w:p>
+    <w:p>
+      <w:pPr>
+        <w:pStyle w:val="FirstParagraph"/>
+      </w:pPr>
+      <w:r>
+        <w:t xml:space="preserve">Conception observée : Le code représente une livraison échouée par DeliveryStatus.FAILED et un motif DeliveryIncident : NO_SHOW, UNREACHABLE ou CANCELLED_BY_COURIER. UpdateDeliveryStatus conserve l’état de commande PAID/READY ; il n’invente pas un nouvel OrderStatus pour un incident.</w:t>
       </w:r>
     </w:p>
     <w:p>
@@ -948,203 +3867,11 @@
         <w:pStyle w:val="BodyText"/>
       </w:pPr>
       <w:r>
-        <w:t xml:space="preserve">— | — |</w:t>
-      </w:r>
-    </w:p>
-    <w:p>
-      <w:pPr>
-        <w:pStyle w:val="BodyText"/>
-      </w:pPr>
-      <w:r>
-        <w:t xml:space="preserve">Nombre de tests unitaires JUnit (SonarQube) | Non fourni. Surefire compte 93 tests JUnit, mêlant tests unitaires et intégration ; ce total ne prouve pas le nombre de tests purement unitaires. |</w:t>
-      </w:r>
-    </w:p>
-    <w:p>
-      <w:pPr>
-        <w:pStyle w:val="BodyText"/>
-      </w:pPr>
-      <w:r>
-        <w:t xml:space="preserve">Couverture du cœur (SonarQube) | Non fournie ; aucun taux de couverture vérifiable. |</w:t>
-      </w:r>
-    </w:p>
-    <w:p>
-      <w:pPr>
-        <w:pStyle w:val="BodyText"/>
-      </w:pPr>
-      <w:r>
-        <w:t xml:space="preserve">Capture SonarQube | Non fournie : preuve obligatoire à insérer ici. |</w:t>
-      </w:r>
-    </w:p>
-    <w:p>
-      <w:pPr>
-        <w:pStyle w:val="BodyText"/>
-      </w:pPr>
-      <w:r>
-        <w:t xml:space="preserve">Validation Maven locale : 126 tests réussis (93 JUnit + 33 scénarios Cucumber), 0 échec, 0 erreur, 0 ignoré ; demo-1.0-SNAPSHOT.jar produit. Source : journal Maven et rapports Surefire de l’exécution locale.</w:t>
-      </w:r>
-    </w:p>
-    <w:bookmarkEnd w:id="44"/>
-    <w:bookmarkStart w:id="45" w:name="Xb14a40cd66e4fc100ab83771657a0a3aae85482"/>
-    <w:p>
-      <w:pPr>
-        <w:pStyle w:val="Heading3"/>
-      </w:pPr>
-      <w:r>
-        <w:t xml:space="preserve">4.2 Traçabilité des tests d’intégration étroits</w:t>
-      </w:r>
-    </w:p>
-    <w:p>
-      <w:pPr>
-        <w:pStyle w:val="FirstParagraph"/>
-      </w:pPr>
-      <w:r>
-        <w:t xml:space="preserve">Composant / fonctionnalité | Nombre de tests d’intégration étroits | Nom d’un test clé utilisant Mockito | Comportement testé |</w:t>
-      </w:r>
-    </w:p>
-    <w:p>
-      <w:pPr>
-        <w:pStyle w:val="BodyText"/>
-      </w:pPr>
-      <w:r>
-        <w:t xml:space="preserve">— | — | — | — |</w:t>
-      </w:r>
-    </w:p>
-    <w:p>
-      <w:pPr>
-        <w:pStyle w:val="BodyText"/>
-      </w:pPr>
-      <w:r>
-        <w:t xml:space="preserve">Delivery Service | 3 scénarios BDD de livraison | Absent : scénarios sans Mockito | Nominal : transmission, suivi DELIVERED ; refus d’une commande impayée. |</w:t>
-      </w:r>
-    </w:p>
-    <w:p>
-      <w:pPr>
-        <w:pStyle w:val="BodyText"/>
-      </w:pPr>
-      <w:r>
-        <w:t xml:space="preserve">Payment Service | 9 JUnit ProcessPaymentTest | ProcessPaymentTest.gatewayExceptionIsIsolatedAndDoesNotBreakFlow | Défaillance : exception du gateway → résultat d’échec, statut PENDING conservé. |</w:t>
-      </w:r>
-    </w:p>
-    <w:p>
-      <w:pPr>
-        <w:pStyle w:val="BodyText"/>
-      </w:pPr>
-      <w:r>
-        <w:t xml:space="preserve">AI Recommandation | 15 JUnit ciblés : 7 panier + 8 recommandation | Absent : doublures lambda, pas Mockito | Nominal et panne : filtrage, tentative unique, repli sans bloquer la commande. |</w:t>
-      </w:r>
-    </w:p>
-    <w:p>
-      <w:pPr>
-        <w:pStyle w:val="BodyText"/>
-      </w:pPr>
-      <w:r>
-        <w:t xml:space="preserve">Capacities &amp; times | 2 JUnit ciblés + 2 BDD ciblés | Absent : repositories en mémoire, pas Mockito | Nominal / saturation : configure le quota, refuse la commande au-delà. |</w:t>
-      </w:r>
-    </w:p>
-    <w:p>
-      <w:pPr>
-        <w:pStyle w:val="BodyText"/>
-      </w:pPr>
-      <w:r>
-        <w:t xml:space="preserve">Offers/Specials | 0 | Absent | Non implémenté. |</w:t>
-      </w:r>
-    </w:p>
-    <w:p>
-      <w:pPr>
-        <w:pStyle w:val="BodyText"/>
-      </w:pPr>
-      <w:r>
-        <w:t xml:space="preserve">Monitor delivery operations | 0 | Absent | Non implémenté. |</w:t>
-      </w:r>
-    </w:p>
-    <w:p>
-      <w:pPr>
-        <w:pStyle w:val="BodyText"/>
-      </w:pPr>
-      <w:r>
-        <w:t xml:space="preserve">Comptage : tests de frontière ou de collaboration locale, sans service distant réel. Les 4 tests ExternalAIAdapterTest sont exclus (adaptateur seul), ainsi que les 2 tests de panier sur fusion des quantités et protection des listes (hors recommandation). Les tests généraux de validation de commande sont exclus du comptage des capacités. Les tests Mockito exigés restent manquants pour livraison, IA et capacités.</w:t>
-      </w:r>
-    </w:p>
-    <w:bookmarkEnd w:id="45"/>
-    <w:bookmarkStart w:id="46" w:name="gestion-de-projet-2-lignes"/>
-    <w:p>
-      <w:pPr>
-        <w:pStyle w:val="Heading3"/>
-      </w:pPr>
-      <w:r>
-        <w:t xml:space="preserve">4.3 Gestion de projet (2 lignes)</w:t>
-      </w:r>
-    </w:p>
-    <w:p>
-      <w:pPr>
-        <w:pStyle w:val="FirstParagraph"/>
-      </w:pPr>
-      <w:r>
-        <w:t xml:space="preserve">Branche de travail : develop ; workflows configurés pour main et/ou develop.</w:t>
-      </w:r>
-      <w:r>
-        <w:t xml:space="preserve"> </w:t>
-      </w:r>
-      <w:r>
-        <w:t xml:space="preserve">Stratégie de branches, revues de PR et validation par un pair : à confirmer par l’équipe.</w:t>
-      </w:r>
-    </w:p>
-    <w:bookmarkEnd w:id="46"/>
-    <w:bookmarkEnd w:id="47"/>
-    <w:bookmarkStart w:id="57" w:name="d5-incidents-de-livraison"/>
-    <w:p>
-      <w:pPr>
-        <w:pStyle w:val="Heading2"/>
-      </w:pPr>
-      <w:r>
-        <w:t xml:space="preserve">5. D5* : Incidents de livraison</w:t>
-      </w:r>
-    </w:p>
-    <w:bookmarkStart w:id="48" w:name="étudiant-responsable"/>
-    <w:p>
-      <w:pPr>
-        <w:pStyle w:val="Heading3"/>
-      </w:pPr>
-      <w:r>
-        <w:t xml:space="preserve">5.1 Étudiant responsable</w:t>
-      </w:r>
-    </w:p>
-    <w:p>
-      <w:pPr>
-        <w:pStyle w:val="FirstParagraph"/>
-      </w:pPr>
-      <w:r>
-        <w:t xml:space="preserve">MOROU Essognina Fadilou : référent indiqué dans le D0 Team-J.</w:t>
-      </w:r>
-    </w:p>
-    <w:bookmarkEnd w:id="48"/>
-    <w:bookmarkStart w:id="49" w:name="stratégie-métier"/>
-    <w:p>
-      <w:pPr>
-        <w:pStyle w:val="Heading3"/>
-      </w:pPr>
-      <w:r>
-        <w:t xml:space="preserve">5.2 Stratégie métier</w:t>
-      </w:r>
-    </w:p>
-    <w:p>
-      <w:pPr>
-        <w:pStyle w:val="FirstParagraph"/>
-      </w:pPr>
-      <w:r>
-        <w:t xml:space="preserve">Conception observée : Le code représente une livraison échouée par DeliveryStatus.FAILED et un motif DeliveryIncident : NO_SHOW, UNREACHABLE ou CANCELLED_BY_COURIER. UpdateDeliveryStatus conserve l’état de commande PAID/READY ; il n’invente pas un nouvel OrderStatus pour un incident.</w:t>
-      </w:r>
-    </w:p>
-    <w:p>
-      <w:pPr>
-        <w:pStyle w:val="BodyText"/>
-      </w:pPr>
-      <w:r>
         <w:t xml:space="preserve">Spécifications : écarts par rapport à D0 : NO_SHOW devait entraîner clôture sans remboursement après 10 minutes ; faute du livreur et lieu inaccessible devaient entraîner annulation et remboursement intégral selon le moyen de paiement. Le D0 imposait aussi historique permanent horodaté et notification. Aucun de ces traitements n’est implémenté ; conserver PAID/READY constitue une réduction du périmètre, non une conformité.</w:t>
       </w:r>
     </w:p>
-    <w:bookmarkEnd w:id="49"/>
-    <w:bookmarkStart w:id="53" w:name="diagramme-de-classes"/>
+    <w:bookmarkEnd w:id="50"/>
+    <w:bookmarkStart w:id="54" w:name="diagramme-de-classes"/>
     <w:p>
       <w:pPr>
         <w:pStyle w:val="Heading3"/>
@@ -1162,18 +3889,18 @@
           <wp:inline>
             <wp:extent cx="5334000" cy="6323422"/>
             <wp:effectExtent b="0" l="0" r="0" t="0"/>
-            <wp:docPr descr="Diagramme d5" title="" id="51" name="Picture"/>
+            <wp:docPr descr="Diagramme d5" title="" id="52" name="Picture"/>
             <a:graphic>
               <a:graphicData uri="http://schemas.openxmlformats.org/drawingml/2006/picture">
                 <pic:pic>
                   <pic:nvPicPr>
-                    <pic:cNvPr descr="uml/d5.png" id="52" name="Picture"/>
+                    <pic:cNvPr descr="uml/d5.png" id="53" name="Picture"/>
                     <pic:cNvPicPr>
                       <a:picLocks noChangeArrowheads="1" noChangeAspect="1"/>
                     </pic:cNvPicPr>
                   </pic:nvPicPr>
                   <pic:blipFill>
-                    <a:blip r:embed="rId50"/>
+                    <a:blip r:embed="rId51"/>
                     <a:stretch>
                       <a:fillRect/>
                     </a:stretch>
@@ -1208,8 +3935,8 @@
         <w:t xml:space="preserve">Diagramme d5</w:t>
       </w:r>
     </w:p>
-    <w:bookmarkEnd w:id="53"/>
-    <w:bookmarkStart w:id="54" w:name="connexion-au-cœur"/>
+    <w:bookmarkEnd w:id="54"/>
+    <w:bookmarkStart w:id="55" w:name="connexion-au-cœur"/>
     <w:p>
       <w:pPr>
         <w:pStyle w:val="Heading3"/>
@@ -1226,8 +3953,8 @@
         <w:t xml:space="preserve">UpdateDeliveryStatus.execute(Order, DeliveryStatus, DeliveryIncident) charge DeliveryInfo par orderId, met à jour le statut, enregistre le motif si FAILED puis sauvegarde la livraison. DELIVERED met aussi la commande à DELIVERED et efface le motif. OrderRepository n’est pas injecté : la modification de commande repose sur l’objet partagé en mémoire, sans sauvegarde explicite adaptée à un stockage distant.</w:t>
       </w:r>
     </w:p>
-    <w:bookmarkEnd w:id="54"/>
-    <w:bookmarkStart w:id="55" w:name="design-pattern"/>
+    <w:bookmarkEnd w:id="55"/>
+    <w:bookmarkStart w:id="56" w:name="design-pattern"/>
     <w:p>
       <w:pPr>
         <w:pStyle w:val="Heading3"/>
@@ -1244,8 +3971,8 @@
         <w:t xml:space="preserve">Aucun.</w:t>
       </w:r>
     </w:p>
-    <w:bookmarkEnd w:id="55"/>
-    <w:bookmarkStart w:id="56" w:name="qualité-du-code-et-des-tests"/>
+    <w:bookmarkEnd w:id="56"/>
+    <w:bookmarkStart w:id="57" w:name="qualité-du-code-et-des-tests"/>
     <w:p>
       <w:pPr>
         <w:pStyle w:val="Heading3"/>
@@ -1262,9 +3989,9 @@
         <w:t xml:space="preserve">Les step definitions contiennent des pas de panne et d’incident, mais les trois scénarios actifs DeliveryTraking.feature ne les utilisent pas. Aucun test direct de FAILED, du motif, de réponse nulle, de refus du fournisseur ou d’exception RequestDelivery n’a été identifié. Aucun contrôle des transitions, mécanisme de compensation, relivraison ou remboursement. D5* reste WIP.</w:t>
       </w:r>
     </w:p>
-    <w:bookmarkEnd w:id="56"/>
     <w:bookmarkEnd w:id="57"/>
-    <w:bookmarkStart w:id="67" w:name="r5-capacités-et-créneaux"/>
+    <w:bookmarkEnd w:id="58"/>
+    <w:bookmarkStart w:id="68" w:name="r5-capacités-et-créneaux"/>
     <w:p>
       <w:pPr>
         <w:pStyle w:val="Heading2"/>
@@ -1273,7 +4000,7 @@
         <w:t xml:space="preserve">6. R5* : Capacités et créneaux</w:t>
       </w:r>
     </w:p>
-    <w:bookmarkStart w:id="58" w:name="étudiant-responsable-1"/>
+    <w:bookmarkStart w:id="59" w:name="étudiant-responsable-1"/>
     <w:p>
       <w:pPr>
         <w:pStyle w:val="Heading3"/>
@@ -1290,8 +4017,8 @@
         <w:t xml:space="preserve">LOUBARIS Adam : référent indiqué dans le D0 Team-J.</w:t>
       </w:r>
     </w:p>
-    <w:bookmarkEnd w:id="58"/>
-    <w:bookmarkStart w:id="59" w:name="stratégie-métier-1"/>
+    <w:bookmarkEnd w:id="59"/>
+    <w:bookmarkStart w:id="60" w:name="stratégie-métier-1"/>
     <w:p>
       <w:pPr>
         <w:pStyle w:val="Heading3"/>
@@ -1316,8 +4043,8 @@
         <w:t xml:space="preserve">Spécifications : écarts par rapport à D0 : deux stratégies étaient prévues (FixedSlotCapacityPolicy et PreparationTimeCapacityPolicy), via CapacityPolicy.computeEarliestReadyTime. Le code réalise uniquement un quota fixe restant par enum TimeSlot ; il ne calcule pas estimatedReadyTime, ne gère ni personnel ni temps de préparation, et ne transmet pas cette information à la livraison.</w:t>
       </w:r>
     </w:p>
-    <w:bookmarkEnd w:id="59"/>
-    <w:bookmarkStart w:id="63" w:name="diagramme-de-classes-1"/>
+    <w:bookmarkEnd w:id="60"/>
+    <w:bookmarkStart w:id="64" w:name="diagramme-de-classes-1"/>
     <w:p>
       <w:pPr>
         <w:pStyle w:val="Heading3"/>
@@ -1335,18 +4062,18 @@
           <wp:inline>
             <wp:extent cx="5334000" cy="5694031"/>
             <wp:effectExtent b="0" l="0" r="0" t="0"/>
-            <wp:docPr descr="Diagramme r5" title="" id="61" name="Picture"/>
+            <wp:docPr descr="Diagramme r5" title="" id="62" name="Picture"/>
             <a:graphic>
               <a:graphicData uri="http://schemas.openxmlformats.org/drawingml/2006/picture">
                 <pic:pic>
                   <pic:nvPicPr>
-                    <pic:cNvPr descr="uml/r5.png" id="62" name="Picture"/>
+                    <pic:cNvPr descr="uml/r5.png" id="63" name="Picture"/>
                     <pic:cNvPicPr>
                       <a:picLocks noChangeArrowheads="1" noChangeAspect="1"/>
                     </pic:cNvPicPr>
                   </pic:nvPicPr>
                   <pic:blipFill>
-                    <a:blip r:embed="rId60"/>
+                    <a:blip r:embed="rId61"/>
                     <a:stretch>
                       <a:fillRect/>
                     </a:stretch>
@@ -1389,8 +4116,8 @@
         <w:t xml:space="preserve">Structure propre à R5* : Map&lt;TimeSlot,Integer&gt; dans Restaurant. Les deux politiques CapacityPolicy prévues en D0 sont absentes ; le diagramme représente le quota réellement implémenté.</w:t>
       </w:r>
     </w:p>
-    <w:bookmarkEnd w:id="63"/>
-    <w:bookmarkStart w:id="64" w:name="connexion-au-cœur-1"/>
+    <w:bookmarkEnd w:id="64"/>
+    <w:bookmarkStart w:id="65" w:name="connexion-au-cœur-1"/>
     <w:p>
       <w:pPr>
         <w:pStyle w:val="Heading3"/>
@@ -1407,8 +4134,8 @@
         <w:t xml:space="preserve">OrderService consulte la capacité avant de produire la commande, puis la décrémente de 1 et sauvegarde Restaurant. createOrder retourne null si le créneau est plein ; createOrderWithDelivery lance IllegalArgumentException. L’exigence est incorporée au parcours de commande : aucune interface de capacité substituable ne permet de la désactiver indépendamment.</w:t>
       </w:r>
     </w:p>
-    <w:bookmarkEnd w:id="64"/>
-    <w:bookmarkStart w:id="65" w:name="design-pattern-1"/>
+    <w:bookmarkEnd w:id="65"/>
+    <w:bookmarkStart w:id="66" w:name="design-pattern-1"/>
     <w:p>
       <w:pPr>
         <w:pStyle w:val="Heading3"/>
@@ -1425,8 +4152,8 @@
         <w:t xml:space="preserve">Aucun.</w:t>
       </w:r>
     </w:p>
-    <w:bookmarkEnd w:id="65"/>
-    <w:bookmarkStart w:id="66" w:name="qualité-du-code-et-des-tests-1"/>
+    <w:bookmarkEnd w:id="66"/>
+    <w:bookmarkStart w:id="67" w:name="qualité-du-code-et-des-tests-1"/>
     <w:p>
       <w:pPr>
         <w:pStyle w:val="Heading3"/>
@@ -1451,9 +4178,9 @@
         <w:t xml:space="preserve">La lecture puis décrémentation n’est pas atomique ; les HashMap ne sont pas protégées contre les accès concurrents. La capacité est consommée avant paiement et n’est jamais restituée en cas d’échec. Si la sauvegarde de commande échoue, la capacité peut être perdue. Le setter du modèle peut accepter une valeur négative en contournant le service ; le service interdit de configurer zéro. Pas de calcul de temps de préparation ni de cohérence entre DeliveryTime et TimeSlot : état WIP.</w:t>
       </w:r>
     </w:p>
-    <w:bookmarkEnd w:id="66"/>
     <w:bookmarkEnd w:id="67"/>
-    <w:bookmarkStart w:id="74" w:name="r6-offres-et-promotions"/>
+    <w:bookmarkEnd w:id="68"/>
+    <w:bookmarkStart w:id="75" w:name="r6-offres-et-promotions"/>
     <w:p>
       <w:pPr>
         <w:pStyle w:val="Heading2"/>
@@ -1462,7 +4189,7 @@
         <w:t xml:space="preserve">7. R6* : Offres et promotions</w:t>
       </w:r>
     </w:p>
-    <w:bookmarkStart w:id="68" w:name="étudiant-responsable-2"/>
+    <w:bookmarkStart w:id="69" w:name="étudiant-responsable-2"/>
     <w:p>
       <w:pPr>
         <w:pStyle w:val="Heading3"/>
@@ -1479,8 +4206,8 @@
         <w:t xml:space="preserve">ATI-ATCHA Wahid : référent indiqué dans le D0 Team-J.</w:t>
       </w:r>
     </w:p>
-    <w:bookmarkEnd w:id="68"/>
-    <w:bookmarkStart w:id="69" w:name="stratégie-métier-2"/>
+    <w:bookmarkEnd w:id="69"/>
+    <w:bookmarkStart w:id="70" w:name="stratégie-métier-2"/>
     <w:p>
       <w:pPr>
         <w:pStyle w:val="Heading3"/>
@@ -1505,8 +4232,8 @@
         <w:t xml:space="preserve">Spécifications : écarts par rapport à D0 : Campus Specials ciblés par plat/catégorie, type utilisateur, fenêtre de validité et quotas ; fidélité par couple utilisateur/restaurant, points après paiement, récompense et cumul dans un ordre précis. PromotionService, Promotion, CampusSpecial, LoyaltyProgram, Discount et LoyaltyAccount ne sont pas présents. Le module prévu est entièrement non réalisé.</w:t>
       </w:r>
     </w:p>
-    <w:bookmarkEnd w:id="69"/>
-    <w:bookmarkStart w:id="70" w:name="diagramme-de-classes-2"/>
+    <w:bookmarkEnd w:id="70"/>
+    <w:bookmarkStart w:id="71" w:name="diagramme-de-classes-2"/>
     <w:p>
       <w:pPr>
         <w:pStyle w:val="Heading3"/>
@@ -1523,8 +4250,8 @@
         <w:t xml:space="preserve">Néant : aucune structure propre à R6* implémentée dans l’archive.</w:t>
       </w:r>
     </w:p>
-    <w:bookmarkEnd w:id="70"/>
-    <w:bookmarkStart w:id="71" w:name="connexion-au-cœur-2"/>
+    <w:bookmarkEnd w:id="71"/>
+    <w:bookmarkStart w:id="72" w:name="connexion-au-cœur-2"/>
     <w:p>
       <w:pPr>
         <w:pStyle w:val="Heading3"/>
@@ -1541,8 +4268,8 @@
         <w:t xml:space="preserve">Aucune. OrderService calcule le total sans point d’extension pour les remises.</w:t>
       </w:r>
     </w:p>
-    <w:bookmarkEnd w:id="71"/>
-    <w:bookmarkStart w:id="72" w:name="design-pattern-2"/>
+    <w:bookmarkEnd w:id="72"/>
+    <w:bookmarkStart w:id="73" w:name="design-pattern-2"/>
     <w:p>
       <w:pPr>
         <w:pStyle w:val="Heading3"/>
@@ -1559,8 +4286,8 @@
         <w:t xml:space="preserve">Aucun.</w:t>
       </w:r>
     </w:p>
-    <w:bookmarkEnd w:id="72"/>
-    <w:bookmarkStart w:id="73" w:name="qualité-du-code-et-des-tests-2"/>
+    <w:bookmarkEnd w:id="73"/>
+    <w:bookmarkStart w:id="74" w:name="qualité-du-code-et-des-tests-2"/>
     <w:p>
       <w:pPr>
         <w:pStyle w:val="Heading3"/>
@@ -1577,9 +4304,9 @@
         <w:t xml:space="preserve">Aucun test JUnit, scénario Gherkin ou indicateur de qualité propre à R6* identifié. État BLOCKED. Une implémentation ultérieure devra définir les règles métier et leur cumul, puis valider le montant de commande et de paiement. Ce travail n’est pas présenté comme déjà réalisé.</w:t>
       </w:r>
     </w:p>
-    <w:bookmarkEnd w:id="73"/>
     <w:bookmarkEnd w:id="74"/>
-    <w:bookmarkStart w:id="81" w:name="a3-supervision-des-livraisons"/>
+    <w:bookmarkEnd w:id="75"/>
+    <w:bookmarkStart w:id="82" w:name="a3-supervision-des-livraisons"/>
     <w:p>
       <w:pPr>
         <w:pStyle w:val="Heading2"/>
@@ -1588,7 +4315,7 @@
         <w:t xml:space="preserve">8. A3* : Supervision des livraisons</w:t>
       </w:r>
     </w:p>
-    <w:bookmarkStart w:id="75" w:name="étudiant-responsable-3"/>
+    <w:bookmarkStart w:id="76" w:name="étudiant-responsable-3"/>
     <w:p>
       <w:pPr>
         <w:pStyle w:val="Heading3"/>
@@ -1605,8 +4332,8 @@
         <w:t xml:space="preserve">ADJEGAN Justice : référent indiqué dans le D0 Team-J.</w:t>
       </w:r>
     </w:p>
-    <w:bookmarkEnd w:id="75"/>
-    <w:bookmarkStart w:id="76" w:name="stratégie-métier-3"/>
+    <w:bookmarkEnd w:id="76"/>
+    <w:bookmarkStart w:id="77" w:name="stratégie-métier-3"/>
     <w:p>
       <w:pPr>
         <w:pStyle w:val="Heading3"/>
@@ -1631,8 +4358,8 @@
         <w:t xml:space="preserve">Spécifications : écarts par rapport à D0 : calcul des taux d’acceptation et d’échec, fenêtre de 20 livraisons avec minimum 5, seuil d’échec &gt; 20 %, retard &gt; 15 minutes, anti-spam et boîte administrateur. DeliveryMonitor, DeliveryStats, AlertRule et AdminInboxNotifier sont absents.</w:t>
       </w:r>
     </w:p>
-    <w:bookmarkEnd w:id="76"/>
-    <w:bookmarkStart w:id="77" w:name="diagramme-de-classes-3"/>
+    <w:bookmarkEnd w:id="77"/>
+    <w:bookmarkStart w:id="78" w:name="diagramme-de-classes-3"/>
     <w:p>
       <w:pPr>
         <w:pStyle w:val="Heading3"/>
@@ -1649,8 +4376,8 @@
         <w:t xml:space="preserve">Néant : aucun module propre à A3* implémenté.</w:t>
       </w:r>
     </w:p>
-    <w:bookmarkEnd w:id="77"/>
-    <w:bookmarkStart w:id="78" w:name="connexion-au-cœur-3"/>
+    <w:bookmarkEnd w:id="78"/>
+    <w:bookmarkStart w:id="79" w:name="connexion-au-cœur-3"/>
     <w:p>
       <w:pPr>
         <w:pStyle w:val="Heading3"/>
@@ -1667,8 +4394,8 @@
         <w:t xml:space="preserve">Aucune connexion de supervision. UpdateDeliveryStatus enregistre le suivi D4 et les informations D5*, mais n’émet pas d’événement vers un moniteur et n’expose pas de requête globale.</w:t>
       </w:r>
     </w:p>
-    <w:bookmarkEnd w:id="78"/>
-    <w:bookmarkStart w:id="79" w:name="design-pattern-3"/>
+    <w:bookmarkEnd w:id="79"/>
+    <w:bookmarkStart w:id="80" w:name="design-pattern-3"/>
     <w:p>
       <w:pPr>
         <w:pStyle w:val="Heading3"/>
@@ -1685,8 +4412,8 @@
         <w:t xml:space="preserve">Aucun.</w:t>
       </w:r>
     </w:p>
-    <w:bookmarkEnd w:id="79"/>
-    <w:bookmarkStart w:id="80" w:name="qualité-du-code-et-des-tests-3"/>
+    <w:bookmarkEnd w:id="80"/>
+    <w:bookmarkStart w:id="81" w:name="qualité-du-code-et-des-tests-3"/>
     <w:p>
       <w:pPr>
         <w:pStyle w:val="Heading3"/>
@@ -1703,9 +4430,9 @@
         <w:t xml:space="preserve">Aucun test spécifique de supervision ou d’agrégation. Les trois scénarios de suivi unitaire ne valident pas A3*. État BLOCKED ; la fonctionnalité devra définir les opérations observées, les acteurs autorisés et les données agrégées avant implémentation.</w:t>
       </w:r>
     </w:p>
-    <w:bookmarkEnd w:id="80"/>
     <w:bookmarkEnd w:id="81"/>
-    <w:bookmarkStart w:id="91" w:name="ai3-recommandations"/>
+    <w:bookmarkEnd w:id="82"/>
+    <w:bookmarkStart w:id="92" w:name="ai3-recommandations"/>
     <w:p>
       <w:pPr>
         <w:pStyle w:val="Heading2"/>
@@ -1714,7 +4441,7 @@
         <w:t xml:space="preserve">9. AI3* : Recommandations</w:t>
       </w:r>
     </w:p>
-    <w:bookmarkStart w:id="82" w:name="étudiant-responsable-4"/>
+    <w:bookmarkStart w:id="83" w:name="étudiant-responsable-4"/>
     <w:p>
       <w:pPr>
         <w:pStyle w:val="Heading3"/>
@@ -1731,8 +4458,8 @@
         <w:t xml:space="preserve">TSOULI Younes : référent indiqué dans le D0 Team-J.</w:t>
       </w:r>
     </w:p>
-    <w:bookmarkEnd w:id="82"/>
-    <w:bookmarkStart w:id="83" w:name="stratégie-métier-4"/>
+    <w:bookmarkEnd w:id="83"/>
+    <w:bookmarkStart w:id="84" w:name="stratégie-métier-4"/>
     <w:p>
       <w:pPr>
         <w:pStyle w:val="Heading3"/>
@@ -1765,8 +4492,8 @@
         <w:t xml:space="preserve">Spécifications : écarts par rapport à D0 : le premier Dish d’une Order est devenu le premier ajout dans Cart ; recommandations limitées au même restaurant et hors panier ; réponse sans élément valide remplacée par le repli local. La diversité minimale évoquée par D0 n’est ni définie ni vérifiée, et les préférences utilisateur ne sont pas transmises. Le D0 présente une tension entre repli local et absence de suggestion lorsque toutes les réponses sont invalides ; le code retient le repli.</w:t>
       </w:r>
     </w:p>
-    <w:bookmarkEnd w:id="83"/>
-    <w:bookmarkStart w:id="87" w:name="diagramme-de-classes-4"/>
+    <w:bookmarkEnd w:id="84"/>
+    <w:bookmarkStart w:id="88" w:name="diagramme-de-classes-4"/>
     <w:p>
       <w:pPr>
         <w:pStyle w:val="Heading3"/>
@@ -1795,18 +4522,18 @@
           <wp:inline>
             <wp:extent cx="5334000" cy="2459817"/>
             <wp:effectExtent b="0" l="0" r="0" t="0"/>
-            <wp:docPr descr="Diagramme ai3" title="" id="85" name="Picture"/>
+            <wp:docPr descr="Diagramme ai3" title="" id="86" name="Picture"/>
             <a:graphic>
               <a:graphicData uri="http://schemas.openxmlformats.org/drawingml/2006/picture">
                 <pic:pic>
                   <pic:nvPicPr>
-                    <pic:cNvPr descr="uml/ai3.png" id="86" name="Picture"/>
+                    <pic:cNvPr descr="uml/ai3.png" id="87" name="Picture"/>
                     <pic:cNvPicPr>
                       <a:picLocks noChangeArrowheads="1" noChangeAspect="1"/>
                     </pic:cNvPicPr>
                   </pic:nvPicPr>
                   <pic:blipFill>
-                    <a:blip r:embed="rId84"/>
+                    <a:blip r:embed="rId85"/>
                     <a:stretch>
                       <a:fillRect/>
                     </a:stretch>
@@ -1841,8 +4568,8 @@
         <w:t xml:space="preserve">Diagramme ai3</w:t>
       </w:r>
     </w:p>
-    <w:bookmarkEnd w:id="87"/>
-    <w:bookmarkStart w:id="88" w:name="connexion-au-cœur-4"/>
+    <w:bookmarkEnd w:id="88"/>
+    <w:bookmarkStart w:id="89" w:name="connexion-au-cœur-4"/>
     <w:p>
       <w:pPr>
         <w:pStyle w:val="Heading3"/>
@@ -1859,8 +4586,8 @@
         <w:t xml:space="preserve">L’appel est optionnel et ne conditionne pas la création de commande. Le test failedAIIsNotRetriedAndDoesNotPreventOrderCreation exerce le repli, l’absence de deuxième tentative et la création d’une commande. Le code conserve également DishRecommendationService, dont la logique est proche de DishService ; les tests portant ce nom exécutent en réalité DishService.</w:t>
       </w:r>
     </w:p>
-    <w:bookmarkEnd w:id="88"/>
-    <w:bookmarkStart w:id="89" w:name="design-pattern-4"/>
+    <w:bookmarkEnd w:id="89"/>
+    <w:bookmarkStart w:id="90" w:name="design-pattern-4"/>
     <w:p>
       <w:pPr>
         <w:pStyle w:val="Heading3"/>
@@ -1877,8 +4604,8 @@
         <w:t xml:space="preserve">Aucun.</w:t>
       </w:r>
     </w:p>
-    <w:bookmarkEnd w:id="89"/>
-    <w:bookmarkStart w:id="90" w:name="qualité-du-code-et-des-tests-4"/>
+    <w:bookmarkEnd w:id="90"/>
+    <w:bookmarkStart w:id="91" w:name="qualité-du-code-et-des-tests-4"/>
     <w:p>
       <w:pPr>
         <w:pStyle w:val="Heading3"/>
@@ -1895,9 +4622,9 @@
         <w:t xml:space="preserve">9 tests CartServiceTest, 8 DishRecommendationServiceTest, 4 ExternalAIAdapterTest et 4 scénarios BDD. Les cas couvrent premier ajout, absence de relance, panne IA, références invalides et doublons, plats d’un autre restaurant, indisponibilité et absence d’alternative. Les doublures sont des lambdas/objets simulés, sans Mockito pour ce module. Limites : code dupliqué, pas de délai maximal d’appel, ni de classement métier du repli.</w:t>
       </w:r>
     </w:p>
-    <w:bookmarkEnd w:id="90"/>
     <w:bookmarkEnd w:id="91"/>
-    <w:bookmarkStart w:id="94" w:name="auto-évaluation"/>
+    <w:bookmarkEnd w:id="92"/>
+    <w:bookmarkStart w:id="95" w:name="auto-évaluation"/>
     <w:p>
       <w:pPr>
         <w:pStyle w:val="Heading2"/>
@@ -1906,7 +4633,7 @@
         <w:t xml:space="preserve">10. Auto-évaluation</w:t>
       </w:r>
     </w:p>
-    <w:bookmarkStart w:id="92" w:name="bilan-qualitatif"/>
+    <w:bookmarkStart w:id="93" w:name="bilan-qualitatif"/>
     <w:p>
       <w:pPr>
         <w:pStyle w:val="Heading3"/>
@@ -1931,8 +4658,8 @@
         <w:t xml:space="preserve">Difficultés observables : la documentation d’architecture diffère du code, des documents et features restent incomplets, la validation des deux parcours de commande est asymétrique, et les cinq exigences stratégiques sont partielles ou absentes au regard du D0. Ces constats ne constituent pas un témoignage sur la collaboration ; l’équipe doit ajouter son bilan réel de l’organisation, des difficultés et des leçons tirées.</w:t>
       </w:r>
     </w:p>
-    <w:bookmarkEnd w:id="92"/>
-    <w:bookmarkStart w:id="93" w:name="X941e07b152033265511371d88fdc457be8439fe"/>
+    <w:bookmarkEnd w:id="93"/>
+    <w:bookmarkStart w:id="94" w:name="X941e07b152033265511371d88fdc457be8439fe"/>
     <w:p>
       <w:pPr>
         <w:pStyle w:val="Heading3"/>
@@ -1941,80 +4668,299 @@
         <w:t xml:space="preserve">10.2 Répartition de l’implication (mécanisme des 100 points)</w:t>
       </w:r>
     </w:p>
-    <w:p>
-      <w:pPr>
-        <w:pStyle w:val="FirstParagraph"/>
-      </w:pPr>
-      <w:r>
-        <w:t xml:space="preserve">Membre | Points décidés par l’équipe | Coefficient |</w:t>
-      </w:r>
-    </w:p>
+    <w:tbl>
+      <w:tblPr>
+        <w:tblStyle w:val="Table"/>
+        <w:tblW w:type="auto" w:w="0"/>
+        <w:jc w:val="left"/>
+        <w:tblLook w:firstRow="1" w:lastRow="0" w:firstColumn="0" w:lastColumn="0" w:noHBand="0" w:noVBand="0" w:val="0020"/>
+      </w:tblPr>
+      <w:tblGrid>
+        <w:gridCol w:w="2640"/>
+        <w:gridCol w:w="2640"/>
+        <w:gridCol w:w="2640"/>
+      </w:tblGrid>
+      <w:tr>
+        <w:trPr>
+          <w:tblHeader w:val="on"/>
+        </w:trPr>
+        <w:tc>
+          <w:tcPr/>
+          <w:p>
+            <w:pPr>
+              <w:pStyle w:val="Compact"/>
+              <w:jc w:val="left"/>
+            </w:pPr>
+            <w:r>
+              <w:t xml:space="preserve">Membre</w:t>
+            </w:r>
+          </w:p>
+        </w:tc>
+        <w:tc>
+          <w:tcPr/>
+          <w:p>
+            <w:pPr>
+              <w:pStyle w:val="Compact"/>
+              <w:jc w:val="left"/>
+            </w:pPr>
+            <w:r>
+              <w:t xml:space="preserve">Points décidés par l’équipe</w:t>
+            </w:r>
+          </w:p>
+        </w:tc>
+        <w:tc>
+          <w:tcPr/>
+          <w:p>
+            <w:pPr>
+              <w:pStyle w:val="Compact"/>
+              <w:jc w:val="left"/>
+            </w:pPr>
+            <w:r>
+              <w:t xml:space="preserve">Coefficient</w:t>
+            </w:r>
+          </w:p>
+        </w:tc>
+      </w:tr>
+      <w:tr>
+        <w:tc>
+          <w:tcPr/>
+          <w:p>
+            <w:pPr>
+              <w:pStyle w:val="Compact"/>
+              <w:jc w:val="left"/>
+            </w:pPr>
+            <w:r>
+              <w:t xml:space="preserve">ADJEGAN Justice</w:t>
+            </w:r>
+          </w:p>
+        </w:tc>
+        <w:tc>
+          <w:tcPr/>
+          <w:p>
+            <w:pPr>
+              <w:pStyle w:val="Compact"/>
+              <w:jc w:val="left"/>
+            </w:pPr>
+            <w:r>
+              <w:t xml:space="preserve">100 pts</w:t>
+            </w:r>
+          </w:p>
+        </w:tc>
+        <w:tc>
+          <w:tcPr/>
+          <w:p>
+            <w:pPr>
+              <w:pStyle w:val="Compact"/>
+              <w:jc w:val="left"/>
+            </w:pPr>
+            <w:r>
+              <w:t xml:space="preserve">1,0</w:t>
+            </w:r>
+          </w:p>
+        </w:tc>
+      </w:tr>
+      <w:tr>
+        <w:tc>
+          <w:tcPr/>
+          <w:p>
+            <w:pPr>
+              <w:pStyle w:val="Compact"/>
+              <w:jc w:val="left"/>
+            </w:pPr>
+            <w:r>
+              <w:t xml:space="preserve">ATI-ATCHA Wahid</w:t>
+            </w:r>
+          </w:p>
+        </w:tc>
+        <w:tc>
+          <w:tcPr/>
+          <w:p>
+            <w:pPr>
+              <w:pStyle w:val="Compact"/>
+              <w:jc w:val="left"/>
+            </w:pPr>
+            <w:r>
+              <w:t xml:space="preserve">100 pts</w:t>
+            </w:r>
+          </w:p>
+        </w:tc>
+        <w:tc>
+          <w:tcPr/>
+          <w:p>
+            <w:pPr>
+              <w:pStyle w:val="Compact"/>
+              <w:jc w:val="left"/>
+            </w:pPr>
+            <w:r>
+              <w:t xml:space="preserve">1,0</w:t>
+            </w:r>
+          </w:p>
+        </w:tc>
+      </w:tr>
+      <w:tr>
+        <w:tc>
+          <w:tcPr/>
+          <w:p>
+            <w:pPr>
+              <w:pStyle w:val="Compact"/>
+              <w:jc w:val="left"/>
+            </w:pPr>
+            <w:r>
+              <w:t xml:space="preserve">LOUBARIS Adam</w:t>
+            </w:r>
+          </w:p>
+        </w:tc>
+        <w:tc>
+          <w:tcPr/>
+          <w:p>
+            <w:pPr>
+              <w:pStyle w:val="Compact"/>
+              <w:jc w:val="left"/>
+            </w:pPr>
+            <w:r>
+              <w:t xml:space="preserve">100 pts</w:t>
+            </w:r>
+          </w:p>
+        </w:tc>
+        <w:tc>
+          <w:tcPr/>
+          <w:p>
+            <w:pPr>
+              <w:pStyle w:val="Compact"/>
+              <w:jc w:val="left"/>
+            </w:pPr>
+            <w:r>
+              <w:t xml:space="preserve">1,0</w:t>
+            </w:r>
+          </w:p>
+        </w:tc>
+      </w:tr>
+      <w:tr>
+        <w:tc>
+          <w:tcPr/>
+          <w:p>
+            <w:pPr>
+              <w:pStyle w:val="Compact"/>
+              <w:jc w:val="left"/>
+            </w:pPr>
+            <w:r>
+              <w:t xml:space="preserve">MOROU Essognina Fadilou</w:t>
+            </w:r>
+          </w:p>
+        </w:tc>
+        <w:tc>
+          <w:tcPr/>
+          <w:p>
+            <w:pPr>
+              <w:pStyle w:val="Compact"/>
+              <w:jc w:val="left"/>
+            </w:pPr>
+            <w:r>
+              <w:t xml:space="preserve">100 pts</w:t>
+            </w:r>
+          </w:p>
+        </w:tc>
+        <w:tc>
+          <w:tcPr/>
+          <w:p>
+            <w:pPr>
+              <w:pStyle w:val="Compact"/>
+              <w:jc w:val="left"/>
+            </w:pPr>
+            <w:r>
+              <w:t xml:space="preserve">1,0</w:t>
+            </w:r>
+          </w:p>
+        </w:tc>
+      </w:tr>
+      <w:tr>
+        <w:tc>
+          <w:tcPr/>
+          <w:p>
+            <w:pPr>
+              <w:pStyle w:val="Compact"/>
+              <w:jc w:val="left"/>
+            </w:pPr>
+            <w:r>
+              <w:t xml:space="preserve">TSOULI Younes</w:t>
+            </w:r>
+          </w:p>
+        </w:tc>
+        <w:tc>
+          <w:tcPr/>
+          <w:p>
+            <w:pPr>
+              <w:pStyle w:val="Compact"/>
+              <w:jc w:val="left"/>
+            </w:pPr>
+            <w:r>
+              <w:t xml:space="preserve">100 pts</w:t>
+            </w:r>
+          </w:p>
+        </w:tc>
+        <w:tc>
+          <w:tcPr/>
+          <w:p>
+            <w:pPr>
+              <w:pStyle w:val="Compact"/>
+              <w:jc w:val="left"/>
+            </w:pPr>
+            <w:r>
+              <w:t xml:space="preserve">1,0</w:t>
+            </w:r>
+          </w:p>
+        </w:tc>
+      </w:tr>
+      <w:tr>
+        <w:tc>
+          <w:tcPr/>
+          <w:p>
+            <w:pPr>
+              <w:pStyle w:val="Compact"/>
+              <w:jc w:val="left"/>
+            </w:pPr>
+            <w:r>
+              <w:t xml:space="preserve">Total</w:t>
+            </w:r>
+          </w:p>
+        </w:tc>
+        <w:tc>
+          <w:tcPr/>
+          <w:p>
+            <w:pPr>
+              <w:pStyle w:val="Compact"/>
+              <w:jc w:val="left"/>
+            </w:pPr>
+            <w:r>
+              <w:t xml:space="preserve">500 / 500</w:t>
+            </w:r>
+          </w:p>
+        </w:tc>
+        <w:tc>
+          <w:tcPr/>
+          <w:p>
+            <w:pPr>
+              <w:pStyle w:val="Compact"/>
+              <w:jc w:val="left"/>
+            </w:pPr>
+            <w:r>
+              <w:t xml:space="preserve">Sans objet</w:t>
+            </w:r>
+          </w:p>
+        </w:tc>
+      </w:tr>
+    </w:tbl>
     <w:p>
       <w:pPr>
         <w:pStyle w:val="BodyText"/>
       </w:pPr>
       <w:r>
-        <w:t xml:space="preserve">— | — | — |</w:t>
-      </w:r>
-    </w:p>
-    <w:p>
-      <w:pPr>
-        <w:pStyle w:val="BodyText"/>
-      </w:pPr>
-      <w:r>
-        <w:t xml:space="preserve">ADJEGAN Justice | 100 pts | 1,0 |</w:t>
-      </w:r>
-    </w:p>
-    <w:p>
-      <w:pPr>
-        <w:pStyle w:val="BodyText"/>
-      </w:pPr>
-      <w:r>
-        <w:t xml:space="preserve">ATI-ATCHA Wahid | 100 pts | 1,0 |</w:t>
-      </w:r>
-    </w:p>
-    <w:p>
-      <w:pPr>
-        <w:pStyle w:val="BodyText"/>
-      </w:pPr>
-      <w:r>
-        <w:t xml:space="preserve">LOUBARIS Adam | 100 pts | 1,0 |</w:t>
-      </w:r>
-    </w:p>
-    <w:p>
-      <w:pPr>
-        <w:pStyle w:val="BodyText"/>
-      </w:pPr>
-      <w:r>
-        <w:t xml:space="preserve">MOROU Essognina Fadilou | 100 pts | 1,0 |</w:t>
-      </w:r>
-    </w:p>
-    <w:p>
-      <w:pPr>
-        <w:pStyle w:val="BodyText"/>
-      </w:pPr>
-      <w:r>
-        <w:t xml:space="preserve">TSOULI Younes | 100 pts | 1,0 |</w:t>
-      </w:r>
-    </w:p>
-    <w:p>
-      <w:pPr>
-        <w:pStyle w:val="BodyText"/>
-      </w:pPr>
-      <w:r>
-        <w:t xml:space="preserve">Total | 500 / 500 | — |</w:t>
-      </w:r>
-    </w:p>
-    <w:p>
-      <w:pPr>
-        <w:pStyle w:val="BodyText"/>
-      </w:pPr>
-      <w:r>
         <w:t xml:space="preserve">Répartition de 100 points par membre explicitement communiquée par l’équipe : total 500 points, coefficient individuel 1,0. Cette décision collective n’est pas déduite de l’historique Git.</w:t>
       </w:r>
     </w:p>
-    <w:bookmarkEnd w:id="93"/>
     <w:bookmarkEnd w:id="94"/>
+    <w:bookmarkEnd w:id="95"/>
+    <w:bookmarkEnd w:id="96"/>
     <w:sectPr/>
   </w:body>
 </w:document>

</xml_diff>